<commit_message>
service module is added
</commit_message>
<xml_diff>
--- a/System analysis.docx
+++ b/System analysis.docx
@@ -182,15 +182,15 @@
         <w:rPr>
           <w:b/>
           <w:bCs/>
-          <w:color w:val="000000" w:themeColor="text1"/>
-          <w:lang w:bidi="ar-EG"/>
-        </w:rPr>
-      </w:pPr>
-      <w:r>
-        <w:rPr>
-          <w:b/>
-          <w:bCs/>
-          <w:color w:val="000000" w:themeColor="text1"/>
+          <w:color w:val="00B050"/>
+          <w:lang w:bidi="ar-EG"/>
+        </w:rPr>
+      </w:pPr>
+      <w:r>
+        <w:rPr>
+          <w:b/>
+          <w:bCs/>
+          <w:color w:val="00B050"/>
           <w:lang w:bidi="ar-EG"/>
         </w:rPr>
         <w:t xml:space="preserve">1-Rigster   2-Login </w:t>
@@ -623,15 +623,15 @@
         <w:rPr>
           <w:b/>
           <w:bCs/>
-          <w:color w:val="000000" w:themeColor="text1"/>
-          <w:lang w:bidi="ar-EG"/>
-        </w:rPr>
-      </w:pPr>
-      <w:r>
-        <w:rPr>
-          <w:b/>
-          <w:bCs/>
-          <w:color w:val="000000" w:themeColor="text1"/>
+          <w:color w:val="00B050"/>
+          <w:lang w:bidi="ar-EG"/>
+        </w:rPr>
+      </w:pPr>
+      <w:r>
+        <w:rPr>
+          <w:b/>
+          <w:bCs/>
+          <w:color w:val="00B050"/>
           <w:lang w:bidi="ar-EG"/>
         </w:rPr>
         <w:t xml:space="preserve">1-Login   </w:t>
@@ -640,7 +640,7 @@
         <w:rPr>
           <w:b/>
           <w:bCs/>
-          <w:color w:val="000000" w:themeColor="text1"/>
+          <w:color w:val="00B050"/>
           <w:lang w:bidi="ar-EG"/>
         </w:rPr>
         <w:t xml:space="preserve">                  </w:t>
@@ -649,7 +649,7 @@
         <w:rPr>
           <w:b/>
           <w:bCs/>
-          <w:color w:val="000000" w:themeColor="text1"/>
+          <w:color w:val="00B050"/>
           <w:lang w:bidi="ar-EG"/>
         </w:rPr>
         <w:t xml:space="preserve">  2-Add Admin  </w:t>
@@ -662,15 +662,15 @@
         <w:rPr>
           <w:b/>
           <w:bCs/>
-          <w:color w:val="000000" w:themeColor="text1"/>
-          <w:lang w:bidi="ar-EG"/>
-        </w:rPr>
-      </w:pPr>
-      <w:r>
-        <w:rPr>
-          <w:b/>
-          <w:bCs/>
-          <w:color w:val="000000" w:themeColor="text1"/>
+          <w:color w:val="00B050"/>
+          <w:lang w:bidi="ar-EG"/>
+        </w:rPr>
+      </w:pPr>
+      <w:r>
+        <w:rPr>
+          <w:b/>
+          <w:bCs/>
+          <w:color w:val="00B050"/>
           <w:lang w:bidi="ar-EG"/>
         </w:rPr>
         <w:t>6-get All Doctors</w:t>
@@ -691,10 +691,19 @@
         <w:rPr>
           <w:b/>
           <w:bCs/>
-          <w:color w:val="000000" w:themeColor="text1"/>
-          <w:lang w:bidi="ar-EG"/>
-        </w:rPr>
-        <w:t xml:space="preserve">3-add Doctor  </w:t>
+          <w:color w:val="00B050"/>
+          <w:lang w:bidi="ar-EG"/>
+        </w:rPr>
+        <w:t>3-add Doctor</w:t>
+      </w:r>
+      <w:r>
+        <w:rPr>
+          <w:b/>
+          <w:bCs/>
+          <w:color w:val="000000" w:themeColor="text1"/>
+          <w:lang w:bidi="ar-EG"/>
+        </w:rPr>
+        <w:t xml:space="preserve">  </w:t>
       </w:r>
       <w:r>
         <w:rPr>
@@ -733,68 +742,58 @@
           <w:color w:val="000000" w:themeColor="text1"/>
           <w:lang w:bidi="ar-EG"/>
         </w:rPr>
-        <w:t xml:space="preserve">13-Delete Doctor     -getDoctor </w:t>
-      </w:r>
-    </w:p>
-    <w:p>
-      <w:pPr>
-        <w:bidi/>
-        <w:jc w:val="right"/>
-        <w:rPr>
-          <w:b/>
-          <w:bCs/>
-          <w:color w:val="000000" w:themeColor="text1"/>
-          <w:lang w:bidi="ar-EG"/>
-        </w:rPr>
-      </w:pPr>
-      <w:r>
-        <w:rPr>
-          <w:b/>
-          <w:bCs/>
-          <w:color w:val="000000" w:themeColor="text1"/>
-          <w:lang w:bidi="ar-EG"/>
-        </w:rPr>
-        <w:t xml:space="preserve">4-get All Admins   </w:t>
-      </w:r>
-    </w:p>
-    <w:p>
-      <w:pPr>
-        <w:bidi/>
-        <w:jc w:val="right"/>
-        <w:rPr>
-          <w:b/>
-          <w:bCs/>
-          <w:color w:val="000000" w:themeColor="text1"/>
-          <w:lang w:bidi="ar-EG"/>
-        </w:rPr>
-      </w:pPr>
-      <w:r>
-        <w:rPr>
-          <w:b/>
-          <w:bCs/>
-          <w:color w:val="000000" w:themeColor="text1"/>
-          <w:lang w:bidi="ar-EG"/>
-        </w:rPr>
-        <w:t xml:space="preserve">5-get all users  </w:t>
-      </w:r>
-      <w:r>
-        <w:rPr>
-          <w:b/>
-          <w:bCs/>
-          <w:color w:val="000000" w:themeColor="text1"/>
+        <w:t xml:space="preserve">13-Delete Doctor    </w:t>
+      </w:r>
+      <w:r>
+        <w:rPr>
+          <w:b/>
+          <w:bCs/>
+          <w:lang w:bidi="ar-EG"/>
+        </w:rPr>
+        <w:t xml:space="preserve"> -</w:t>
+      </w:r>
+      <w:proofErr w:type="spellStart"/>
+      <w:r>
+        <w:rPr>
+          <w:b/>
+          <w:bCs/>
+          <w:lang w:bidi="ar-EG"/>
+        </w:rPr>
+        <w:t>getDoctor</w:t>
+      </w:r>
+      <w:r>
+        <w:rPr>
+          <w:b/>
+          <w:bCs/>
+          <w:lang w:bidi="ar-EG"/>
+        </w:rPr>
+        <w:t>Details</w:t>
+      </w:r>
+      <w:proofErr w:type="spellEnd"/>
+      <w:r>
+        <w:rPr>
+          <w:b/>
+          <w:bCs/>
+          <w:lang w:bidi="ar-EG"/>
+        </w:rPr>
+        <w:t xml:space="preserve"> </w:t>
+      </w:r>
+      <w:r>
+        <w:rPr>
+          <w:b/>
+          <w:bCs/>
+          <w:lang w:bidi="ar-EG"/>
+        </w:rPr>
+        <w:t xml:space="preserve"> -delete Doctor</w:t>
+      </w:r>
+      <w:r>
+        <w:rPr>
+          <w:b/>
+          <w:bCs/>
           <w:lang w:bidi="ar-EG"/>
         </w:rPr>
         <w:t xml:space="preserve">   </w:t>
       </w:r>
-      <w:r>
-        <w:rPr>
-          <w:b/>
-          <w:bCs/>
-          <w:color w:val="000000" w:themeColor="text1"/>
-          <w:lang w:bidi="ar-EG"/>
-        </w:rPr>
-        <w:t xml:space="preserve">   -delet User </w:t>
-      </w:r>
     </w:p>
     <w:p>
       <w:pPr>
@@ -893,6 +892,67 @@
         <w:rPr>
           <w:b/>
           <w:bCs/>
+          <w:color w:val="00B050"/>
+          <w:lang w:bidi="ar-EG"/>
+        </w:rPr>
+      </w:pPr>
+      <w:r>
+        <w:rPr>
+          <w:b/>
+          <w:bCs/>
+          <w:color w:val="00B050"/>
+          <w:lang w:bidi="ar-EG"/>
+        </w:rPr>
+        <w:t xml:space="preserve">11-Delete User  </w:t>
+      </w:r>
+      <w:r>
+        <w:rPr>
+          <w:b/>
+          <w:bCs/>
+          <w:color w:val="00B050"/>
+          <w:lang w:bidi="ar-EG"/>
+        </w:rPr>
+        <w:t xml:space="preserve">         </w:t>
+      </w:r>
+    </w:p>
+    <w:p>
+      <w:pPr>
+        <w:bidi/>
+        <w:jc w:val="right"/>
+        <w:rPr>
+          <w:b/>
+          <w:bCs/>
+          <w:color w:val="000000" w:themeColor="text1"/>
+          <w:rtl/>
+          <w:lang w:bidi="ar-EG"/>
+        </w:rPr>
+      </w:pPr>
+      <w:r>
+        <w:rPr>
+          <w:b/>
+          <w:bCs/>
+          <w:color w:val="000000" w:themeColor="text1"/>
+          <w:lang w:bidi="ar-EG"/>
+        </w:rPr>
+        <w:t xml:space="preserve">14-get All  services   </w:t>
+      </w:r>
+      <w:r>
+        <w:rPr>
+          <w:b/>
+          <w:bCs/>
+          <w:color w:val="000000" w:themeColor="text1"/>
+          <w:lang w:bidi="ar-EG"/>
+        </w:rPr>
+        <w:t>-create service</w:t>
+      </w:r>
+    </w:p>
+    <w:p>
+      <w:pPr>
+        <w:bidi/>
+        <w:jc w:val="right"/>
+        <w:rPr>
+          <w:b/>
+          <w:bCs/>
           <w:color w:val="000000" w:themeColor="text1"/>
           <w:lang w:bidi="ar-EG"/>
         </w:rPr>
@@ -905,57 +965,6 @@
           <w:lang w:bidi="ar-EG"/>
         </w:rPr>
         <w:lastRenderedPageBreak/>
-        <w:t xml:space="preserve">11-Delete User  </w:t>
-      </w:r>
-      <w:r>
-        <w:rPr>
-          <w:b/>
-          <w:bCs/>
-          <w:color w:val="000000" w:themeColor="text1"/>
-          <w:lang w:bidi="ar-EG"/>
-        </w:rPr>
-        <w:t xml:space="preserve">         </w:t>
-      </w:r>
-    </w:p>
-    <w:p>
-      <w:pPr>
-        <w:bidi/>
-        <w:jc w:val="right"/>
-        <w:rPr>
-          <w:b/>
-          <w:bCs/>
-          <w:color w:val="000000" w:themeColor="text1"/>
-          <w:lang w:bidi="ar-EG"/>
-        </w:rPr>
-      </w:pPr>
-      <w:r>
-        <w:rPr>
-          <w:b/>
-          <w:bCs/>
-          <w:color w:val="000000" w:themeColor="text1"/>
-          <w:lang w:bidi="ar-EG"/>
-        </w:rPr>
-        <w:t xml:space="preserve">14-get All  services   </w:t>
-      </w:r>
-    </w:p>
-    <w:p>
-      <w:pPr>
-        <w:bidi/>
-        <w:jc w:val="right"/>
-        <w:rPr>
-          <w:b/>
-          <w:bCs/>
-          <w:color w:val="000000" w:themeColor="text1"/>
-          <w:lang w:bidi="ar-EG"/>
-        </w:rPr>
-      </w:pPr>
-      <w:r>
-        <w:rPr>
-          <w:b/>
-          <w:bCs/>
-          <w:color w:val="000000" w:themeColor="text1"/>
-          <w:lang w:bidi="ar-EG"/>
-        </w:rPr>
         <w:t>15-update service    16-delete service</w:t>
       </w:r>
     </w:p>
@@ -1319,7 +1328,6 @@
         <w:t>[</w:t>
       </w:r>
       <w:proofErr w:type="spellStart"/>
-      <w:proofErr w:type="gramStart"/>
       <w:r>
         <w:rPr>
           <w:b/>
@@ -1346,17 +1354,7 @@
           <w:color w:val="000000" w:themeColor="text1"/>
           <w:lang w:bidi="ar-EG"/>
         </w:rPr>
-        <w:t xml:space="preserve">   </w:t>
-      </w:r>
-      <w:proofErr w:type="gramEnd"/>
-      <w:r>
-        <w:rPr>
-          <w:b/>
-          <w:bCs/>
-          <w:color w:val="000000" w:themeColor="text1"/>
-          <w:lang w:bidi="ar-EG"/>
-        </w:rPr>
-        <w:t xml:space="preserve">  -gender</w:t>
+        <w:t xml:space="preserve">     -gender</w:t>
       </w:r>
       <w:r>
         <w:rPr>
@@ -1826,21 +1824,9 @@
           <w:color w:val="000000" w:themeColor="text1"/>
           <w:lang w:bidi="ar-EG"/>
         </w:rPr>
-        <w:lastRenderedPageBreak/>
-        <w:t xml:space="preserve"> -</w:t>
-      </w:r>
-      <w:proofErr w:type="gramStart"/>
-      <w:r>
-        <w:rPr>
-          <w:b/>
-          <w:bCs/>
-          <w:color w:val="000000" w:themeColor="text1"/>
-          <w:lang w:bidi="ar-EG"/>
-        </w:rPr>
-        <w:t>status  (</w:t>
+        <w:t xml:space="preserve"> -status  (</w:t>
       </w:r>
       <w:proofErr w:type="spellStart"/>
-      <w:proofErr w:type="gramEnd"/>
       <w:r>
         <w:rPr>
           <w:b/>
@@ -1928,6 +1914,7 @@
           <w:color w:val="7030A0"/>
           <w:lang w:bidi="ar-EG"/>
         </w:rPr>
+        <w:lastRenderedPageBreak/>
         <w:t>5-Appointment</w:t>
       </w:r>
     </w:p>
@@ -2158,27 +2145,7 @@
           <w:color w:val="000000" w:themeColor="text1"/>
           <w:lang w:bidi="ar-EG"/>
         </w:rPr>
-        <w:t>-</w:t>
-      </w:r>
-      <w:proofErr w:type="gramStart"/>
-      <w:r>
-        <w:rPr>
-          <w:b/>
-          <w:bCs/>
-          <w:color w:val="000000" w:themeColor="text1"/>
-          <w:lang w:bidi="ar-EG"/>
-        </w:rPr>
-        <w:t>services[</w:t>
-      </w:r>
-      <w:proofErr w:type="gramEnd"/>
-      <w:r>
-        <w:rPr>
-          <w:b/>
-          <w:bCs/>
-          <w:color w:val="000000" w:themeColor="text1"/>
-          <w:lang w:bidi="ar-EG"/>
-        </w:rPr>
-        <w:t>]</w:t>
+        <w:t>-services[]</w:t>
       </w:r>
       <w:r>
         <w:rPr>

</xml_diff>

<commit_message>
doctor service and slot are added
</commit_message>
<xml_diff>
--- a/System analysis.docx
+++ b/System analysis.docx
@@ -4,6 +4,7 @@
   <w:body>
     <w:p>
       <w:pPr>
+        <w:ind w:firstLine="720"/>
         <w:jc w:val="right"/>
         <w:rPr>
           <w:b/>
@@ -336,7 +337,25 @@
           <w:color w:val="000000" w:themeColor="text1"/>
           <w:lang w:bidi="ar-EG"/>
         </w:rPr>
-        <w:t xml:space="preserve">1-Login   2-Get All Appointments that assigned to him </w:t>
+        <w:t>1-</w:t>
+      </w:r>
+      <w:r>
+        <w:rPr>
+          <w:b/>
+          <w:bCs/>
+          <w:color w:val="00B050"/>
+          <w:lang w:bidi="ar-EG"/>
+        </w:rPr>
+        <w:t xml:space="preserve">Login   </w:t>
+      </w:r>
+      <w:r>
+        <w:rPr>
+          <w:b/>
+          <w:bCs/>
+          <w:color w:val="000000" w:themeColor="text1"/>
+          <w:lang w:bidi="ar-EG"/>
+        </w:rPr>
+        <w:t xml:space="preserve">2-Get All Appointments that assigned to him </w:t>
       </w:r>
     </w:p>
     <w:p>
@@ -387,13 +406,22 @@
           <w:color w:val="000000" w:themeColor="text1"/>
           <w:lang w:bidi="ar-EG"/>
         </w:rPr>
-        <w:t xml:space="preserve">4-update my account </w:t>
-      </w:r>
-      <w:r>
-        <w:rPr>
-          <w:b/>
-          <w:bCs/>
-          <w:color w:val="000000" w:themeColor="text1"/>
+        <w:t>4-</w:t>
+      </w:r>
+      <w:r>
+        <w:rPr>
+          <w:b/>
+          <w:bCs/>
+          <w:color w:val="00B050"/>
+          <w:lang w:bidi="ar-EG"/>
+        </w:rPr>
+        <w:t xml:space="preserve">update my account </w:t>
+      </w:r>
+      <w:r>
+        <w:rPr>
+          <w:b/>
+          <w:bCs/>
+          <w:color w:val="00B050"/>
           <w:lang w:bidi="ar-EG"/>
         </w:rPr>
         <w:t xml:space="preserve"> </w:t>
@@ -750,16 +778,7 @@
           <w:bCs/>
           <w:lang w:bidi="ar-EG"/>
         </w:rPr>
-        <w:t xml:space="preserve"> -</w:t>
-      </w:r>
-      <w:proofErr w:type="spellStart"/>
-      <w:r>
-        <w:rPr>
-          <w:b/>
-          <w:bCs/>
-          <w:lang w:bidi="ar-EG"/>
-        </w:rPr>
-        <w:t>getDoctor</w:t>
+        <w:t xml:space="preserve"> -getDoctor</w:t>
       </w:r>
       <w:r>
         <w:rPr>
@@ -769,7 +788,6 @@
         </w:rPr>
         <w:t>Details</w:t>
       </w:r>
-      <w:proofErr w:type="spellEnd"/>
       <w:r>
         <w:rPr>
           <w:b/>
@@ -793,6 +811,14 @@
           <w:lang w:bidi="ar-EG"/>
         </w:rPr>
         <w:t xml:space="preserve">   </w:t>
+      </w:r>
+      <w:r>
+        <w:rPr>
+          <w:b/>
+          <w:bCs/>
+          <w:lang w:bidi="ar-EG"/>
+        </w:rPr>
+        <w:t>-getAllDoctors</w:t>
       </w:r>
     </w:p>
     <w:p>
@@ -1227,7 +1253,6 @@
         </w:rPr>
         <w:pgNum/>
       </w:r>
-      <w:proofErr w:type="spellStart"/>
       <w:r>
         <w:rPr>
           <w:b/>
@@ -1237,7 +1262,6 @@
         </w:rPr>
         <w:t>atient</w:t>
       </w:r>
-      <w:proofErr w:type="spellEnd"/>
       <w:r>
         <w:rPr>
           <w:b/>
@@ -1296,144 +1320,206 @@
           <w:color w:val="000000" w:themeColor="text1"/>
           <w:lang w:bidi="ar-EG"/>
         </w:rPr>
+        <w:t>-dateOfBirth     -role</w:t>
+      </w:r>
+      <w:r>
+        <w:rPr>
+          <w:b/>
+          <w:bCs/>
+          <w:color w:val="000000" w:themeColor="text1"/>
+          <w:lang w:bidi="ar-EG"/>
+        </w:rPr>
+        <w:t>[enum]</w:t>
+      </w:r>
+      <w:r>
+        <w:rPr>
+          <w:b/>
+          <w:bCs/>
+          <w:color w:val="000000" w:themeColor="text1"/>
+          <w:lang w:bidi="ar-EG"/>
+        </w:rPr>
+        <w:t xml:space="preserve">     -gender</w:t>
+      </w:r>
+      <w:r>
+        <w:rPr>
+          <w:b/>
+          <w:bCs/>
+          <w:color w:val="000000" w:themeColor="text1"/>
+          <w:lang w:bidi="ar-EG"/>
+        </w:rPr>
+        <w:t>[enum]</w:t>
+      </w:r>
+      <w:r>
+        <w:rPr>
+          <w:b/>
+          <w:bCs/>
+          <w:color w:val="000000" w:themeColor="text1"/>
+          <w:lang w:bidi="ar-EG"/>
+        </w:rPr>
+        <w:t xml:space="preserve">     -address</w:t>
+      </w:r>
+    </w:p>
+    <w:p>
+      <w:pPr>
+        <w:bidi/>
+        <w:jc w:val="right"/>
+        <w:rPr>
+          <w:b/>
+          <w:bCs/>
+          <w:color w:val="000000" w:themeColor="text1"/>
+          <w:lang w:bidi="ar-EG"/>
+        </w:rPr>
+      </w:pPr>
+      <w:r>
+        <w:rPr>
+          <w:b/>
+          <w:bCs/>
+          <w:color w:val="000000" w:themeColor="text1"/>
+          <w:lang w:bidi="ar-EG"/>
+        </w:rPr>
+        <w:t>-phone     -isActive    -</w:t>
+      </w:r>
+    </w:p>
+    <w:p>
+      <w:pPr>
+        <w:bidi/>
+        <w:jc w:val="right"/>
+        <w:rPr>
+          <w:b/>
+          <w:bCs/>
+          <w:color w:val="7030A0"/>
+          <w:lang w:bidi="ar-EG"/>
+        </w:rPr>
+      </w:pPr>
+      <w:r>
+        <w:rPr>
+          <w:b/>
+          <w:bCs/>
+          <w:color w:val="7030A0"/>
+          <w:lang w:bidi="ar-EG"/>
+        </w:rPr>
+        <w:t>1-Docor</w:t>
+      </w:r>
+      <w:r>
+        <w:rPr>
+          <w:b/>
+          <w:bCs/>
+          <w:color w:val="7030A0"/>
+          <w:lang w:bidi="ar-EG"/>
+        </w:rPr>
+        <w:t>:</w:t>
+      </w:r>
+    </w:p>
+    <w:p>
+      <w:pPr>
+        <w:bidi/>
+        <w:jc w:val="right"/>
+        <w:rPr>
+          <w:b/>
+          <w:bCs/>
+          <w:lang w:bidi="ar-EG"/>
+        </w:rPr>
+      </w:pPr>
+      <w:r>
+        <w:rPr>
+          <w:b/>
+          <w:bCs/>
+          <w:lang w:bidi="ar-EG"/>
+        </w:rPr>
+        <w:t>-userId</w:t>
+      </w:r>
+    </w:p>
+    <w:p>
+      <w:pPr>
+        <w:bidi/>
+        <w:jc w:val="right"/>
+        <w:rPr>
+          <w:b/>
+          <w:bCs/>
+          <w:color w:val="000000" w:themeColor="text1"/>
+          <w:lang w:bidi="ar-EG"/>
+        </w:rPr>
+      </w:pPr>
+      <w:r>
+        <w:rPr>
+          <w:b/>
+          <w:bCs/>
+          <w:color w:val="000000" w:themeColor="text1"/>
+          <w:lang w:bidi="ar-EG"/>
+        </w:rPr>
         <w:t>-</w:t>
       </w:r>
-      <w:proofErr w:type="spellStart"/>
-      <w:r>
-        <w:rPr>
-          <w:b/>
-          <w:bCs/>
-          <w:color w:val="000000" w:themeColor="text1"/>
-          <w:lang w:bidi="ar-EG"/>
-        </w:rPr>
-        <w:t>dateOfBirth</w:t>
-      </w:r>
-      <w:proofErr w:type="spellEnd"/>
-      <w:r>
-        <w:rPr>
-          <w:b/>
-          <w:bCs/>
-          <w:color w:val="000000" w:themeColor="text1"/>
-          <w:lang w:bidi="ar-EG"/>
-        </w:rPr>
-        <w:t xml:space="preserve">     -role</w:t>
-      </w:r>
-      <w:r>
-        <w:rPr>
-          <w:b/>
-          <w:bCs/>
-          <w:color w:val="000000" w:themeColor="text1"/>
-          <w:lang w:bidi="ar-EG"/>
-        </w:rPr>
-        <w:t>[</w:t>
-      </w:r>
-      <w:proofErr w:type="spellStart"/>
-      <w:r>
-        <w:rPr>
-          <w:b/>
-          <w:bCs/>
-          <w:color w:val="000000" w:themeColor="text1"/>
-          <w:lang w:bidi="ar-EG"/>
-        </w:rPr>
-        <w:t>enum</w:t>
-      </w:r>
-      <w:proofErr w:type="spellEnd"/>
-      <w:r>
-        <w:rPr>
-          <w:b/>
-          <w:bCs/>
-          <w:color w:val="000000" w:themeColor="text1"/>
-          <w:lang w:bidi="ar-EG"/>
-        </w:rPr>
-        <w:t>]</w:t>
-      </w:r>
-      <w:r>
-        <w:rPr>
-          <w:b/>
-          <w:bCs/>
-          <w:color w:val="000000" w:themeColor="text1"/>
-          <w:lang w:bidi="ar-EG"/>
-        </w:rPr>
-        <w:t xml:space="preserve">     -gender</w:t>
-      </w:r>
-      <w:r>
-        <w:rPr>
-          <w:b/>
-          <w:bCs/>
-          <w:color w:val="000000" w:themeColor="text1"/>
-          <w:lang w:bidi="ar-EG"/>
-        </w:rPr>
-        <w:t>[</w:t>
-      </w:r>
-      <w:proofErr w:type="spellStart"/>
-      <w:r>
-        <w:rPr>
-          <w:b/>
-          <w:bCs/>
-          <w:color w:val="000000" w:themeColor="text1"/>
-          <w:lang w:bidi="ar-EG"/>
-        </w:rPr>
-        <w:t>enum</w:t>
-      </w:r>
-      <w:proofErr w:type="spellEnd"/>
-      <w:r>
-        <w:rPr>
-          <w:b/>
-          <w:bCs/>
-          <w:color w:val="000000" w:themeColor="text1"/>
-          <w:lang w:bidi="ar-EG"/>
-        </w:rPr>
-        <w:t>]</w:t>
-      </w:r>
-      <w:r>
-        <w:rPr>
-          <w:b/>
-          <w:bCs/>
-          <w:color w:val="000000" w:themeColor="text1"/>
-          <w:lang w:bidi="ar-EG"/>
-        </w:rPr>
-        <w:t xml:space="preserve">     -address</w:t>
-      </w:r>
-    </w:p>
-    <w:p>
-      <w:pPr>
-        <w:bidi/>
-        <w:jc w:val="right"/>
-        <w:rPr>
-          <w:b/>
-          <w:bCs/>
-          <w:color w:val="000000" w:themeColor="text1"/>
-          <w:lang w:bidi="ar-EG"/>
-        </w:rPr>
-      </w:pPr>
-      <w:r>
-        <w:rPr>
-          <w:b/>
-          <w:bCs/>
-          <w:color w:val="000000" w:themeColor="text1"/>
-          <w:lang w:bidi="ar-EG"/>
-        </w:rPr>
-        <w:t>-phone     -</w:t>
-      </w:r>
-      <w:proofErr w:type="spellStart"/>
-      <w:r>
-        <w:rPr>
-          <w:b/>
-          <w:bCs/>
-          <w:color w:val="000000" w:themeColor="text1"/>
-          <w:lang w:bidi="ar-EG"/>
-        </w:rPr>
-        <w:t>isActive</w:t>
-      </w:r>
-      <w:proofErr w:type="spellEnd"/>
-      <w:r>
-        <w:rPr>
-          <w:b/>
-          <w:bCs/>
-          <w:color w:val="000000" w:themeColor="text1"/>
-          <w:lang w:bidi="ar-EG"/>
-        </w:rPr>
-        <w:t xml:space="preserve">    -</w:t>
+      <w:r>
+        <w:rPr>
+          <w:b/>
+          <w:bCs/>
+          <w:color w:val="000000" w:themeColor="text1"/>
+          <w:lang w:bidi="ar-EG"/>
+        </w:rPr>
+        <w:t>experience</w:t>
+      </w:r>
+    </w:p>
+    <w:p>
+      <w:pPr>
+        <w:bidi/>
+        <w:jc w:val="right"/>
+        <w:rPr>
+          <w:b/>
+          <w:bCs/>
+          <w:color w:val="000000" w:themeColor="text1"/>
+          <w:rtl/>
+          <w:lang w:bidi="ar-EG"/>
+        </w:rPr>
+      </w:pPr>
+      <w:r>
+        <w:rPr>
+          <w:b/>
+          <w:bCs/>
+          <w:color w:val="000000" w:themeColor="text1"/>
+          <w:lang w:bidi="ar-EG"/>
+        </w:rPr>
+        <w:t>-bio      -image    -</w:t>
+      </w:r>
+      <w:r>
+        <w:rPr>
+          <w:b/>
+          <w:bCs/>
+          <w:color w:val="000000" w:themeColor="text1"/>
+          <w:lang w:bidi="ar-EG"/>
+        </w:rPr>
+        <w:t>specialization</w:t>
+      </w:r>
+    </w:p>
+    <w:p>
+      <w:pPr>
+        <w:bidi/>
+        <w:jc w:val="right"/>
+        <w:rPr>
+          <w:b/>
+          <w:bCs/>
+          <w:color w:val="000000" w:themeColor="text1"/>
+          <w:lang w:bidi="ar-EG"/>
+        </w:rPr>
+      </w:pPr>
+      <w:r>
+        <w:rPr>
+          <w:b/>
+          <w:bCs/>
+          <w:color w:val="000000" w:themeColor="text1"/>
+          <w:lang w:bidi="ar-EG"/>
+        </w:rPr>
+        <w:t>consultation_fee</w:t>
+      </w:r>
+      <w:r>
+        <w:rPr>
+          <w:rFonts w:hint="cs"/>
+          <w:b/>
+          <w:bCs/>
+          <w:color w:val="000000" w:themeColor="text1"/>
+          <w:rtl/>
+          <w:lang w:bidi="ar-EG"/>
+        </w:rPr>
+        <w:t>-</w:t>
       </w:r>
     </w:p>
     <w:p>
@@ -1454,65 +1540,130 @@
           <w:color w:val="7030A0"/>
           <w:lang w:bidi="ar-EG"/>
         </w:rPr>
-        <w:t>1-Docor</w:t>
-      </w:r>
-      <w:r>
+        <w:t>3-Service:</w:t>
+      </w:r>
+    </w:p>
+    <w:p>
+      <w:pPr>
+        <w:bidi/>
+        <w:jc w:val="right"/>
+        <w:rPr>
+          <w:b/>
+          <w:bCs/>
+          <w:color w:val="000000" w:themeColor="text1"/>
+          <w:lang w:bidi="ar-EG"/>
+        </w:rPr>
+      </w:pPr>
+      <w:r>
+        <w:rPr>
+          <w:b/>
+          <w:bCs/>
+          <w:color w:val="000000" w:themeColor="text1"/>
+          <w:lang w:bidi="ar-EG"/>
+        </w:rPr>
+        <w:t xml:space="preserve">-name    -price    -description </w:t>
+      </w:r>
+    </w:p>
+    <w:p>
+      <w:pPr>
+        <w:bidi/>
+        <w:jc w:val="right"/>
         <w:rPr>
           <w:b/>
           <w:bCs/>
           <w:color w:val="7030A0"/>
           <w:lang w:bidi="ar-EG"/>
         </w:rPr>
+      </w:pPr>
+      <w:r>
+        <w:rPr>
+          <w:b/>
+          <w:bCs/>
+          <w:color w:val="7030A0"/>
+          <w:lang w:bidi="ar-EG"/>
+        </w:rPr>
+        <w:t>-service_booking:</w:t>
+      </w:r>
+    </w:p>
+    <w:p>
+      <w:pPr>
+        <w:bidi/>
+        <w:jc w:val="right"/>
+        <w:rPr>
+          <w:b/>
+          <w:bCs/>
+          <w:color w:val="000000" w:themeColor="text1"/>
+          <w:lang w:bidi="ar-EG"/>
+        </w:rPr>
+      </w:pPr>
+      <w:r>
+        <w:rPr>
+          <w:b/>
+          <w:bCs/>
+          <w:color w:val="000000" w:themeColor="text1"/>
+          <w:lang w:bidi="ar-EG"/>
+        </w:rPr>
+        <w:t xml:space="preserve">-p_id     -ser_id    -date      </w:t>
+      </w:r>
+    </w:p>
+    <w:p>
+      <w:pPr>
+        <w:bidi/>
+        <w:jc w:val="right"/>
+        <w:rPr>
+          <w:b/>
+          <w:bCs/>
+          <w:color w:val="000000" w:themeColor="text1"/>
+          <w:lang w:bidi="ar-EG"/>
+        </w:rPr>
+      </w:pPr>
+      <w:r>
+        <w:rPr>
+          <w:b/>
+          <w:bCs/>
+          <w:color w:val="7030A0"/>
+          <w:lang w:bidi="ar-EG"/>
+        </w:rPr>
+        <w:t>4-slot</w:t>
+      </w:r>
+      <w:r>
+        <w:rPr>
+          <w:b/>
+          <w:bCs/>
+          <w:color w:val="7030A0"/>
+          <w:lang w:bidi="ar-EG"/>
+        </w:rPr>
         <w:t>:</w:t>
       </w:r>
-    </w:p>
-    <w:p>
-      <w:pPr>
-        <w:bidi/>
-        <w:jc w:val="right"/>
-        <w:rPr>
-          <w:b/>
-          <w:bCs/>
-          <w:lang w:bidi="ar-EG"/>
-        </w:rPr>
-      </w:pPr>
-      <w:r>
-        <w:rPr>
-          <w:b/>
-          <w:bCs/>
-          <w:lang w:bidi="ar-EG"/>
-        </w:rPr>
-        <w:t>-userId</w:t>
-      </w:r>
-    </w:p>
-    <w:p>
-      <w:pPr>
-        <w:bidi/>
-        <w:jc w:val="right"/>
-        <w:rPr>
-          <w:b/>
-          <w:bCs/>
-          <w:color w:val="000000" w:themeColor="text1"/>
-          <w:lang w:bidi="ar-EG"/>
-        </w:rPr>
-      </w:pPr>
-      <w:r>
-        <w:rPr>
-          <w:b/>
-          <w:bCs/>
-          <w:color w:val="000000" w:themeColor="text1"/>
-          <w:lang w:bidi="ar-EG"/>
-        </w:rPr>
-        <w:t>-</w:t>
-      </w:r>
-      <w:r>
-        <w:rPr>
-          <w:b/>
-          <w:bCs/>
-          <w:color w:val="000000" w:themeColor="text1"/>
-          <w:lang w:bidi="ar-EG"/>
-        </w:rPr>
-        <w:t>experience</w:t>
+      <w:r>
+        <w:rPr>
+          <w:b/>
+          <w:bCs/>
+          <w:color w:val="000000" w:themeColor="text1"/>
+          <w:lang w:bidi="ar-EG"/>
+        </w:rPr>
+        <w:t xml:space="preserve"> </w:t>
+      </w:r>
+    </w:p>
+    <w:p>
+      <w:pPr>
+        <w:bidi/>
+        <w:jc w:val="right"/>
+        <w:rPr>
+          <w:b/>
+          <w:bCs/>
+          <w:color w:val="000000" w:themeColor="text1"/>
+          <w:lang w:bidi="ar-EG"/>
+        </w:rPr>
+      </w:pPr>
+      <w:r>
+        <w:rPr>
+          <w:b/>
+          <w:bCs/>
+          <w:color w:val="000000" w:themeColor="text1"/>
+          <w:lang w:bidi="ar-EG"/>
+        </w:rPr>
+        <w:t xml:space="preserve">-Dr_id   -date </w:t>
       </w:r>
     </w:p>
     <w:p>
@@ -1534,275 +1685,6 @@
           <w:color w:val="000000" w:themeColor="text1"/>
           <w:lang w:bidi="ar-EG"/>
         </w:rPr>
-        <w:t>-bio      -image    -</w:t>
-      </w:r>
-      <w:r>
-        <w:rPr>
-          <w:b/>
-          <w:bCs/>
-          <w:color w:val="000000" w:themeColor="text1"/>
-          <w:lang w:bidi="ar-EG"/>
-        </w:rPr>
-        <w:t>specialization</w:t>
-      </w:r>
-    </w:p>
-    <w:p>
-      <w:pPr>
-        <w:bidi/>
-        <w:jc w:val="right"/>
-        <w:rPr>
-          <w:b/>
-          <w:bCs/>
-          <w:color w:val="000000" w:themeColor="text1"/>
-          <w:lang w:bidi="ar-EG"/>
-        </w:rPr>
-      </w:pPr>
-      <w:proofErr w:type="spellStart"/>
-      <w:r>
-        <w:rPr>
-          <w:b/>
-          <w:bCs/>
-          <w:color w:val="000000" w:themeColor="text1"/>
-          <w:lang w:bidi="ar-EG"/>
-        </w:rPr>
-        <w:t>consultation_fee</w:t>
-      </w:r>
-      <w:proofErr w:type="spellEnd"/>
-      <w:r>
-        <w:rPr>
-          <w:rFonts w:hint="cs"/>
-          <w:b/>
-          <w:bCs/>
-          <w:color w:val="000000" w:themeColor="text1"/>
-          <w:rtl/>
-          <w:lang w:bidi="ar-EG"/>
-        </w:rPr>
-        <w:t>-</w:t>
-      </w:r>
-    </w:p>
-    <w:p>
-      <w:pPr>
-        <w:bidi/>
-        <w:jc w:val="right"/>
-        <w:rPr>
-          <w:b/>
-          <w:bCs/>
-          <w:color w:val="7030A0"/>
-          <w:lang w:bidi="ar-EG"/>
-        </w:rPr>
-      </w:pPr>
-      <w:r>
-        <w:rPr>
-          <w:b/>
-          <w:bCs/>
-          <w:color w:val="7030A0"/>
-          <w:lang w:bidi="ar-EG"/>
-        </w:rPr>
-        <w:t>3-Service:</w:t>
-      </w:r>
-    </w:p>
-    <w:p>
-      <w:pPr>
-        <w:bidi/>
-        <w:jc w:val="right"/>
-        <w:rPr>
-          <w:b/>
-          <w:bCs/>
-          <w:color w:val="000000" w:themeColor="text1"/>
-          <w:lang w:bidi="ar-EG"/>
-        </w:rPr>
-      </w:pPr>
-      <w:r>
-        <w:rPr>
-          <w:b/>
-          <w:bCs/>
-          <w:color w:val="000000" w:themeColor="text1"/>
-          <w:lang w:bidi="ar-EG"/>
-        </w:rPr>
-        <w:t xml:space="preserve">-name    -price    -description </w:t>
-      </w:r>
-    </w:p>
-    <w:p>
-      <w:pPr>
-        <w:bidi/>
-        <w:jc w:val="right"/>
-        <w:rPr>
-          <w:b/>
-          <w:bCs/>
-          <w:color w:val="7030A0"/>
-          <w:lang w:bidi="ar-EG"/>
-        </w:rPr>
-      </w:pPr>
-      <w:r>
-        <w:rPr>
-          <w:b/>
-          <w:bCs/>
-          <w:color w:val="7030A0"/>
-          <w:lang w:bidi="ar-EG"/>
-        </w:rPr>
-        <w:t>-</w:t>
-      </w:r>
-      <w:proofErr w:type="spellStart"/>
-      <w:r>
-        <w:rPr>
-          <w:b/>
-          <w:bCs/>
-          <w:color w:val="7030A0"/>
-          <w:lang w:bidi="ar-EG"/>
-        </w:rPr>
-        <w:t>service_booking</w:t>
-      </w:r>
-      <w:proofErr w:type="spellEnd"/>
-      <w:r>
-        <w:rPr>
-          <w:b/>
-          <w:bCs/>
-          <w:color w:val="7030A0"/>
-          <w:lang w:bidi="ar-EG"/>
-        </w:rPr>
-        <w:t>:</w:t>
-      </w:r>
-    </w:p>
-    <w:p>
-      <w:pPr>
-        <w:bidi/>
-        <w:jc w:val="right"/>
-        <w:rPr>
-          <w:b/>
-          <w:bCs/>
-          <w:color w:val="000000" w:themeColor="text1"/>
-          <w:lang w:bidi="ar-EG"/>
-        </w:rPr>
-      </w:pPr>
-      <w:r>
-        <w:rPr>
-          <w:b/>
-          <w:bCs/>
-          <w:color w:val="000000" w:themeColor="text1"/>
-          <w:lang w:bidi="ar-EG"/>
-        </w:rPr>
-        <w:t>-</w:t>
-      </w:r>
-      <w:proofErr w:type="spellStart"/>
-      <w:r>
-        <w:rPr>
-          <w:b/>
-          <w:bCs/>
-          <w:color w:val="000000" w:themeColor="text1"/>
-          <w:lang w:bidi="ar-EG"/>
-        </w:rPr>
-        <w:t>p_id</w:t>
-      </w:r>
-      <w:proofErr w:type="spellEnd"/>
-      <w:r>
-        <w:rPr>
-          <w:b/>
-          <w:bCs/>
-          <w:color w:val="000000" w:themeColor="text1"/>
-          <w:lang w:bidi="ar-EG"/>
-        </w:rPr>
-        <w:t xml:space="preserve">     -</w:t>
-      </w:r>
-      <w:proofErr w:type="spellStart"/>
-      <w:r>
-        <w:rPr>
-          <w:b/>
-          <w:bCs/>
-          <w:color w:val="000000" w:themeColor="text1"/>
-          <w:lang w:bidi="ar-EG"/>
-        </w:rPr>
-        <w:t>ser_id</w:t>
-      </w:r>
-      <w:proofErr w:type="spellEnd"/>
-      <w:r>
-        <w:rPr>
-          <w:b/>
-          <w:bCs/>
-          <w:color w:val="000000" w:themeColor="text1"/>
-          <w:lang w:bidi="ar-EG"/>
-        </w:rPr>
-        <w:t xml:space="preserve">    -date      </w:t>
-      </w:r>
-    </w:p>
-    <w:p>
-      <w:pPr>
-        <w:bidi/>
-        <w:jc w:val="right"/>
-        <w:rPr>
-          <w:b/>
-          <w:bCs/>
-          <w:color w:val="000000" w:themeColor="text1"/>
-          <w:lang w:bidi="ar-EG"/>
-        </w:rPr>
-      </w:pPr>
-      <w:r>
-        <w:rPr>
-          <w:b/>
-          <w:bCs/>
-          <w:color w:val="7030A0"/>
-          <w:lang w:bidi="ar-EG"/>
-        </w:rPr>
-        <w:t>4-slot</w:t>
-      </w:r>
-      <w:r>
-        <w:rPr>
-          <w:b/>
-          <w:bCs/>
-          <w:color w:val="7030A0"/>
-          <w:lang w:bidi="ar-EG"/>
-        </w:rPr>
-        <w:t>:</w:t>
-      </w:r>
-      <w:r>
-        <w:rPr>
-          <w:b/>
-          <w:bCs/>
-          <w:color w:val="000000" w:themeColor="text1"/>
-          <w:lang w:bidi="ar-EG"/>
-        </w:rPr>
-        <w:t xml:space="preserve"> </w:t>
-      </w:r>
-    </w:p>
-    <w:p>
-      <w:pPr>
-        <w:bidi/>
-        <w:jc w:val="right"/>
-        <w:rPr>
-          <w:b/>
-          <w:bCs/>
-          <w:color w:val="000000" w:themeColor="text1"/>
-          <w:lang w:bidi="ar-EG"/>
-        </w:rPr>
-      </w:pPr>
-      <w:r>
-        <w:rPr>
-          <w:b/>
-          <w:bCs/>
-          <w:color w:val="000000" w:themeColor="text1"/>
-          <w:lang w:bidi="ar-EG"/>
-        </w:rPr>
-        <w:t xml:space="preserve">-Dr_id   -date </w:t>
-      </w:r>
-    </w:p>
-    <w:p>
-      <w:pPr>
-        <w:bidi/>
-        <w:jc w:val="right"/>
-        <w:rPr>
-          <w:b/>
-          <w:bCs/>
-          <w:color w:val="000000" w:themeColor="text1"/>
-          <w:rtl/>
-          <w:lang w:bidi="ar-EG"/>
-        </w:rPr>
-      </w:pPr>
-      <w:r>
-        <w:rPr>
-          <w:b/>
-          <w:bCs/>
-          <w:color w:val="000000" w:themeColor="text1"/>
-          <w:lang w:bidi="ar-EG"/>
-        </w:rPr>
         <w:t xml:space="preserve"> -start_time   -end_time </w:t>
       </w:r>
     </w:p>
@@ -1826,7 +1708,6 @@
         </w:rPr>
         <w:t xml:space="preserve"> -status  (</w:t>
       </w:r>
-      <w:proofErr w:type="spellStart"/>
       <w:r>
         <w:rPr>
           <w:b/>
@@ -1854,7 +1735,6 @@
         </w:rPr>
         <w:t>CANCELLED</w:t>
       </w:r>
-      <w:proofErr w:type="spellEnd"/>
       <w:r>
         <w:rPr>
           <w:b/>
@@ -1936,48 +1816,17 @@
           <w:color w:val="000000" w:themeColor="text1"/>
           <w:lang w:bidi="ar-EG"/>
         </w:rPr>
-        <w:t xml:space="preserve">    -</w:t>
-      </w:r>
-      <w:proofErr w:type="spellStart"/>
-      <w:r>
-        <w:rPr>
-          <w:b/>
-          <w:bCs/>
-          <w:color w:val="000000" w:themeColor="text1"/>
-          <w:lang w:bidi="ar-EG"/>
-        </w:rPr>
-        <w:t>P_id</w:t>
-      </w:r>
-      <w:proofErr w:type="spellEnd"/>
-      <w:r>
-        <w:rPr>
-          <w:b/>
-          <w:bCs/>
-          <w:color w:val="000000" w:themeColor="text1"/>
-          <w:lang w:bidi="ar-EG"/>
-        </w:rPr>
-        <w:t xml:space="preserve">   </w:t>
-      </w:r>
-      <w:r>
-        <w:rPr>
-          <w:b/>
-          <w:bCs/>
-          <w:color w:val="000000" w:themeColor="text1"/>
-          <w:lang w:bidi="ar-EG"/>
-        </w:rPr>
-        <w:t>-</w:t>
-      </w:r>
-      <w:proofErr w:type="spellStart"/>
-      <w:r>
-        <w:rPr>
-          <w:b/>
-          <w:bCs/>
-          <w:color w:val="000000" w:themeColor="text1"/>
-          <w:lang w:bidi="ar-EG"/>
-        </w:rPr>
-        <w:t>SlotId</w:t>
-      </w:r>
-      <w:proofErr w:type="spellEnd"/>
+        <w:t xml:space="preserve">    -P_id   </w:t>
+      </w:r>
+      <w:r>
+        <w:rPr>
+          <w:b/>
+          <w:bCs/>
+          <w:color w:val="000000" w:themeColor="text1"/>
+          <w:lang w:bidi="ar-EG"/>
+        </w:rPr>
+        <w:t>-SlotId</w:t>
+      </w:r>
     </w:p>
     <w:p>
       <w:pPr>
@@ -2093,39 +1942,8 @@
           <w:color w:val="000000" w:themeColor="text1"/>
           <w:lang w:bidi="ar-EG"/>
         </w:rPr>
-        <w:t>-</w:t>
-      </w:r>
-      <w:proofErr w:type="spellStart"/>
-      <w:r>
-        <w:rPr>
-          <w:b/>
-          <w:bCs/>
-          <w:color w:val="000000" w:themeColor="text1"/>
-          <w:lang w:bidi="ar-EG"/>
-        </w:rPr>
-        <w:t>P_id</w:t>
-      </w:r>
-      <w:proofErr w:type="spellEnd"/>
-      <w:r>
-        <w:rPr>
-          <w:b/>
-          <w:bCs/>
-          <w:color w:val="000000" w:themeColor="text1"/>
-          <w:lang w:bidi="ar-EG"/>
-        </w:rPr>
-        <w:t xml:space="preserve">     -</w:t>
-      </w:r>
-      <w:proofErr w:type="spellStart"/>
-      <w:r>
-        <w:rPr>
-          <w:b/>
-          <w:bCs/>
-          <w:color w:val="000000" w:themeColor="text1"/>
-          <w:lang w:bidi="ar-EG"/>
-        </w:rPr>
-        <w:t>app_id</w:t>
-      </w:r>
-      <w:proofErr w:type="spellEnd"/>
+        <w:t>-P_id     -app_id</w:t>
+      </w:r>
     </w:p>
     <w:p>
       <w:pPr>

</xml_diff>

<commit_message>
presciption service is added
</commit_message>
<xml_diff>
--- a/System analysis.docx
+++ b/System analysis.docx
@@ -475,16 +475,52 @@
           <w:color w:val="000000" w:themeColor="text1"/>
           <w:lang w:bidi="ar-EG"/>
         </w:rPr>
-        <w:t xml:space="preserve">7-Add Slot </w:t>
-      </w:r>
-      <w:r>
-        <w:rPr>
-          <w:b/>
-          <w:bCs/>
-          <w:color w:val="000000" w:themeColor="text1"/>
-          <w:lang w:bidi="ar-EG"/>
-        </w:rPr>
-        <w:t xml:space="preserve">   8-update Slot   9-delete Solt </w:t>
+        <w:t>7-</w:t>
+      </w:r>
+      <w:r>
+        <w:rPr>
+          <w:b/>
+          <w:bCs/>
+          <w:color w:val="00B050"/>
+          <w:lang w:bidi="ar-EG"/>
+        </w:rPr>
+        <w:t xml:space="preserve">Add Slot </w:t>
+      </w:r>
+      <w:r>
+        <w:rPr>
+          <w:b/>
+          <w:bCs/>
+          <w:color w:val="000000" w:themeColor="text1"/>
+          <w:lang w:bidi="ar-EG"/>
+        </w:rPr>
+        <w:t xml:space="preserve">   8-</w:t>
+      </w:r>
+      <w:r>
+        <w:rPr>
+          <w:b/>
+          <w:bCs/>
+          <w:color w:val="00B050"/>
+          <w:lang w:bidi="ar-EG"/>
+        </w:rPr>
+        <w:t>update Slot</w:t>
+      </w:r>
+      <w:r>
+        <w:rPr>
+          <w:b/>
+          <w:bCs/>
+          <w:color w:val="000000" w:themeColor="text1"/>
+          <w:lang w:bidi="ar-EG"/>
+        </w:rPr>
+        <w:t xml:space="preserve">   9-</w:t>
+      </w:r>
+      <w:r>
+        <w:rPr>
+          <w:b/>
+          <w:bCs/>
+          <w:color w:val="00B050"/>
+          <w:lang w:bidi="ar-EG"/>
+        </w:rPr>
+        <w:t xml:space="preserve">delete Solt </w:t>
       </w:r>
     </w:p>
     <w:p>
@@ -574,6 +610,7 @@
         </w:rPr>
         <w:t>13-get</w:t>
       </w:r>
+      <w:bookmarkStart w:id="0" w:name="_Hlk240478234"/>
       <w:r>
         <w:rPr>
           <w:b/>
@@ -583,14 +620,147 @@
         </w:rPr>
         <w:t>Prescription</w:t>
       </w:r>
-      <w:r>
-        <w:rPr>
-          <w:b/>
-          <w:bCs/>
-          <w:color w:val="000000" w:themeColor="text1"/>
-          <w:lang w:bidi="ar-EG"/>
-        </w:rPr>
-        <w:t xml:space="preserve">       </w:t>
+      <w:bookmarkEnd w:id="0"/>
+      <w:r>
+        <w:rPr>
+          <w:b/>
+          <w:bCs/>
+          <w:color w:val="000000" w:themeColor="text1"/>
+          <w:lang w:bidi="ar-EG"/>
+        </w:rPr>
+        <w:t xml:space="preserve">      </w:t>
+      </w:r>
+      <w:r>
+        <w:rPr>
+          <w:b/>
+          <w:bCs/>
+          <w:color w:val="000000" w:themeColor="text1"/>
+          <w:lang w:bidi="ar-EG"/>
+        </w:rPr>
+        <w:t xml:space="preserve">-get all </w:t>
+      </w:r>
+      <w:r>
+        <w:rPr>
+          <w:b/>
+          <w:bCs/>
+          <w:color w:val="000000" w:themeColor="text1"/>
+          <w:lang w:bidi="ar-EG"/>
+        </w:rPr>
+        <w:t>Prescription</w:t>
+      </w:r>
+      <w:r>
+        <w:rPr>
+          <w:b/>
+          <w:bCs/>
+          <w:color w:val="000000" w:themeColor="text1"/>
+          <w:lang w:bidi="ar-EG"/>
+        </w:rPr>
+        <w:t xml:space="preserve">  -getSlot</w:t>
+      </w:r>
+      <w:r>
+        <w:rPr>
+          <w:b/>
+          <w:bCs/>
+          <w:color w:val="000000" w:themeColor="text1"/>
+          <w:lang w:bidi="ar-EG"/>
+        </w:rPr>
+        <w:t>Prescription</w:t>
+      </w:r>
+    </w:p>
+    <w:p>
+      <w:pPr>
+        <w:bidi/>
+        <w:jc w:val="right"/>
+        <w:rPr>
+          <w:b/>
+          <w:bCs/>
+          <w:color w:val="000000" w:themeColor="text1"/>
+          <w:rtl/>
+          <w:lang w:bidi="ar-EG"/>
+        </w:rPr>
+      </w:pPr>
+      <w:r>
+        <w:rPr>
+          <w:b/>
+          <w:bCs/>
+          <w:color w:val="000000" w:themeColor="text1"/>
+          <w:lang w:bidi="ar-EG"/>
+        </w:rPr>
+        <w:t>-</w:t>
+      </w:r>
+      <w:r>
+        <w:rPr>
+          <w:b/>
+          <w:bCs/>
+          <w:color w:val="000000" w:themeColor="text1"/>
+          <w:lang w:bidi="ar-EG"/>
+        </w:rPr>
+        <w:t>getPatientPrescriptions</w:t>
+      </w:r>
+      <w:r>
+        <w:rPr>
+          <w:b/>
+          <w:bCs/>
+          <w:color w:val="000000" w:themeColor="text1"/>
+          <w:lang w:bidi="ar-EG"/>
+        </w:rPr>
+        <w:t xml:space="preserve">     - </w:t>
+      </w:r>
+      <w:r>
+        <w:rPr>
+          <w:b/>
+          <w:bCs/>
+          <w:color w:val="000000" w:themeColor="text1"/>
+          <w:lang w:bidi="ar-EG"/>
+        </w:rPr>
+        <w:t>getDoctorPrescriptions</w:t>
+      </w:r>
+      <w:r>
+        <w:rPr>
+          <w:b/>
+          <w:bCs/>
+          <w:color w:val="000000" w:themeColor="text1"/>
+          <w:lang w:bidi="ar-EG"/>
+        </w:rPr>
+        <w:t xml:space="preserve">    -</w:t>
+      </w:r>
+      <w:r>
+        <w:rPr>
+          <w:b/>
+          <w:bCs/>
+          <w:color w:val="000000" w:themeColor="text1"/>
+          <w:lang w:bidi="ar-EG"/>
+        </w:rPr>
+        <w:t>finalize</w:t>
+      </w:r>
+      <w:r>
+        <w:rPr>
+          <w:b/>
+          <w:bCs/>
+          <w:color w:val="000000" w:themeColor="text1"/>
+          <w:lang w:bidi="ar-EG"/>
+        </w:rPr>
+        <w:t>Prescription</w:t>
+      </w:r>
+      <w:r>
+        <w:rPr>
+          <w:b/>
+          <w:bCs/>
+          <w:color w:val="000000" w:themeColor="text1"/>
+          <w:lang w:bidi="ar-EG"/>
+        </w:rPr>
+        <w:t xml:space="preserve"> </w:t>
+      </w:r>
+      <w:r>
+        <w:rPr>
+          <w:rFonts w:hint="cs"/>
+          <w:b/>
+          <w:bCs/>
+          <w:color w:val="000000" w:themeColor="text1"/>
+          <w:rtl/>
+          <w:lang w:bidi="ar-EG"/>
+        </w:rPr>
+        <w:t xml:space="preserve">    </w:t>
       </w:r>
     </w:p>
     <w:p>
@@ -878,50 +1048,26 @@
           <w:color w:val="000000" w:themeColor="text1"/>
           <w:lang w:bidi="ar-EG"/>
         </w:rPr>
-        <w:t xml:space="preserve">7-get All Appointments    8-update the Appointment  </w:t>
-      </w:r>
-    </w:p>
-    <w:p>
-      <w:pPr>
-        <w:bidi/>
-        <w:jc w:val="right"/>
-        <w:rPr>
-          <w:b/>
-          <w:bCs/>
-          <w:color w:val="000000" w:themeColor="text1"/>
-          <w:lang w:bidi="ar-EG"/>
-        </w:rPr>
-      </w:pPr>
-      <w:r>
-        <w:rPr>
-          <w:b/>
-          <w:bCs/>
-          <w:color w:val="000000" w:themeColor="text1"/>
-          <w:lang w:bidi="ar-EG"/>
-        </w:rPr>
-        <w:t>9-Delete Appointment</w:t>
-      </w:r>
-      <w:r>
-        <w:rPr>
-          <w:b/>
-          <w:bCs/>
-          <w:color w:val="000000" w:themeColor="text1"/>
-          <w:lang w:bidi="ar-EG"/>
-        </w:rPr>
-        <w:t xml:space="preserve">     10-update User    </w:t>
-      </w:r>
-    </w:p>
-    <w:p>
-      <w:pPr>
-        <w:bidi/>
-        <w:jc w:val="right"/>
+        <w:t>7</w:t>
+      </w:r>
+      <w:r>
         <w:rPr>
           <w:b/>
           <w:bCs/>
           <w:color w:val="00B050"/>
           <w:lang w:bidi="ar-EG"/>
         </w:rPr>
-      </w:pPr>
+        <w:t>-get All Appointments</w:t>
+      </w:r>
+      <w:r>
+        <w:rPr>
+          <w:b/>
+          <w:bCs/>
+          <w:color w:val="000000" w:themeColor="text1"/>
+          <w:lang w:bidi="ar-EG"/>
+        </w:rPr>
+        <w:t xml:space="preserve">    8-</w:t>
+      </w:r>
       <w:r>
         <w:rPr>
           <w:b/>
@@ -929,6 +1075,75 @@
           <w:color w:val="00B050"/>
           <w:lang w:bidi="ar-EG"/>
         </w:rPr>
+        <w:t xml:space="preserve">update the Appointment  </w:t>
+      </w:r>
+    </w:p>
+    <w:p>
+      <w:pPr>
+        <w:bidi/>
+        <w:jc w:val="right"/>
+        <w:rPr>
+          <w:b/>
+          <w:bCs/>
+          <w:color w:val="000000" w:themeColor="text1"/>
+          <w:lang w:bidi="ar-EG"/>
+        </w:rPr>
+      </w:pPr>
+      <w:r>
+        <w:rPr>
+          <w:b/>
+          <w:bCs/>
+          <w:color w:val="000000" w:themeColor="text1"/>
+          <w:lang w:bidi="ar-EG"/>
+        </w:rPr>
+        <w:t>9-</w:t>
+      </w:r>
+      <w:r>
+        <w:rPr>
+          <w:b/>
+          <w:bCs/>
+          <w:color w:val="00B050"/>
+          <w:lang w:bidi="ar-EG"/>
+        </w:rPr>
+        <w:t>Delete Appointment</w:t>
+      </w:r>
+      <w:r>
+        <w:rPr>
+          <w:b/>
+          <w:bCs/>
+          <w:color w:val="00B050"/>
+          <w:lang w:bidi="ar-EG"/>
+        </w:rPr>
+        <w:t xml:space="preserve">     </w:t>
+      </w:r>
+      <w:r>
+        <w:rPr>
+          <w:b/>
+          <w:bCs/>
+          <w:color w:val="000000" w:themeColor="text1"/>
+          <w:lang w:bidi="ar-EG"/>
+        </w:rPr>
+        <w:t xml:space="preserve">10-update User    </w:t>
+      </w:r>
+    </w:p>
+    <w:p>
+      <w:pPr>
+        <w:bidi/>
+        <w:jc w:val="right"/>
+        <w:rPr>
+          <w:b/>
+          <w:bCs/>
+          <w:color w:val="00B050"/>
+          <w:lang w:bidi="ar-EG"/>
+        </w:rPr>
+      </w:pPr>
+      <w:r>
+        <w:rPr>
+          <w:b/>
+          <w:bCs/>
+          <w:color w:val="00B050"/>
+          <w:lang w:bidi="ar-EG"/>
+        </w:rPr>
         <w:t xml:space="preserve">11-Delete User  </w:t>
       </w:r>
       <w:r>
@@ -960,6 +1175,7 @@
           <w:color w:val="000000" w:themeColor="text1"/>
           <w:lang w:bidi="ar-EG"/>
         </w:rPr>
+        <w:lastRenderedPageBreak/>
         <w:t xml:space="preserve">14-get All  services   </w:t>
       </w:r>
       <w:r>
@@ -990,7 +1206,6 @@
           <w:color w:val="000000" w:themeColor="text1"/>
           <w:lang w:bidi="ar-EG"/>
         </w:rPr>
-        <w:lastRenderedPageBreak/>
         <w:t>15-update service    16-delete service</w:t>
       </w:r>
     </w:p>
@@ -1763,6 +1978,7 @@
           <w:color w:val="000000" w:themeColor="text1"/>
           <w:lang w:bidi="ar-EG"/>
         </w:rPr>
+        <w:lastRenderedPageBreak/>
         <w:tab/>
         <w:t xml:space="preserve"> -numOf</w:t>
       </w:r>
@@ -1794,7 +2010,6 @@
           <w:color w:val="7030A0"/>
           <w:lang w:bidi="ar-EG"/>
         </w:rPr>
-        <w:lastRenderedPageBreak/>
         <w:t>5-Appointment</w:t>
       </w:r>
     </w:p>
@@ -2025,6 +2240,56 @@
     </w:sectPr>
   </w:body>
 </w:document>
+</file>
+
+<file path=word/endnotes.xml><?xml version="1.0" encoding="utf-8"?>
+<w:endnotes xmlns:wpc="http://schemas.microsoft.com/office/word/2010/wordprocessingCanvas" xmlns:cx="http://schemas.microsoft.com/office/drawing/2014/chartex" xmlns:cx1="http://schemas.microsoft.com/office/drawing/2015/9/8/chartex" xmlns:cx2="http://schemas.microsoft.com/office/drawing/2015/10/21/chartex" xmlns:cx3="http://schemas.microsoft.com/office/drawing/2016/5/9/chartex" xmlns:cx4="http://schemas.microsoft.com/office/drawing/2016/5/10/chartex" xmlns:cx5="http://schemas.microsoft.com/office/drawing/2016/5/11/chartex" xmlns:cx6="http://schemas.microsoft.com/office/drawing/2016/5/12/chartex" xmlns:cx7="http://schemas.microsoft.com/office/drawing/2016/5/13/chartex" xmlns:cx8="http://schemas.microsoft.com/office/drawing/2016/5/14/chartex" xmlns:mc="http://schemas.openxmlformats.org/markup-compatibility/2006" xmlns:aink="http://schemas.microsoft.com/office/drawing/2016/ink" xmlns:am3d="http://schemas.microsoft.com/office/drawing/2017/model3d" xmlns:o="urn:schemas-microsoft-com:office:office" xmlns:oel="http://schemas.microsoft.com/office/2019/extlst" xmlns:r="http://schemas.openxmlformats.org/officeDocument/2006/relationships" xmlns:m="http://schemas.openxmlformats.org/officeDocument/2006/math" xmlns:v="urn:schemas-microsoft-com:vml" xmlns:wp14="http://schemas.microsoft.com/office/word/2010/wordprocessingDrawing" xmlns:wp="http://schemas.openxmlformats.org/drawingml/2006/wordprocessingDrawing" xmlns:w10="urn:schemas-microsoft-com:office:word" xmlns:w="http://schemas.openxmlformats.org/wordprocessingml/2006/main" xmlns:w14="http://schemas.microsoft.com/office/word/2010/wordml" xmlns:w15="http://schemas.microsoft.com/office/word/2012/wordml" xmlns:w16cex="http://schemas.microsoft.com/office/word/2018/wordml/cex" xmlns:w16cid="http://schemas.microsoft.com/office/word/2016/wordml/cid" xmlns:w16="http://schemas.microsoft.com/office/word/2018/wordml" xmlns:w16du="http://schemas.microsoft.com/office/word/2023/wordml/word16du" xmlns:w16sdtdh="http://schemas.microsoft.com/office/word/2020/wordml/sdtdatahash" xmlns:w16sdtfl="http://schemas.microsoft.com/office/word/2024/wordml/sdtformatlock" xmlns:w16se="http://schemas.microsoft.com/office/word/2015/wordml/symex" xmlns:wpg="http://schemas.microsoft.com/office/word/2010/wordprocessingGroup" xmlns:wpi="http://schemas.microsoft.com/office/word/2010/wordprocessingInk" xmlns:wne="http://schemas.microsoft.com/office/word/2006/wordml" xmlns:wps="http://schemas.microsoft.com/office/word/2010/wordprocessingShape" mc:Ignorable="w14 w15 w16se w16cid w16 w16cex w16sdtdh w16sdtfl w16du wp14">
+  <w:endnote w:type="separator" w:id="-1">
+    <w:p>
+      <w:pPr>
+        <w:spacing w:after="0" w:line="240" w:lineRule="auto"/>
+      </w:pPr>
+      <w:r>
+        <w:separator/>
+      </w:r>
+    </w:p>
+  </w:endnote>
+  <w:endnote w:type="continuationSeparator" w:id="0">
+    <w:p>
+      <w:pPr>
+        <w:spacing w:after="0" w:line="240" w:lineRule="auto"/>
+      </w:pPr>
+      <w:r>
+        <w:continuationSeparator/>
+      </w:r>
+    </w:p>
+  </w:endnote>
+</w:endnotes>
+</file>
+
+<file path=word/footnotes.xml><?xml version="1.0" encoding="utf-8"?>
+<w:footnotes xmlns:wpc="http://schemas.microsoft.com/office/word/2010/wordprocessingCanvas" xmlns:cx="http://schemas.microsoft.com/office/drawing/2014/chartex" xmlns:cx1="http://schemas.microsoft.com/office/drawing/2015/9/8/chartex" xmlns:cx2="http://schemas.microsoft.com/office/drawing/2015/10/21/chartex" xmlns:cx3="http://schemas.microsoft.com/office/drawing/2016/5/9/chartex" xmlns:cx4="http://schemas.microsoft.com/office/drawing/2016/5/10/chartex" xmlns:cx5="http://schemas.microsoft.com/office/drawing/2016/5/11/chartex" xmlns:cx6="http://schemas.microsoft.com/office/drawing/2016/5/12/chartex" xmlns:cx7="http://schemas.microsoft.com/office/drawing/2016/5/13/chartex" xmlns:cx8="http://schemas.microsoft.com/office/drawing/2016/5/14/chartex" xmlns:mc="http://schemas.openxmlformats.org/markup-compatibility/2006" xmlns:aink="http://schemas.microsoft.com/office/drawing/2016/ink" xmlns:am3d="http://schemas.microsoft.com/office/drawing/2017/model3d" xmlns:o="urn:schemas-microsoft-com:office:office" xmlns:oel="http://schemas.microsoft.com/office/2019/extlst" xmlns:r="http://schemas.openxmlformats.org/officeDocument/2006/relationships" xmlns:m="http://schemas.openxmlformats.org/officeDocument/2006/math" xmlns:v="urn:schemas-microsoft-com:vml" xmlns:wp14="http://schemas.microsoft.com/office/word/2010/wordprocessingDrawing" xmlns:wp="http://schemas.openxmlformats.org/drawingml/2006/wordprocessingDrawing" xmlns:w10="urn:schemas-microsoft-com:office:word" xmlns:w="http://schemas.openxmlformats.org/wordprocessingml/2006/main" xmlns:w14="http://schemas.microsoft.com/office/word/2010/wordml" xmlns:w15="http://schemas.microsoft.com/office/word/2012/wordml" xmlns:w16cex="http://schemas.microsoft.com/office/word/2018/wordml/cex" xmlns:w16cid="http://schemas.microsoft.com/office/word/2016/wordml/cid" xmlns:w16="http://schemas.microsoft.com/office/word/2018/wordml" xmlns:w16du="http://schemas.microsoft.com/office/word/2023/wordml/word16du" xmlns:w16sdtdh="http://schemas.microsoft.com/office/word/2020/wordml/sdtdatahash" xmlns:w16sdtfl="http://schemas.microsoft.com/office/word/2024/wordml/sdtformatlock" xmlns:w16se="http://schemas.microsoft.com/office/word/2015/wordml/symex" xmlns:wpg="http://schemas.microsoft.com/office/word/2010/wordprocessingGroup" xmlns:wpi="http://schemas.microsoft.com/office/word/2010/wordprocessingInk" xmlns:wne="http://schemas.microsoft.com/office/word/2006/wordml" xmlns:wps="http://schemas.microsoft.com/office/word/2010/wordprocessingShape" mc:Ignorable="w14 w15 w16se w16cid w16 w16cex w16sdtdh w16sdtfl w16du wp14">
+  <w:footnote w:type="separator" w:id="-1">
+    <w:p>
+      <w:pPr>
+        <w:spacing w:after="0" w:line="240" w:lineRule="auto"/>
+      </w:pPr>
+      <w:r>
+        <w:separator/>
+      </w:r>
+    </w:p>
+  </w:footnote>
+  <w:footnote w:type="continuationSeparator" w:id="0">
+    <w:p>
+      <w:pPr>
+        <w:spacing w:after="0" w:line="240" w:lineRule="auto"/>
+      </w:pPr>
+      <w:r>
+        <w:continuationSeparator/>
+      </w:r>
+    </w:p>
+  </w:footnote>
+</w:footnotes>
 </file>
 
 <file path=word/styles.xml><?xml version="1.0" encoding="utf-8"?>
@@ -2974,6 +3239,50 @@
       <w:szCs w:val="20"/>
     </w:rPr>
   </w:style>
+  <w:style w:type="paragraph" w:styleId="Header">
+    <w:name w:val="header"/>
+    <w:basedOn w:val="Normal"/>
+    <w:link w:val="HeaderChar"/>
+    <w:uiPriority w:val="99"/>
+    <w:unhideWhenUsed/>
+    <w:rsid w:val="00C3069F"/>
+    <w:pPr>
+      <w:tabs>
+        <w:tab w:val="center" w:pos="4680"/>
+        <w:tab w:val="right" w:pos="9360"/>
+      </w:tabs>
+      <w:spacing w:after="0" w:line="240" w:lineRule="auto"/>
+    </w:pPr>
+  </w:style>
+  <w:style w:type="character" w:customStyle="1" w:styleId="HeaderChar">
+    <w:name w:val="Header Char"/>
+    <w:basedOn w:val="DefaultParagraphFont"/>
+    <w:link w:val="Header"/>
+    <w:uiPriority w:val="99"/>
+    <w:rsid w:val="00C3069F"/>
+  </w:style>
+  <w:style w:type="paragraph" w:styleId="Footer">
+    <w:name w:val="footer"/>
+    <w:basedOn w:val="Normal"/>
+    <w:link w:val="FooterChar"/>
+    <w:uiPriority w:val="99"/>
+    <w:unhideWhenUsed/>
+    <w:rsid w:val="00C3069F"/>
+    <w:pPr>
+      <w:tabs>
+        <w:tab w:val="center" w:pos="4680"/>
+        <w:tab w:val="right" w:pos="9360"/>
+      </w:tabs>
+      <w:spacing w:after="0" w:line="240" w:lineRule="auto"/>
+    </w:pPr>
+  </w:style>
+  <w:style w:type="character" w:customStyle="1" w:styleId="FooterChar">
+    <w:name w:val="Footer Char"/>
+    <w:basedOn w:val="DefaultParagraphFont"/>
+    <w:link w:val="Footer"/>
+    <w:uiPriority w:val="99"/>
+    <w:rsid w:val="00C3069F"/>
+  </w:style>
 </w:styles>
 </file>
 

</xml_diff>

<commit_message>
last commit before auth Rest apis
</commit_message>
<xml_diff>
--- a/System analysis.docx
+++ b/System analysis.docx
@@ -236,7 +236,27 @@
           <w:color w:val="000000" w:themeColor="text1"/>
           <w:lang w:bidi="ar-EG"/>
         </w:rPr>
-        <w:t>5-Get All services  6-reserve a service</w:t>
+        <w:t xml:space="preserve">5-Get All </w:t>
+      </w:r>
+      <w:proofErr w:type="gramStart"/>
+      <w:r>
+        <w:rPr>
+          <w:b/>
+          <w:bCs/>
+          <w:color w:val="000000" w:themeColor="text1"/>
+          <w:lang w:bidi="ar-EG"/>
+        </w:rPr>
+        <w:t>services  6</w:t>
+      </w:r>
+      <w:proofErr w:type="gramEnd"/>
+      <w:r>
+        <w:rPr>
+          <w:b/>
+          <w:bCs/>
+          <w:color w:val="000000" w:themeColor="text1"/>
+          <w:lang w:bidi="ar-EG"/>
+        </w:rPr>
+        <w:t>-reserve a service</w:t>
       </w:r>
     </w:p>
     <w:p>
@@ -415,8 +435,9 @@
           <w:color w:val="00B050"/>
           <w:lang w:bidi="ar-EG"/>
         </w:rPr>
-        <w:t xml:space="preserve">update my account </w:t>
-      </w:r>
+        <w:t xml:space="preserve">update my </w:t>
+      </w:r>
+      <w:proofErr w:type="gramStart"/>
       <w:r>
         <w:rPr>
           <w:b/>
@@ -424,6 +445,15 @@
           <w:color w:val="00B050"/>
           <w:lang w:bidi="ar-EG"/>
         </w:rPr>
+        <w:t xml:space="preserve">account </w:t>
+      </w:r>
+      <w:r>
+        <w:rPr>
+          <w:b/>
+          <w:bCs/>
+          <w:color w:val="00B050"/>
+          <w:lang w:bidi="ar-EG"/>
+        </w:rPr>
         <w:t xml:space="preserve"> </w:t>
       </w:r>
       <w:r>
@@ -433,7 +463,17 @@
           <w:color w:val="000000" w:themeColor="text1"/>
           <w:lang w:bidi="ar-EG"/>
         </w:rPr>
-        <w:t>5-Cancel Reservation</w:t>
+        <w:t>5</w:t>
+      </w:r>
+      <w:proofErr w:type="gramEnd"/>
+      <w:r>
+        <w:rPr>
+          <w:b/>
+          <w:bCs/>
+          <w:color w:val="000000" w:themeColor="text1"/>
+          <w:lang w:bidi="ar-EG"/>
+        </w:rPr>
+        <w:t>-Cancel Reservation</w:t>
       </w:r>
     </w:p>
     <w:p>
@@ -639,6 +679,7 @@
         </w:rPr>
         <w:t xml:space="preserve">-get all </w:t>
       </w:r>
+      <w:proofErr w:type="gramStart"/>
       <w:r>
         <w:rPr>
           <w:b/>
@@ -655,7 +696,18 @@
           <w:color w:val="000000" w:themeColor="text1"/>
           <w:lang w:bidi="ar-EG"/>
         </w:rPr>
-        <w:t xml:space="preserve">  -getSlot</w:t>
+        <w:t xml:space="preserve">  -</w:t>
+      </w:r>
+      <w:proofErr w:type="spellStart"/>
+      <w:proofErr w:type="gramEnd"/>
+      <w:r>
+        <w:rPr>
+          <w:b/>
+          <w:bCs/>
+          <w:color w:val="000000" w:themeColor="text1"/>
+          <w:lang w:bidi="ar-EG"/>
+        </w:rPr>
+        <w:t>getSlot</w:t>
       </w:r>
       <w:r>
         <w:rPr>
@@ -666,6 +718,7 @@
         </w:rPr>
         <w:t>Prescription</w:t>
       </w:r>
+      <w:proofErr w:type="spellEnd"/>
     </w:p>
     <w:p>
       <w:pPr>
@@ -688,6 +741,7 @@
         </w:rPr>
         <w:t>-</w:t>
       </w:r>
+      <w:proofErr w:type="spellStart"/>
       <w:r>
         <w:rPr>
           <w:b/>
@@ -697,6 +751,7 @@
         </w:rPr>
         <w:t>getPatientPrescriptions</w:t>
       </w:r>
+      <w:proofErr w:type="spellEnd"/>
       <w:r>
         <w:rPr>
           <w:b/>
@@ -706,6 +761,7 @@
         </w:rPr>
         <w:t xml:space="preserve">     - </w:t>
       </w:r>
+      <w:proofErr w:type="spellStart"/>
       <w:r>
         <w:rPr>
           <w:b/>
@@ -715,6 +771,7 @@
         </w:rPr>
         <w:t>getDoctorPrescriptions</w:t>
       </w:r>
+      <w:proofErr w:type="spellEnd"/>
       <w:r>
         <w:rPr>
           <w:b/>
@@ -724,6 +781,7 @@
         </w:rPr>
         <w:t xml:space="preserve">    -</w:t>
       </w:r>
+      <w:proofErr w:type="spellStart"/>
       <w:r>
         <w:rPr>
           <w:b/>
@@ -742,6 +800,7 @@
         </w:rPr>
         <w:t>Prescription</w:t>
       </w:r>
+      <w:proofErr w:type="spellEnd"/>
       <w:r>
         <w:rPr>
           <w:b/>
@@ -790,7 +849,27 @@
           <w:color w:val="000000" w:themeColor="text1"/>
           <w:lang w:bidi="ar-EG"/>
         </w:rPr>
-        <w:t xml:space="preserve">    -forget password    -updatePassword </w:t>
+        <w:t xml:space="preserve">    -forget password    -</w:t>
+      </w:r>
+      <w:proofErr w:type="spellStart"/>
+      <w:r>
+        <w:rPr>
+          <w:b/>
+          <w:bCs/>
+          <w:color w:val="000000" w:themeColor="text1"/>
+          <w:lang w:bidi="ar-EG"/>
+        </w:rPr>
+        <w:t>updatePassword</w:t>
+      </w:r>
+      <w:proofErr w:type="spellEnd"/>
+      <w:r>
+        <w:rPr>
+          <w:b/>
+          <w:bCs/>
+          <w:color w:val="000000" w:themeColor="text1"/>
+          <w:lang w:bidi="ar-EG"/>
+        </w:rPr>
+        <w:t xml:space="preserve"> </w:t>
       </w:r>
     </w:p>
     <w:p>
@@ -948,7 +1027,17 @@
           <w:bCs/>
           <w:lang w:bidi="ar-EG"/>
         </w:rPr>
-        <w:t xml:space="preserve"> -getDoctor</w:t>
+        <w:t xml:space="preserve"> -</w:t>
+      </w:r>
+      <w:proofErr w:type="spellStart"/>
+      <w:proofErr w:type="gramStart"/>
+      <w:r>
+        <w:rPr>
+          <w:b/>
+          <w:bCs/>
+          <w:lang w:bidi="ar-EG"/>
+        </w:rPr>
+        <w:t>getDoctor</w:t>
       </w:r>
       <w:r>
         <w:rPr>
@@ -958,6 +1047,7 @@
         </w:rPr>
         <w:t>Details</w:t>
       </w:r>
+      <w:proofErr w:type="spellEnd"/>
       <w:r>
         <w:rPr>
           <w:b/>
@@ -972,7 +1062,16 @@
           <w:bCs/>
           <w:lang w:bidi="ar-EG"/>
         </w:rPr>
-        <w:t xml:space="preserve"> -delete Doctor</w:t>
+        <w:t xml:space="preserve"> -</w:t>
+      </w:r>
+      <w:proofErr w:type="gramEnd"/>
+      <w:r>
+        <w:rPr>
+          <w:b/>
+          <w:bCs/>
+          <w:lang w:bidi="ar-EG"/>
+        </w:rPr>
+        <w:t>delete Doctor</w:t>
       </w:r>
       <w:r>
         <w:rPr>
@@ -988,29 +1087,39 @@
           <w:bCs/>
           <w:lang w:bidi="ar-EG"/>
         </w:rPr>
-        <w:t>-getAllDoctors</w:t>
-      </w:r>
-    </w:p>
-    <w:p>
-      <w:pPr>
-        <w:bidi/>
-        <w:jc w:val="right"/>
-        <w:rPr>
-          <w:b/>
-          <w:bCs/>
-          <w:color w:val="000000" w:themeColor="text1"/>
-          <w:lang w:bidi="ar-EG"/>
-        </w:rPr>
-      </w:pPr>
-      <w:r>
-        <w:rPr>
-          <w:b/>
-          <w:bCs/>
-          <w:color w:val="000000" w:themeColor="text1"/>
-          <w:lang w:bidi="ar-EG"/>
-        </w:rPr>
         <w:t>-</w:t>
       </w:r>
+      <w:proofErr w:type="spellStart"/>
+      <w:r>
+        <w:rPr>
+          <w:b/>
+          <w:bCs/>
+          <w:lang w:bidi="ar-EG"/>
+        </w:rPr>
+        <w:t>getAllDoctors</w:t>
+      </w:r>
+      <w:proofErr w:type="spellEnd"/>
+    </w:p>
+    <w:p>
+      <w:pPr>
+        <w:bidi/>
+        <w:jc w:val="right"/>
+        <w:rPr>
+          <w:b/>
+          <w:bCs/>
+          <w:color w:val="000000" w:themeColor="text1"/>
+          <w:lang w:bidi="ar-EG"/>
+        </w:rPr>
+      </w:pPr>
+      <w:r>
+        <w:rPr>
+          <w:b/>
+          <w:bCs/>
+          <w:color w:val="000000" w:themeColor="text1"/>
+          <w:lang w:bidi="ar-EG"/>
+        </w:rPr>
+        <w:t>-</w:t>
+      </w:r>
       <w:r>
         <w:rPr>
           <w:b/>
@@ -1176,7 +1285,27 @@
           <w:lang w:bidi="ar-EG"/>
         </w:rPr>
         <w:lastRenderedPageBreak/>
-        <w:t xml:space="preserve">14-get All  services   </w:t>
+        <w:t xml:space="preserve">14-get </w:t>
+      </w:r>
+      <w:proofErr w:type="gramStart"/>
+      <w:r>
+        <w:rPr>
+          <w:b/>
+          <w:bCs/>
+          <w:color w:val="000000" w:themeColor="text1"/>
+          <w:lang w:bidi="ar-EG"/>
+        </w:rPr>
+        <w:t>All  services</w:t>
+      </w:r>
+      <w:proofErr w:type="gramEnd"/>
+      <w:r>
+        <w:rPr>
+          <w:b/>
+          <w:bCs/>
+          <w:color w:val="000000" w:themeColor="text1"/>
+          <w:lang w:bidi="ar-EG"/>
+        </w:rPr>
+        <w:t xml:space="preserve">   </w:t>
       </w:r>
       <w:r>
         <w:rPr>
@@ -1236,8 +1365,19 @@
           <w:color w:val="000000" w:themeColor="text1"/>
           <w:lang w:bidi="ar-EG"/>
         </w:rPr>
-        <w:t>-getsolt</w:t>
-      </w:r>
+        <w:t>-</w:t>
+      </w:r>
+      <w:proofErr w:type="spellStart"/>
+      <w:r>
+        <w:rPr>
+          <w:b/>
+          <w:bCs/>
+          <w:color w:val="000000" w:themeColor="text1"/>
+          <w:lang w:bidi="ar-EG"/>
+        </w:rPr>
+        <w:t>getsolt</w:t>
+      </w:r>
+      <w:proofErr w:type="spellEnd"/>
     </w:p>
     <w:p>
       <w:pPr>
@@ -1302,7 +1442,17 @@
           <w:color w:val="000000" w:themeColor="text1"/>
           <w:lang w:bidi="ar-EG"/>
         </w:rPr>
-        <w:t>(status)</w:t>
+        <w:t>(status</w:t>
+      </w:r>
+      <w:proofErr w:type="gramStart"/>
+      <w:r>
+        <w:rPr>
+          <w:b/>
+          <w:bCs/>
+          <w:color w:val="000000" w:themeColor="text1"/>
+          <w:lang w:bidi="ar-EG"/>
+        </w:rPr>
+        <w:t>)</w:t>
       </w:r>
       <w:r>
         <w:rPr>
@@ -1313,6 +1463,7 @@
         </w:rPr>
         <w:t>(</w:t>
       </w:r>
+      <w:proofErr w:type="gramEnd"/>
       <w:r>
         <w:rPr>
           <w:b/>
@@ -1468,6 +1619,7 @@
         </w:rPr>
         <w:pgNum/>
       </w:r>
+      <w:proofErr w:type="spellStart"/>
       <w:r>
         <w:rPr>
           <w:b/>
@@ -1477,6 +1629,7 @@
         </w:rPr>
         <w:t>atient</w:t>
       </w:r>
+      <w:proofErr w:type="spellEnd"/>
       <w:r>
         <w:rPr>
           <w:b/>
@@ -1535,34 +1688,105 @@
           <w:color w:val="000000" w:themeColor="text1"/>
           <w:lang w:bidi="ar-EG"/>
         </w:rPr>
-        <w:t>-dateOfBirth     -role</w:t>
-      </w:r>
-      <w:r>
-        <w:rPr>
-          <w:b/>
-          <w:bCs/>
-          <w:color w:val="000000" w:themeColor="text1"/>
-          <w:lang w:bidi="ar-EG"/>
-        </w:rPr>
-        <w:t>[enum]</w:t>
-      </w:r>
-      <w:r>
-        <w:rPr>
-          <w:b/>
-          <w:bCs/>
-          <w:color w:val="000000" w:themeColor="text1"/>
-          <w:lang w:bidi="ar-EG"/>
-        </w:rPr>
-        <w:t xml:space="preserve">     -gender</w:t>
-      </w:r>
-      <w:r>
-        <w:rPr>
-          <w:b/>
-          <w:bCs/>
-          <w:color w:val="000000" w:themeColor="text1"/>
-          <w:lang w:bidi="ar-EG"/>
-        </w:rPr>
-        <w:t>[enum]</w:t>
+        <w:t>-</w:t>
+      </w:r>
+      <w:proofErr w:type="spellStart"/>
+      <w:r>
+        <w:rPr>
+          <w:b/>
+          <w:bCs/>
+          <w:color w:val="000000" w:themeColor="text1"/>
+          <w:lang w:bidi="ar-EG"/>
+        </w:rPr>
+        <w:t>dateOfBirth</w:t>
+      </w:r>
+      <w:proofErr w:type="spellEnd"/>
+      <w:r>
+        <w:rPr>
+          <w:b/>
+          <w:bCs/>
+          <w:color w:val="000000" w:themeColor="text1"/>
+          <w:lang w:bidi="ar-EG"/>
+        </w:rPr>
+        <w:t xml:space="preserve">     -role</w:t>
+      </w:r>
+      <w:r>
+        <w:rPr>
+          <w:b/>
+          <w:bCs/>
+          <w:color w:val="000000" w:themeColor="text1"/>
+          <w:lang w:bidi="ar-EG"/>
+        </w:rPr>
+        <w:t>[</w:t>
+      </w:r>
+      <w:proofErr w:type="spellStart"/>
+      <w:proofErr w:type="gramStart"/>
+      <w:r>
+        <w:rPr>
+          <w:b/>
+          <w:bCs/>
+          <w:color w:val="000000" w:themeColor="text1"/>
+          <w:lang w:bidi="ar-EG"/>
+        </w:rPr>
+        <w:t>enum</w:t>
+      </w:r>
+      <w:proofErr w:type="spellEnd"/>
+      <w:r>
+        <w:rPr>
+          <w:b/>
+          <w:bCs/>
+          <w:color w:val="000000" w:themeColor="text1"/>
+          <w:lang w:bidi="ar-EG"/>
+        </w:rPr>
+        <w:t>]</w:t>
+      </w:r>
+      <w:r>
+        <w:rPr>
+          <w:b/>
+          <w:bCs/>
+          <w:color w:val="000000" w:themeColor="text1"/>
+          <w:lang w:bidi="ar-EG"/>
+        </w:rPr>
+        <w:t xml:space="preserve">   </w:t>
+      </w:r>
+      <w:proofErr w:type="gramEnd"/>
+      <w:r>
+        <w:rPr>
+          <w:b/>
+          <w:bCs/>
+          <w:color w:val="000000" w:themeColor="text1"/>
+          <w:lang w:bidi="ar-EG"/>
+        </w:rPr>
+        <w:t xml:space="preserve">  -gender</w:t>
+      </w:r>
+      <w:r>
+        <w:rPr>
+          <w:b/>
+          <w:bCs/>
+          <w:color w:val="000000" w:themeColor="text1"/>
+          <w:lang w:bidi="ar-EG"/>
+        </w:rPr>
+        <w:t>[</w:t>
+      </w:r>
+      <w:proofErr w:type="spellStart"/>
+      <w:r>
+        <w:rPr>
+          <w:b/>
+          <w:bCs/>
+          <w:color w:val="000000" w:themeColor="text1"/>
+          <w:lang w:bidi="ar-EG"/>
+        </w:rPr>
+        <w:t>enum</w:t>
+      </w:r>
+      <w:proofErr w:type="spellEnd"/>
+      <w:r>
+        <w:rPr>
+          <w:b/>
+          <w:bCs/>
+          <w:color w:val="000000" w:themeColor="text1"/>
+          <w:lang w:bidi="ar-EG"/>
+        </w:rPr>
+        <w:t>]</w:t>
       </w:r>
       <w:r>
         <w:rPr>
@@ -1592,7 +1816,27 @@
           <w:color w:val="000000" w:themeColor="text1"/>
           <w:lang w:bidi="ar-EG"/>
         </w:rPr>
-        <w:t>-phone     -isActive    -</w:t>
+        <w:t>-phone     -</w:t>
+      </w:r>
+      <w:proofErr w:type="spellStart"/>
+      <w:r>
+        <w:rPr>
+          <w:b/>
+          <w:bCs/>
+          <w:color w:val="000000" w:themeColor="text1"/>
+          <w:lang w:bidi="ar-EG"/>
+        </w:rPr>
+        <w:t>isActive</w:t>
+      </w:r>
+      <w:proofErr w:type="spellEnd"/>
+      <w:r>
+        <w:rPr>
+          <w:b/>
+          <w:bCs/>
+          <w:color w:val="000000" w:themeColor="text1"/>
+          <w:lang w:bidi="ar-EG"/>
+        </w:rPr>
+        <w:t xml:space="preserve">    -</w:t>
       </w:r>
     </w:p>
     <w:p>
@@ -1641,29 +1885,39 @@
           <w:bCs/>
           <w:lang w:bidi="ar-EG"/>
         </w:rPr>
-        <w:t>-userId</w:t>
-      </w:r>
-    </w:p>
-    <w:p>
-      <w:pPr>
-        <w:bidi/>
-        <w:jc w:val="right"/>
-        <w:rPr>
-          <w:b/>
-          <w:bCs/>
-          <w:color w:val="000000" w:themeColor="text1"/>
-          <w:lang w:bidi="ar-EG"/>
-        </w:rPr>
-      </w:pPr>
-      <w:r>
-        <w:rPr>
-          <w:b/>
-          <w:bCs/>
-          <w:color w:val="000000" w:themeColor="text1"/>
-          <w:lang w:bidi="ar-EG"/>
-        </w:rPr>
         <w:t>-</w:t>
       </w:r>
+      <w:proofErr w:type="spellStart"/>
+      <w:r>
+        <w:rPr>
+          <w:b/>
+          <w:bCs/>
+          <w:lang w:bidi="ar-EG"/>
+        </w:rPr>
+        <w:t>userId</w:t>
+      </w:r>
+      <w:proofErr w:type="spellEnd"/>
+    </w:p>
+    <w:p>
+      <w:pPr>
+        <w:bidi/>
+        <w:jc w:val="right"/>
+        <w:rPr>
+          <w:b/>
+          <w:bCs/>
+          <w:color w:val="000000" w:themeColor="text1"/>
+          <w:lang w:bidi="ar-EG"/>
+        </w:rPr>
+      </w:pPr>
+      <w:r>
+        <w:rPr>
+          <w:b/>
+          <w:bCs/>
+          <w:color w:val="000000" w:themeColor="text1"/>
+          <w:lang w:bidi="ar-EG"/>
+        </w:rPr>
+        <w:t>-</w:t>
+      </w:r>
       <w:r>
         <w:rPr>
           <w:b/>
@@ -1716,6 +1970,7 @@
           <w:lang w:bidi="ar-EG"/>
         </w:rPr>
       </w:pPr>
+      <w:proofErr w:type="spellStart"/>
       <w:r>
         <w:rPr>
           <w:b/>
@@ -1725,6 +1980,7 @@
         </w:rPr>
         <w:t>consultation_fee</w:t>
       </w:r>
+      <w:proofErr w:type="spellEnd"/>
       <w:r>
         <w:rPr>
           <w:rFonts w:hint="cs"/>
@@ -1797,41 +2053,9 @@
           <w:color w:val="7030A0"/>
           <w:lang w:bidi="ar-EG"/>
         </w:rPr>
-        <w:t>-service_booking:</w:t>
-      </w:r>
-    </w:p>
-    <w:p>
-      <w:pPr>
-        <w:bidi/>
-        <w:jc w:val="right"/>
-        <w:rPr>
-          <w:b/>
-          <w:bCs/>
-          <w:color w:val="000000" w:themeColor="text1"/>
-          <w:lang w:bidi="ar-EG"/>
-        </w:rPr>
-      </w:pPr>
-      <w:r>
-        <w:rPr>
-          <w:b/>
-          <w:bCs/>
-          <w:color w:val="000000" w:themeColor="text1"/>
-          <w:lang w:bidi="ar-EG"/>
-        </w:rPr>
-        <w:t xml:space="preserve">-p_id     -ser_id    -date      </w:t>
-      </w:r>
-    </w:p>
-    <w:p>
-      <w:pPr>
-        <w:bidi/>
-        <w:jc w:val="right"/>
-        <w:rPr>
-          <w:b/>
-          <w:bCs/>
-          <w:color w:val="000000" w:themeColor="text1"/>
-          <w:lang w:bidi="ar-EG"/>
-        </w:rPr>
-      </w:pPr>
+        <w:t>-</w:t>
+      </w:r>
+      <w:proofErr w:type="spellStart"/>
       <w:r>
         <w:rPr>
           <w:b/>
@@ -1839,6 +2063,98 @@
           <w:color w:val="7030A0"/>
           <w:lang w:bidi="ar-EG"/>
         </w:rPr>
+        <w:t>service_booking</w:t>
+      </w:r>
+      <w:proofErr w:type="spellEnd"/>
+      <w:r>
+        <w:rPr>
+          <w:b/>
+          <w:bCs/>
+          <w:color w:val="7030A0"/>
+          <w:lang w:bidi="ar-EG"/>
+        </w:rPr>
+        <w:t>:</w:t>
+      </w:r>
+    </w:p>
+    <w:p>
+      <w:pPr>
+        <w:bidi/>
+        <w:jc w:val="right"/>
+        <w:rPr>
+          <w:b/>
+          <w:bCs/>
+          <w:color w:val="000000" w:themeColor="text1"/>
+          <w:lang w:bidi="ar-EG"/>
+        </w:rPr>
+      </w:pPr>
+      <w:r>
+        <w:rPr>
+          <w:b/>
+          <w:bCs/>
+          <w:color w:val="000000" w:themeColor="text1"/>
+          <w:lang w:bidi="ar-EG"/>
+        </w:rPr>
+        <w:t>-</w:t>
+      </w:r>
+      <w:proofErr w:type="spellStart"/>
+      <w:r>
+        <w:rPr>
+          <w:b/>
+          <w:bCs/>
+          <w:color w:val="000000" w:themeColor="text1"/>
+          <w:lang w:bidi="ar-EG"/>
+        </w:rPr>
+        <w:t>p_id</w:t>
+      </w:r>
+      <w:proofErr w:type="spellEnd"/>
+      <w:r>
+        <w:rPr>
+          <w:b/>
+          <w:bCs/>
+          <w:color w:val="000000" w:themeColor="text1"/>
+          <w:lang w:bidi="ar-EG"/>
+        </w:rPr>
+        <w:t xml:space="preserve">     -</w:t>
+      </w:r>
+      <w:proofErr w:type="spellStart"/>
+      <w:r>
+        <w:rPr>
+          <w:b/>
+          <w:bCs/>
+          <w:color w:val="000000" w:themeColor="text1"/>
+          <w:lang w:bidi="ar-EG"/>
+        </w:rPr>
+        <w:t>ser_id</w:t>
+      </w:r>
+      <w:proofErr w:type="spellEnd"/>
+      <w:r>
+        <w:rPr>
+          <w:b/>
+          <w:bCs/>
+          <w:color w:val="000000" w:themeColor="text1"/>
+          <w:lang w:bidi="ar-EG"/>
+        </w:rPr>
+        <w:t xml:space="preserve">    -date      </w:t>
+      </w:r>
+    </w:p>
+    <w:p>
+      <w:pPr>
+        <w:bidi/>
+        <w:jc w:val="right"/>
+        <w:rPr>
+          <w:b/>
+          <w:bCs/>
+          <w:color w:val="000000" w:themeColor="text1"/>
+          <w:lang w:bidi="ar-EG"/>
+        </w:rPr>
+      </w:pPr>
+      <w:r>
+        <w:rPr>
+          <w:b/>
+          <w:bCs/>
+          <w:color w:val="7030A0"/>
+          <w:lang w:bidi="ar-EG"/>
+        </w:rPr>
         <w:t>4-slot</w:t>
       </w:r>
       <w:r>
@@ -1878,7 +2194,27 @@
           <w:color w:val="000000" w:themeColor="text1"/>
           <w:lang w:bidi="ar-EG"/>
         </w:rPr>
-        <w:t xml:space="preserve">-Dr_id   -date </w:t>
+        <w:t>-</w:t>
+      </w:r>
+      <w:proofErr w:type="spellStart"/>
+      <w:r>
+        <w:rPr>
+          <w:b/>
+          <w:bCs/>
+          <w:color w:val="000000" w:themeColor="text1"/>
+          <w:lang w:bidi="ar-EG"/>
+        </w:rPr>
+        <w:t>Dr_id</w:t>
+      </w:r>
+      <w:proofErr w:type="spellEnd"/>
+      <w:r>
+        <w:rPr>
+          <w:b/>
+          <w:bCs/>
+          <w:color w:val="000000" w:themeColor="text1"/>
+          <w:lang w:bidi="ar-EG"/>
+        </w:rPr>
+        <w:t xml:space="preserve">   -date </w:t>
       </w:r>
     </w:p>
     <w:p>
@@ -1900,29 +2236,81 @@
           <w:color w:val="000000" w:themeColor="text1"/>
           <w:lang w:bidi="ar-EG"/>
         </w:rPr>
-        <w:t xml:space="preserve"> -start_time   -end_time </w:t>
-      </w:r>
-    </w:p>
-    <w:p>
-      <w:pPr>
-        <w:bidi/>
-        <w:jc w:val="right"/>
-        <w:rPr>
-          <w:b/>
-          <w:bCs/>
-          <w:color w:val="000000" w:themeColor="text1"/>
-          <w:lang w:bidi="ar-EG"/>
-        </w:rPr>
-      </w:pPr>
-      <w:r>
-        <w:rPr>
-          <w:b/>
-          <w:bCs/>
-          <w:color w:val="000000" w:themeColor="text1"/>
-          <w:lang w:bidi="ar-EG"/>
-        </w:rPr>
-        <w:t xml:space="preserve"> -status  (</w:t>
-      </w:r>
+        <w:t xml:space="preserve"> -</w:t>
+      </w:r>
+      <w:proofErr w:type="spellStart"/>
+      <w:r>
+        <w:rPr>
+          <w:b/>
+          <w:bCs/>
+          <w:color w:val="000000" w:themeColor="text1"/>
+          <w:lang w:bidi="ar-EG"/>
+        </w:rPr>
+        <w:t>start_time</w:t>
+      </w:r>
+      <w:proofErr w:type="spellEnd"/>
+      <w:r>
+        <w:rPr>
+          <w:b/>
+          <w:bCs/>
+          <w:color w:val="000000" w:themeColor="text1"/>
+          <w:lang w:bidi="ar-EG"/>
+        </w:rPr>
+        <w:t xml:space="preserve">   -</w:t>
+      </w:r>
+      <w:proofErr w:type="spellStart"/>
+      <w:r>
+        <w:rPr>
+          <w:b/>
+          <w:bCs/>
+          <w:color w:val="000000" w:themeColor="text1"/>
+          <w:lang w:bidi="ar-EG"/>
+        </w:rPr>
+        <w:t>end_time</w:t>
+      </w:r>
+      <w:proofErr w:type="spellEnd"/>
+      <w:r>
+        <w:rPr>
+          <w:b/>
+          <w:bCs/>
+          <w:color w:val="000000" w:themeColor="text1"/>
+          <w:lang w:bidi="ar-EG"/>
+        </w:rPr>
+        <w:t xml:space="preserve"> </w:t>
+      </w:r>
+    </w:p>
+    <w:p>
+      <w:pPr>
+        <w:bidi/>
+        <w:jc w:val="right"/>
+        <w:rPr>
+          <w:b/>
+          <w:bCs/>
+          <w:color w:val="000000" w:themeColor="text1"/>
+          <w:lang w:bidi="ar-EG"/>
+        </w:rPr>
+      </w:pPr>
+      <w:r>
+        <w:rPr>
+          <w:b/>
+          <w:bCs/>
+          <w:color w:val="000000" w:themeColor="text1"/>
+          <w:lang w:bidi="ar-EG"/>
+        </w:rPr>
+        <w:t xml:space="preserve"> -</w:t>
+      </w:r>
+      <w:proofErr w:type="gramStart"/>
+      <w:r>
+        <w:rPr>
+          <w:b/>
+          <w:bCs/>
+          <w:color w:val="000000" w:themeColor="text1"/>
+          <w:lang w:bidi="ar-EG"/>
+        </w:rPr>
+        <w:t>status  (</w:t>
+      </w:r>
+      <w:proofErr w:type="spellStart"/>
+      <w:proofErr w:type="gramEnd"/>
       <w:r>
         <w:rPr>
           <w:b/>
@@ -1950,6 +2338,7 @@
         </w:rPr>
         <w:t>CANCELLED</w:t>
       </w:r>
+      <w:proofErr w:type="spellEnd"/>
       <w:r>
         <w:rPr>
           <w:b/>
@@ -1980,7 +2369,17 @@
         </w:rPr>
         <w:lastRenderedPageBreak/>
         <w:tab/>
-        <w:t xml:space="preserve"> -numOf</w:t>
+        <w:t xml:space="preserve"> -</w:t>
+      </w:r>
+      <w:proofErr w:type="spellStart"/>
+      <w:r>
+        <w:rPr>
+          <w:b/>
+          <w:bCs/>
+          <w:color w:val="000000" w:themeColor="text1"/>
+          <w:lang w:bidi="ar-EG"/>
+        </w:rPr>
+        <w:t>numOf</w:t>
       </w:r>
       <w:r>
         <w:rPr>
@@ -1991,6 +2390,7 @@
         </w:rPr>
         <w:t>Patient</w:t>
       </w:r>
+      <w:proofErr w:type="spellEnd"/>
     </w:p>
     <w:p>
       <w:pPr>
@@ -2031,17 +2431,48 @@
           <w:color w:val="000000" w:themeColor="text1"/>
           <w:lang w:bidi="ar-EG"/>
         </w:rPr>
-        <w:t xml:space="preserve">    -P_id   </w:t>
-      </w:r>
-      <w:r>
-        <w:rPr>
-          <w:b/>
-          <w:bCs/>
-          <w:color w:val="000000" w:themeColor="text1"/>
-          <w:lang w:bidi="ar-EG"/>
-        </w:rPr>
-        <w:t>-SlotId</w:t>
-      </w:r>
+        <w:t xml:space="preserve">    -</w:t>
+      </w:r>
+      <w:proofErr w:type="spellStart"/>
+      <w:r>
+        <w:rPr>
+          <w:b/>
+          <w:bCs/>
+          <w:color w:val="000000" w:themeColor="text1"/>
+          <w:lang w:bidi="ar-EG"/>
+        </w:rPr>
+        <w:t>P_id</w:t>
+      </w:r>
+      <w:proofErr w:type="spellEnd"/>
+      <w:r>
+        <w:rPr>
+          <w:b/>
+          <w:bCs/>
+          <w:color w:val="000000" w:themeColor="text1"/>
+          <w:lang w:bidi="ar-EG"/>
+        </w:rPr>
+        <w:t xml:space="preserve">   </w:t>
+      </w:r>
+      <w:r>
+        <w:rPr>
+          <w:b/>
+          <w:bCs/>
+          <w:color w:val="000000" w:themeColor="text1"/>
+          <w:lang w:bidi="ar-EG"/>
+        </w:rPr>
+        <w:t>-</w:t>
+      </w:r>
+      <w:proofErr w:type="spellStart"/>
+      <w:r>
+        <w:rPr>
+          <w:b/>
+          <w:bCs/>
+          <w:color w:val="000000" w:themeColor="text1"/>
+          <w:lang w:bidi="ar-EG"/>
+        </w:rPr>
+        <w:t>SlotId</w:t>
+      </w:r>
+      <w:proofErr w:type="spellEnd"/>
     </w:p>
     <w:p>
       <w:pPr>
@@ -2157,28 +2588,79 @@
           <w:color w:val="000000" w:themeColor="text1"/>
           <w:lang w:bidi="ar-EG"/>
         </w:rPr>
-        <w:t>-P_id     -app_id</w:t>
-      </w:r>
-    </w:p>
-    <w:p>
-      <w:pPr>
-        <w:bidi/>
-        <w:jc w:val="right"/>
-        <w:rPr>
-          <w:b/>
-          <w:bCs/>
-          <w:color w:val="000000" w:themeColor="text1"/>
-          <w:lang w:bidi="ar-EG"/>
-        </w:rPr>
-      </w:pPr>
-      <w:r>
-        <w:rPr>
-          <w:b/>
-          <w:bCs/>
-          <w:color w:val="000000" w:themeColor="text1"/>
-          <w:lang w:bidi="ar-EG"/>
-        </w:rPr>
-        <w:t>-services[]</w:t>
+        <w:t>-</w:t>
+      </w:r>
+      <w:proofErr w:type="spellStart"/>
+      <w:r>
+        <w:rPr>
+          <w:b/>
+          <w:bCs/>
+          <w:color w:val="000000" w:themeColor="text1"/>
+          <w:lang w:bidi="ar-EG"/>
+        </w:rPr>
+        <w:t>P_id</w:t>
+      </w:r>
+      <w:proofErr w:type="spellEnd"/>
+      <w:r>
+        <w:rPr>
+          <w:b/>
+          <w:bCs/>
+          <w:color w:val="000000" w:themeColor="text1"/>
+          <w:lang w:bidi="ar-EG"/>
+        </w:rPr>
+        <w:t xml:space="preserve">     -</w:t>
+      </w:r>
+      <w:proofErr w:type="spellStart"/>
+      <w:r>
+        <w:rPr>
+          <w:b/>
+          <w:bCs/>
+          <w:color w:val="000000" w:themeColor="text1"/>
+          <w:lang w:bidi="ar-EG"/>
+        </w:rPr>
+        <w:t>app_id</w:t>
+      </w:r>
+      <w:proofErr w:type="spellEnd"/>
+    </w:p>
+    <w:p>
+      <w:pPr>
+        <w:bidi/>
+        <w:jc w:val="right"/>
+        <w:rPr>
+          <w:b/>
+          <w:bCs/>
+          <w:color w:val="000000" w:themeColor="text1"/>
+          <w:lang w:bidi="ar-EG"/>
+        </w:rPr>
+      </w:pPr>
+      <w:r>
+        <w:rPr>
+          <w:b/>
+          <w:bCs/>
+          <w:color w:val="000000" w:themeColor="text1"/>
+          <w:lang w:bidi="ar-EG"/>
+        </w:rPr>
+        <w:t>-</w:t>
+      </w:r>
+      <w:proofErr w:type="gramStart"/>
+      <w:r>
+        <w:rPr>
+          <w:b/>
+          <w:bCs/>
+          <w:color w:val="000000" w:themeColor="text1"/>
+          <w:lang w:bidi="ar-EG"/>
+        </w:rPr>
+        <w:t>services[</w:t>
+      </w:r>
+      <w:proofErr w:type="gramEnd"/>
+      <w:r>
+        <w:rPr>
+          <w:b/>
+          <w:bCs/>
+          <w:color w:val="000000" w:themeColor="text1"/>
+          <w:lang w:bidi="ar-EG"/>
+        </w:rPr>
+        <w:t>]</w:t>
       </w:r>
       <w:r>
         <w:rPr>
@@ -2202,23 +2684,38 @@
           <w:lang w:bidi="ar-EG"/>
         </w:rPr>
       </w:pPr>
+      <w:r>
+        <w:rPr>
+          <w:b/>
+          <w:bCs/>
+          <w:color w:val="000000" w:themeColor="text1"/>
+          <w:lang w:bidi="ar-EG"/>
+        </w:rPr>
+        <w:t>---------------------------------------------------------------------------------------------------------------------------</w:t>
+      </w:r>
     </w:p>
     <w:p>
       <w:pPr>
         <w:tabs>
           <w:tab w:val="left" w:pos="7313"/>
         </w:tabs>
-        <w:bidi/>
-        <w:rPr>
-          <w:lang w:bidi="ar-EG"/>
-        </w:rPr>
-      </w:pPr>
-      <w:r>
-        <w:rPr>
+        <w:rPr>
+          <w:lang w:bidi="ar-EG"/>
+        </w:rPr>
+      </w:pPr>
+      <w:r>
+        <w:rPr>
+          <w:rFonts w:cs="Arial"/>
           <w:rtl/>
           <w:lang w:bidi="ar-EG"/>
         </w:rPr>
-        <w:tab/>
+        <w:t>1</w:t>
+      </w:r>
+      <w:r>
+        <w:rPr>
+          <w:lang w:bidi="ar-EG"/>
+        </w:rPr>
+        <w:t>. Authentication &amp; Authorization</w:t>
       </w:r>
     </w:p>
     <w:p>
@@ -2226,8 +2723,2811 @@
         <w:tabs>
           <w:tab w:val="left" w:pos="7313"/>
         </w:tabs>
-        <w:bidi/>
-        <w:rPr>
+        <w:rPr>
+          <w:rtl/>
+          <w:lang w:bidi="ar-EG"/>
+        </w:rPr>
+      </w:pPr>
+      <w:r>
+        <w:rPr>
+          <w:lang w:bidi="ar-EG"/>
+        </w:rPr>
+        <w:t xml:space="preserve">        ↓</w:t>
+      </w:r>
+    </w:p>
+    <w:p>
+      <w:pPr>
+        <w:tabs>
+          <w:tab w:val="left" w:pos="7313"/>
+        </w:tabs>
+        <w:rPr>
+          <w:lang w:bidi="ar-EG"/>
+        </w:rPr>
+      </w:pPr>
+      <w:r>
+        <w:rPr>
+          <w:rFonts w:cs="Arial"/>
+          <w:rtl/>
+          <w:lang w:bidi="ar-EG"/>
+        </w:rPr>
+        <w:t>2</w:t>
+      </w:r>
+      <w:r>
+        <w:rPr>
+          <w:lang w:bidi="ar-EG"/>
+        </w:rPr>
+        <w:t>. Doctors</w:t>
+      </w:r>
+    </w:p>
+    <w:p>
+      <w:pPr>
+        <w:tabs>
+          <w:tab w:val="left" w:pos="7313"/>
+        </w:tabs>
+        <w:rPr>
+          <w:rtl/>
+          <w:lang w:bidi="ar-EG"/>
+        </w:rPr>
+      </w:pPr>
+      <w:r>
+        <w:rPr>
+          <w:lang w:bidi="ar-EG"/>
+        </w:rPr>
+        <w:t xml:space="preserve">        ↓</w:t>
+      </w:r>
+    </w:p>
+    <w:p>
+      <w:pPr>
+        <w:tabs>
+          <w:tab w:val="left" w:pos="7313"/>
+        </w:tabs>
+        <w:rPr>
+          <w:lang w:bidi="ar-EG"/>
+        </w:rPr>
+      </w:pPr>
+      <w:r>
+        <w:rPr>
+          <w:rFonts w:cs="Arial"/>
+          <w:rtl/>
+          <w:lang w:bidi="ar-EG"/>
+        </w:rPr>
+        <w:t>3</w:t>
+      </w:r>
+      <w:r>
+        <w:rPr>
+          <w:lang w:bidi="ar-EG"/>
+        </w:rPr>
+        <w:t>. Services</w:t>
+      </w:r>
+    </w:p>
+    <w:p>
+      <w:pPr>
+        <w:tabs>
+          <w:tab w:val="left" w:pos="7313"/>
+        </w:tabs>
+        <w:rPr>
+          <w:rtl/>
+          <w:lang w:bidi="ar-EG"/>
+        </w:rPr>
+      </w:pPr>
+      <w:r>
+        <w:rPr>
+          <w:lang w:bidi="ar-EG"/>
+        </w:rPr>
+        <w:t xml:space="preserve">        ↓</w:t>
+      </w:r>
+    </w:p>
+    <w:p>
+      <w:pPr>
+        <w:tabs>
+          <w:tab w:val="left" w:pos="7313"/>
+        </w:tabs>
+        <w:rPr>
+          <w:lang w:bidi="ar-EG"/>
+        </w:rPr>
+      </w:pPr>
+      <w:r>
+        <w:rPr>
+          <w:rFonts w:cs="Arial"/>
+          <w:rtl/>
+          <w:lang w:bidi="ar-EG"/>
+        </w:rPr>
+        <w:t>4</w:t>
+      </w:r>
+      <w:r>
+        <w:rPr>
+          <w:lang w:bidi="ar-EG"/>
+        </w:rPr>
+        <w:t>. Slots</w:t>
+      </w:r>
+    </w:p>
+    <w:p>
+      <w:pPr>
+        <w:tabs>
+          <w:tab w:val="left" w:pos="7313"/>
+        </w:tabs>
+        <w:rPr>
+          <w:rtl/>
+          <w:lang w:bidi="ar-EG"/>
+        </w:rPr>
+      </w:pPr>
+      <w:r>
+        <w:rPr>
+          <w:lang w:bidi="ar-EG"/>
+        </w:rPr>
+        <w:t xml:space="preserve">        ↓</w:t>
+      </w:r>
+    </w:p>
+    <w:p>
+      <w:pPr>
+        <w:tabs>
+          <w:tab w:val="left" w:pos="7313"/>
+        </w:tabs>
+        <w:rPr>
+          <w:lang w:bidi="ar-EG"/>
+        </w:rPr>
+      </w:pPr>
+      <w:r>
+        <w:rPr>
+          <w:rFonts w:cs="Arial"/>
+          <w:rtl/>
+          <w:lang w:bidi="ar-EG"/>
+        </w:rPr>
+        <w:t>5</w:t>
+      </w:r>
+      <w:r>
+        <w:rPr>
+          <w:lang w:bidi="ar-EG"/>
+        </w:rPr>
+        <w:t>. Appointments</w:t>
+      </w:r>
+    </w:p>
+    <w:p>
+      <w:pPr>
+        <w:tabs>
+          <w:tab w:val="left" w:pos="7313"/>
+        </w:tabs>
+        <w:rPr>
+          <w:rtl/>
+          <w:lang w:bidi="ar-EG"/>
+        </w:rPr>
+      </w:pPr>
+      <w:r>
+        <w:rPr>
+          <w:lang w:bidi="ar-EG"/>
+        </w:rPr>
+        <w:t xml:space="preserve">        ↓</w:t>
+      </w:r>
+    </w:p>
+    <w:p>
+      <w:pPr>
+        <w:tabs>
+          <w:tab w:val="left" w:pos="7313"/>
+        </w:tabs>
+        <w:rPr>
+          <w:lang w:bidi="ar-EG"/>
+        </w:rPr>
+      </w:pPr>
+      <w:r>
+        <w:rPr>
+          <w:rFonts w:cs="Arial"/>
+          <w:rtl/>
+          <w:lang w:bidi="ar-EG"/>
+        </w:rPr>
+        <w:t>6</w:t>
+      </w:r>
+      <w:r>
+        <w:rPr>
+          <w:lang w:bidi="ar-EG"/>
+        </w:rPr>
+        <w:t>. Prescriptions</w:t>
+      </w:r>
+    </w:p>
+    <w:p>
+      <w:pPr>
+        <w:tabs>
+          <w:tab w:val="left" w:pos="7313"/>
+        </w:tabs>
+        <w:rPr>
+          <w:rtl/>
+          <w:lang w:bidi="ar-EG"/>
+        </w:rPr>
+      </w:pPr>
+      <w:r>
+        <w:rPr>
+          <w:lang w:bidi="ar-EG"/>
+        </w:rPr>
+        <w:t xml:space="preserve">        ↓</w:t>
+      </w:r>
+    </w:p>
+    <w:p>
+      <w:pPr>
+        <w:tabs>
+          <w:tab w:val="left" w:pos="7313"/>
+        </w:tabs>
+        <w:rPr>
+          <w:lang w:bidi="ar-EG"/>
+        </w:rPr>
+      </w:pPr>
+      <w:r>
+        <w:rPr>
+          <w:rFonts w:cs="Arial"/>
+          <w:rtl/>
+          <w:lang w:bidi="ar-EG"/>
+        </w:rPr>
+        <w:t>7</w:t>
+      </w:r>
+      <w:r>
+        <w:rPr>
+          <w:lang w:bidi="ar-EG"/>
+        </w:rPr>
+        <w:t>. Medical Records</w:t>
+      </w:r>
+    </w:p>
+    <w:p>
+      <w:pPr>
+        <w:tabs>
+          <w:tab w:val="left" w:pos="7313"/>
+        </w:tabs>
+        <w:rPr>
+          <w:rtl/>
+          <w:lang w:bidi="ar-EG"/>
+        </w:rPr>
+      </w:pPr>
+      <w:r>
+        <w:rPr>
+          <w:lang w:bidi="ar-EG"/>
+        </w:rPr>
+        <w:t xml:space="preserve">        ↓</w:t>
+      </w:r>
+    </w:p>
+    <w:p>
+      <w:pPr>
+        <w:tabs>
+          <w:tab w:val="left" w:pos="7313"/>
+        </w:tabs>
+        <w:rPr>
+          <w:lang w:bidi="ar-EG"/>
+        </w:rPr>
+      </w:pPr>
+      <w:r>
+        <w:rPr>
+          <w:rFonts w:cs="Arial"/>
+          <w:rtl/>
+          <w:lang w:bidi="ar-EG"/>
+        </w:rPr>
+        <w:t>8</w:t>
+      </w:r>
+      <w:r>
+        <w:rPr>
+          <w:lang w:bidi="ar-EG"/>
+        </w:rPr>
+        <w:t>. Notifications</w:t>
+      </w:r>
+    </w:p>
+    <w:p>
+      <w:pPr>
+        <w:tabs>
+          <w:tab w:val="left" w:pos="7313"/>
+        </w:tabs>
+        <w:rPr>
+          <w:rtl/>
+          <w:lang w:bidi="ar-EG"/>
+        </w:rPr>
+      </w:pPr>
+      <w:r>
+        <w:rPr>
+          <w:lang w:bidi="ar-EG"/>
+        </w:rPr>
+        <w:t xml:space="preserve">        ↓</w:t>
+      </w:r>
+    </w:p>
+    <w:p>
+      <w:pPr>
+        <w:tabs>
+          <w:tab w:val="left" w:pos="7313"/>
+        </w:tabs>
+        <w:rPr>
+          <w:lang w:bidi="ar-EG"/>
+        </w:rPr>
+      </w:pPr>
+      <w:r>
+        <w:rPr>
+          <w:rFonts w:cs="Arial"/>
+          <w:rtl/>
+          <w:lang w:bidi="ar-EG"/>
+        </w:rPr>
+        <w:t>9</w:t>
+      </w:r>
+      <w:r>
+        <w:rPr>
+          <w:lang w:bidi="ar-EG"/>
+        </w:rPr>
+        <w:t>. Admin Management</w:t>
+      </w:r>
+    </w:p>
+    <w:p>
+      <w:pPr>
+        <w:tabs>
+          <w:tab w:val="left" w:pos="7313"/>
+        </w:tabs>
+        <w:rPr>
+          <w:rtl/>
+          <w:lang w:bidi="ar-EG"/>
+        </w:rPr>
+      </w:pPr>
+      <w:r>
+        <w:rPr>
+          <w:lang w:bidi="ar-EG"/>
+        </w:rPr>
+        <w:t xml:space="preserve">        ↓</w:t>
+      </w:r>
+    </w:p>
+    <w:p>
+      <w:pPr>
+        <w:tabs>
+          <w:tab w:val="left" w:pos="7313"/>
+        </w:tabs>
+        <w:rPr>
+          <w:lang w:bidi="ar-EG"/>
+        </w:rPr>
+      </w:pPr>
+      <w:r>
+        <w:rPr>
+          <w:rFonts w:cs="Arial"/>
+          <w:rtl/>
+          <w:lang w:bidi="ar-EG"/>
+        </w:rPr>
+        <w:t>10 .</w:t>
+      </w:r>
+      <w:r>
+        <w:rPr>
+          <w:lang w:bidi="ar-EG"/>
+        </w:rPr>
+        <w:t>Security + Testing + Documentation</w:t>
+      </w:r>
+    </w:p>
+    <w:p>
+      <w:pPr>
+        <w:spacing w:before="100" w:beforeAutospacing="1" w:after="100" w:afterAutospacing="1" w:line="240" w:lineRule="auto"/>
+        <w:outlineLvl w:val="2"/>
+        <w:rPr>
+          <w:rFonts w:ascii="Times New Roman" w:eastAsia="Times New Roman" w:hAnsi="Times New Roman" w:cs="Times New Roman"/>
+          <w:b/>
+          <w:bCs/>
+          <w:kern w:val="0"/>
+          <w:sz w:val="27"/>
+          <w:szCs w:val="27"/>
+          <w14:ligatures w14:val="none"/>
+        </w:rPr>
+      </w:pPr>
+      <w:r>
+        <w:rPr>
+          <w:rFonts w:ascii="Times New Roman" w:eastAsia="Times New Roman" w:hAnsi="Times New Roman" w:cs="Times New Roman"/>
+          <w:b/>
+          <w:bCs/>
+          <w:kern w:val="0"/>
+          <w:sz w:val="27"/>
+          <w:szCs w:val="27"/>
+          <w14:ligatures w14:val="none"/>
+        </w:rPr>
+        <w:lastRenderedPageBreak/>
+        <w:t>Forgot Password</w:t>
+      </w:r>
+    </w:p>
+    <w:p>
+      <w:pPr>
+        <w:spacing w:before="100" w:beforeAutospacing="1" w:after="100" w:afterAutospacing="1" w:line="240" w:lineRule="auto"/>
+        <w:outlineLvl w:val="2"/>
+        <w:rPr>
+          <w:rFonts w:ascii="Times New Roman" w:eastAsia="Times New Roman" w:hAnsi="Times New Roman" w:cs="Times New Roman"/>
+          <w:b/>
+          <w:bCs/>
+          <w:kern w:val="0"/>
+          <w:sz w:val="27"/>
+          <w:szCs w:val="27"/>
+          <w14:ligatures w14:val="none"/>
+        </w:rPr>
+      </w:pPr>
+      <w:r>
+        <w:rPr>
+          <w:rFonts w:ascii="Times New Roman" w:eastAsia="Times New Roman" w:hAnsi="Times New Roman" w:cs="Times New Roman"/>
+          <w:b/>
+          <w:bCs/>
+          <w:kern w:val="0"/>
+          <w:sz w:val="27"/>
+          <w:szCs w:val="27"/>
+          <w14:ligatures w14:val="none"/>
+        </w:rPr>
+        <w:t>Reset Password</w:t>
+      </w:r>
+    </w:p>
+    <w:p>
+      <w:pPr>
+        <w:spacing w:before="100" w:beforeAutospacing="1" w:after="100" w:afterAutospacing="1" w:line="240" w:lineRule="auto"/>
+        <w:outlineLvl w:val="2"/>
+        <w:rPr>
+          <w:rFonts w:ascii="Times New Roman" w:eastAsia="Times New Roman" w:hAnsi="Times New Roman" w:cs="Times New Roman"/>
+          <w:b/>
+          <w:bCs/>
+          <w:kern w:val="0"/>
+          <w:sz w:val="27"/>
+          <w:szCs w:val="27"/>
+          <w14:ligatures w14:val="none"/>
+        </w:rPr>
+      </w:pPr>
+      <w:r>
+        <w:rPr>
+          <w:rFonts w:ascii="Times New Roman" w:eastAsia="Times New Roman" w:hAnsi="Times New Roman" w:cs="Times New Roman"/>
+          <w:b/>
+          <w:bCs/>
+          <w:kern w:val="0"/>
+          <w:sz w:val="27"/>
+          <w:szCs w:val="27"/>
+          <w14:ligatures w14:val="none"/>
+        </w:rPr>
+        <w:t>Change Password</w:t>
+      </w:r>
+    </w:p>
+    <w:p>
+      <w:pPr>
+        <w:spacing w:before="100" w:beforeAutospacing="1" w:after="100" w:afterAutospacing="1" w:line="240" w:lineRule="auto"/>
+        <w:outlineLvl w:val="2"/>
+        <w:rPr>
+          <w:rFonts w:ascii="Times New Roman" w:eastAsia="Times New Roman" w:hAnsi="Times New Roman" w:cs="Times New Roman"/>
+          <w:b/>
+          <w:bCs/>
+          <w:kern w:val="0"/>
+          <w:sz w:val="27"/>
+          <w:szCs w:val="27"/>
+          <w14:ligatures w14:val="none"/>
+        </w:rPr>
+      </w:pPr>
+      <w:r>
+        <w:rPr>
+          <w:rFonts w:ascii="Times New Roman" w:eastAsia="Times New Roman" w:hAnsi="Times New Roman" w:cs="Times New Roman"/>
+          <w:b/>
+          <w:bCs/>
+          <w:kern w:val="0"/>
+          <w:sz w:val="27"/>
+          <w:szCs w:val="27"/>
+          <w14:ligatures w14:val="none"/>
+        </w:rPr>
+        <w:t>Email Verification</w:t>
+      </w:r>
+    </w:p>
+    <w:p>
+      <w:pPr>
+        <w:tabs>
+          <w:tab w:val="left" w:pos="7313"/>
+        </w:tabs>
+        <w:bidi/>
+        <w:spacing w:line="240" w:lineRule="auto"/>
+        <w:jc w:val="right"/>
+        <w:rPr>
+          <w:lang w:bidi="ar-EG"/>
+        </w:rPr>
+      </w:pPr>
+      <w:r>
+        <w:rPr>
+          <w:lang w:bidi="ar-EG"/>
+        </w:rPr>
+        <w:t>POST /auth/verify-email</w:t>
+      </w:r>
+    </w:p>
+    <w:p>
+      <w:pPr>
+        <w:tabs>
+          <w:tab w:val="left" w:pos="7313"/>
+        </w:tabs>
+        <w:bidi/>
+        <w:spacing w:line="240" w:lineRule="auto"/>
+        <w:jc w:val="right"/>
+        <w:rPr>
+          <w:lang w:bidi="ar-EG"/>
+        </w:rPr>
+      </w:pPr>
+      <w:r>
+        <w:rPr>
+          <w:lang w:bidi="ar-EG"/>
+        </w:rPr>
+        <w:t>POST /auth/resend-verification</w:t>
+      </w:r>
+    </w:p>
+    <w:p>
+      <w:pPr>
+        <w:tabs>
+          <w:tab w:val="left" w:pos="7313"/>
+        </w:tabs>
+        <w:bidi/>
+        <w:jc w:val="right"/>
+      </w:pPr>
+      <w:r>
+        <w:t>POST /auth/refresh</w:t>
+      </w:r>
+    </w:p>
+    <w:p>
+      <w:pPr>
+        <w:tabs>
+          <w:tab w:val="left" w:pos="7313"/>
+        </w:tabs>
+        <w:bidi/>
+        <w:jc w:val="right"/>
+      </w:pPr>
+      <w:r>
+        <w:t>POST /auth/logout</w:t>
+      </w:r>
+    </w:p>
+    <w:p>
+      <w:pPr>
+        <w:tabs>
+          <w:tab w:val="left" w:pos="7313"/>
+        </w:tabs>
+        <w:bidi/>
+        <w:spacing w:line="240" w:lineRule="auto"/>
+        <w:jc w:val="right"/>
+        <w:rPr>
+          <w:b/>
+          <w:bCs/>
+          <w:color w:val="EE0000"/>
+          <w:sz w:val="28"/>
+          <w:szCs w:val="28"/>
+        </w:rPr>
+      </w:pPr>
+      <w:r>
+        <w:rPr>
+          <w:b/>
+          <w:bCs/>
+          <w:color w:val="EE0000"/>
+          <w:sz w:val="28"/>
+          <w:szCs w:val="28"/>
+        </w:rPr>
+        <w:t>User</w:t>
+      </w:r>
+    </w:p>
+    <w:p>
+      <w:pPr>
+        <w:tabs>
+          <w:tab w:val="left" w:pos="7313"/>
+        </w:tabs>
+        <w:bidi/>
+        <w:spacing w:line="240" w:lineRule="auto"/>
+        <w:jc w:val="right"/>
+      </w:pPr>
+      <w:r>
+        <w:t xml:space="preserve">get profile </w:t>
+      </w:r>
+    </w:p>
+    <w:p>
+      <w:pPr>
+        <w:tabs>
+          <w:tab w:val="left" w:pos="7313"/>
+        </w:tabs>
+        <w:bidi/>
+        <w:spacing w:line="240" w:lineRule="auto"/>
+        <w:jc w:val="right"/>
+      </w:pPr>
+      <w:r>
+        <w:t xml:space="preserve">update profile </w:t>
+      </w:r>
+    </w:p>
+    <w:p>
+      <w:pPr>
+        <w:tabs>
+          <w:tab w:val="left" w:pos="7313"/>
+        </w:tabs>
+        <w:bidi/>
+        <w:spacing w:line="240" w:lineRule="auto"/>
+        <w:jc w:val="right"/>
+      </w:pPr>
+      <w:r>
+        <w:t>change password</w:t>
+      </w:r>
+    </w:p>
+    <w:p>
+      <w:pPr>
+        <w:tabs>
+          <w:tab w:val="left" w:pos="7313"/>
+        </w:tabs>
+        <w:bidi/>
+        <w:spacing w:line="240" w:lineRule="auto"/>
+        <w:jc w:val="right"/>
+      </w:pPr>
+      <w:r>
+        <w:t xml:space="preserve"> deactivate account</w:t>
+      </w:r>
+    </w:p>
+    <w:p>
+      <w:pPr>
+        <w:spacing w:before="100" w:beforeAutospacing="1" w:after="100" w:afterAutospacing="1" w:line="240" w:lineRule="auto"/>
+        <w:outlineLvl w:val="0"/>
+        <w:rPr>
+          <w:rFonts w:ascii="Times New Roman" w:eastAsia="Times New Roman" w:hAnsi="Times New Roman" w:cs="Times New Roman"/>
+          <w:b/>
+          <w:bCs/>
+          <w:kern w:val="36"/>
+          <w:sz w:val="48"/>
+          <w:szCs w:val="48"/>
+          <w14:ligatures w14:val="none"/>
+        </w:rPr>
+      </w:pPr>
+      <w:r>
+        <w:rPr>
+          <w:rFonts w:ascii="Times New Roman" w:eastAsia="Times New Roman" w:hAnsi="Times New Roman" w:cs="Times New Roman"/>
+          <w:b/>
+          <w:bCs/>
+          <w:kern w:val="36"/>
+          <w:sz w:val="48"/>
+          <w:szCs w:val="48"/>
+          <w14:ligatures w14:val="none"/>
+        </w:rPr>
+        <w:t>8. Medical Record</w:t>
+      </w:r>
+    </w:p>
+    <w:p>
+      <w:pPr>
+        <w:tabs>
+          <w:tab w:val="left" w:pos="916"/>
+          <w:tab w:val="left" w:pos="1832"/>
+          <w:tab w:val="left" w:pos="2748"/>
+          <w:tab w:val="left" w:pos="3664"/>
+          <w:tab w:val="left" w:pos="4580"/>
+          <w:tab w:val="left" w:pos="5496"/>
+          <w:tab w:val="left" w:pos="6412"/>
+          <w:tab w:val="left" w:pos="7328"/>
+          <w:tab w:val="left" w:pos="8244"/>
+          <w:tab w:val="left" w:pos="9160"/>
+          <w:tab w:val="left" w:pos="10076"/>
+          <w:tab w:val="left" w:pos="10992"/>
+          <w:tab w:val="left" w:pos="11908"/>
+          <w:tab w:val="left" w:pos="12824"/>
+          <w:tab w:val="left" w:pos="13740"/>
+          <w:tab w:val="left" w:pos="14656"/>
+        </w:tabs>
+        <w:spacing w:after="0" w:line="240" w:lineRule="auto"/>
+        <w:rPr>
+          <w:rFonts w:asciiTheme="minorBidi" w:eastAsia="Times New Roman" w:hAnsiTheme="minorBidi"/>
+          <w:kern w:val="0"/>
+          <w:sz w:val="20"/>
+          <w:szCs w:val="20"/>
+          <w14:ligatures w14:val="none"/>
+        </w:rPr>
+      </w:pPr>
+      <w:r>
+        <w:rPr>
+          <w:rFonts w:asciiTheme="minorBidi" w:eastAsia="Times New Roman" w:hAnsiTheme="minorBidi"/>
+          <w:kern w:val="0"/>
+          <w:sz w:val="20"/>
+          <w:szCs w:val="20"/>
+          <w14:ligatures w14:val="none"/>
+        </w:rPr>
+        <w:t>GET /patients/me/</w:t>
+      </w:r>
+      <w:proofErr w:type="gramStart"/>
+      <w:r>
+        <w:rPr>
+          <w:rFonts w:asciiTheme="minorBidi" w:eastAsia="Times New Roman" w:hAnsiTheme="minorBidi"/>
+          <w:kern w:val="0"/>
+          <w:sz w:val="20"/>
+          <w:szCs w:val="20"/>
+          <w14:ligatures w14:val="none"/>
+        </w:rPr>
+        <w:t>medical-history</w:t>
+      </w:r>
+      <w:proofErr w:type="gramEnd"/>
+    </w:p>
+    <w:p>
+      <w:pPr>
+        <w:pStyle w:val="pdq2pgselectionanchorcontainer"/>
+      </w:pPr>
+      <w:r>
+        <w:rPr>
+          <w:rtl/>
+        </w:rPr>
+        <w:t>وتجمع الـ</w:t>
+      </w:r>
+      <w:r>
+        <w:t xml:space="preserve"> completed appointments + prescriptions.</w:t>
+      </w:r>
+    </w:p>
+    <w:p>
+      <w:pPr>
+        <w:tabs>
+          <w:tab w:val="left" w:pos="7313"/>
+        </w:tabs>
+        <w:bidi/>
+        <w:spacing w:line="240" w:lineRule="auto"/>
+        <w:jc w:val="right"/>
+        <w:rPr>
+          <w:b/>
+          <w:bCs/>
+          <w:sz w:val="28"/>
+          <w:szCs w:val="28"/>
+        </w:rPr>
+      </w:pPr>
+      <w:r>
+        <w:rPr>
+          <w:b/>
+          <w:bCs/>
+          <w:sz w:val="28"/>
+          <w:szCs w:val="28"/>
+        </w:rPr>
+        <w:t>10. Service Booking</w:t>
+      </w:r>
+    </w:p>
+    <w:p>
+      <w:pPr>
+        <w:tabs>
+          <w:tab w:val="left" w:pos="7313"/>
+        </w:tabs>
+        <w:bidi/>
+        <w:spacing w:line="240" w:lineRule="auto"/>
+        <w:jc w:val="right"/>
+        <w:rPr>
+          <w:b/>
+          <w:bCs/>
+          <w:sz w:val="28"/>
+          <w:szCs w:val="28"/>
+          <w:rtl/>
+        </w:rPr>
+      </w:pPr>
+      <w:r>
+        <w:t>Patient</w:t>
+      </w:r>
+    </w:p>
+    <w:p>
+      <w:pPr>
+        <w:tabs>
+          <w:tab w:val="left" w:pos="7313"/>
+        </w:tabs>
+        <w:bidi/>
+        <w:spacing w:line="240" w:lineRule="auto"/>
+        <w:jc w:val="right"/>
+        <w:rPr>
+          <w:b/>
+          <w:bCs/>
+          <w:sz w:val="24"/>
+          <w:szCs w:val="24"/>
+          <w:lang w:bidi="ar-EG"/>
+        </w:rPr>
+      </w:pPr>
+      <w:proofErr w:type="spellStart"/>
+      <w:r>
+        <w:rPr>
+          <w:b/>
+          <w:bCs/>
+          <w:sz w:val="24"/>
+          <w:szCs w:val="24"/>
+          <w:lang w:bidi="ar-EG"/>
+        </w:rPr>
+        <w:t>bookService</w:t>
+      </w:r>
+      <w:proofErr w:type="spellEnd"/>
+    </w:p>
+    <w:p>
+      <w:pPr>
+        <w:tabs>
+          <w:tab w:val="left" w:pos="7313"/>
+        </w:tabs>
+        <w:bidi/>
+        <w:spacing w:line="240" w:lineRule="auto"/>
+        <w:jc w:val="right"/>
+        <w:rPr>
+          <w:b/>
+          <w:bCs/>
+          <w:sz w:val="24"/>
+          <w:szCs w:val="24"/>
+          <w:lang w:bidi="ar-EG"/>
+        </w:rPr>
+      </w:pPr>
+      <w:proofErr w:type="spellStart"/>
+      <w:r>
+        <w:rPr>
+          <w:b/>
+          <w:bCs/>
+          <w:sz w:val="24"/>
+          <w:szCs w:val="24"/>
+          <w:lang w:bidi="ar-EG"/>
+        </w:rPr>
+        <w:t>getMyServiceBookings</w:t>
+      </w:r>
+      <w:proofErr w:type="spellEnd"/>
+    </w:p>
+    <w:p>
+      <w:pPr>
+        <w:tabs>
+          <w:tab w:val="left" w:pos="7313"/>
+        </w:tabs>
+        <w:bidi/>
+        <w:spacing w:line="240" w:lineRule="auto"/>
+        <w:jc w:val="right"/>
+        <w:rPr>
+          <w:b/>
+          <w:bCs/>
+          <w:sz w:val="24"/>
+          <w:szCs w:val="24"/>
+          <w:lang w:bidi="ar-EG"/>
+        </w:rPr>
+      </w:pPr>
+      <w:proofErr w:type="spellStart"/>
+      <w:r>
+        <w:rPr>
+          <w:b/>
+          <w:bCs/>
+          <w:sz w:val="24"/>
+          <w:szCs w:val="24"/>
+          <w:lang w:bidi="ar-EG"/>
+        </w:rPr>
+        <w:t>cancelServiceBooking</w:t>
+      </w:r>
+      <w:proofErr w:type="spellEnd"/>
+    </w:p>
+    <w:p>
+      <w:pPr>
+        <w:tabs>
+          <w:tab w:val="left" w:pos="7313"/>
+        </w:tabs>
+        <w:bidi/>
+        <w:spacing w:line="240" w:lineRule="auto"/>
+        <w:jc w:val="right"/>
+      </w:pPr>
+      <w:r>
+        <w:t>Admin</w:t>
+      </w:r>
+    </w:p>
+    <w:p>
+      <w:pPr>
+        <w:tabs>
+          <w:tab w:val="left" w:pos="7313"/>
+        </w:tabs>
+        <w:bidi/>
+        <w:spacing w:line="240" w:lineRule="auto"/>
+        <w:jc w:val="right"/>
+        <w:rPr>
+          <w:b/>
+          <w:bCs/>
+          <w:sz w:val="24"/>
+          <w:szCs w:val="24"/>
+          <w:lang w:bidi="ar-EG"/>
+        </w:rPr>
+      </w:pPr>
+      <w:proofErr w:type="spellStart"/>
+      <w:r>
+        <w:rPr>
+          <w:b/>
+          <w:bCs/>
+          <w:sz w:val="24"/>
+          <w:szCs w:val="24"/>
+          <w:lang w:bidi="ar-EG"/>
+        </w:rPr>
+        <w:t>getAllServiceBookings</w:t>
+      </w:r>
+      <w:proofErr w:type="spellEnd"/>
+    </w:p>
+    <w:p>
+      <w:pPr>
+        <w:tabs>
+          <w:tab w:val="left" w:pos="7313"/>
+        </w:tabs>
+        <w:bidi/>
+        <w:spacing w:line="240" w:lineRule="auto"/>
+        <w:jc w:val="right"/>
+        <w:rPr>
+          <w:b/>
+          <w:bCs/>
+          <w:sz w:val="24"/>
+          <w:szCs w:val="24"/>
+          <w:lang w:bidi="ar-EG"/>
+        </w:rPr>
+      </w:pPr>
+      <w:r>
+        <w:rPr>
+          <w:b/>
+          <w:bCs/>
+          <w:sz w:val="24"/>
+          <w:szCs w:val="24"/>
+          <w:lang w:bidi="ar-EG"/>
+        </w:rPr>
+        <w:t xml:space="preserve"> </w:t>
+      </w:r>
+      <w:proofErr w:type="spellStart"/>
+      <w:r>
+        <w:rPr>
+          <w:b/>
+          <w:bCs/>
+          <w:sz w:val="24"/>
+          <w:szCs w:val="24"/>
+          <w:lang w:bidi="ar-EG"/>
+        </w:rPr>
+        <w:t>updateServiceBooking</w:t>
+      </w:r>
+      <w:proofErr w:type="spellEnd"/>
+    </w:p>
+    <w:p>
+      <w:pPr>
+        <w:tabs>
+          <w:tab w:val="left" w:pos="7313"/>
+        </w:tabs>
+        <w:bidi/>
+        <w:spacing w:line="240" w:lineRule="auto"/>
+        <w:jc w:val="right"/>
+        <w:rPr>
+          <w:b/>
+          <w:bCs/>
+          <w:sz w:val="24"/>
+          <w:szCs w:val="24"/>
+          <w:lang w:bidi="ar-EG"/>
+        </w:rPr>
+      </w:pPr>
+      <w:r>
+        <w:rPr>
+          <w:b/>
+          <w:bCs/>
+          <w:sz w:val="24"/>
+          <w:szCs w:val="24"/>
+          <w:lang w:bidi="ar-EG"/>
+        </w:rPr>
+        <w:t xml:space="preserve"> </w:t>
+      </w:r>
+      <w:proofErr w:type="spellStart"/>
+      <w:r>
+        <w:rPr>
+          <w:b/>
+          <w:bCs/>
+          <w:sz w:val="24"/>
+          <w:szCs w:val="24"/>
+          <w:lang w:bidi="ar-EG"/>
+        </w:rPr>
+        <w:t>deleteServiceBooking</w:t>
+      </w:r>
+      <w:proofErr w:type="spellEnd"/>
+    </w:p>
+    <w:p>
+      <w:pPr>
+        <w:tabs>
+          <w:tab w:val="left" w:pos="7313"/>
+        </w:tabs>
+        <w:bidi/>
+        <w:spacing w:line="240" w:lineRule="auto"/>
+        <w:jc w:val="right"/>
+        <w:rPr>
+          <w:b/>
+          <w:bCs/>
+          <w:sz w:val="24"/>
+          <w:szCs w:val="24"/>
+          <w:rtl/>
+          <w:lang w:bidi="ar-EG"/>
+        </w:rPr>
+      </w:pPr>
+    </w:p>
+    <w:p>
+      <w:pPr>
+        <w:tabs>
+          <w:tab w:val="left" w:pos="7313"/>
+        </w:tabs>
+        <w:bidi/>
+        <w:spacing w:line="240" w:lineRule="auto"/>
+        <w:jc w:val="right"/>
+        <w:rPr>
+          <w:b/>
+          <w:bCs/>
+          <w:sz w:val="24"/>
+          <w:szCs w:val="24"/>
+          <w:lang w:bidi="ar-EG"/>
+        </w:rPr>
+      </w:pPr>
+      <w:r>
+        <w:rPr>
+          <w:b/>
+          <w:bCs/>
+          <w:sz w:val="24"/>
+          <w:szCs w:val="24"/>
+          <w:lang w:bidi="ar-EG"/>
+        </w:rPr>
+        <w:lastRenderedPageBreak/>
+        <w:t>Admin Dashboard</w:t>
+      </w:r>
+    </w:p>
+    <w:p>
+      <w:pPr>
+        <w:tabs>
+          <w:tab w:val="left" w:pos="7313"/>
+        </w:tabs>
+        <w:bidi/>
+        <w:spacing w:line="240" w:lineRule="auto"/>
+        <w:jc w:val="right"/>
+        <w:rPr>
+          <w:b/>
+          <w:bCs/>
+          <w:sz w:val="24"/>
+          <w:szCs w:val="24"/>
+          <w:lang w:bidi="ar-EG"/>
+        </w:rPr>
+      </w:pPr>
+      <w:r>
+        <w:rPr>
+          <w:b/>
+          <w:bCs/>
+          <w:sz w:val="24"/>
+          <w:szCs w:val="24"/>
+          <w:rtl/>
+        </w:rPr>
+        <w:t>بعد الـ</w:t>
+      </w:r>
+      <w:r>
+        <w:rPr>
+          <w:b/>
+          <w:bCs/>
+          <w:sz w:val="24"/>
+          <w:szCs w:val="24"/>
+          <w:lang w:bidi="ar-EG"/>
+        </w:rPr>
+        <w:t xml:space="preserve"> backend core</w:t>
+      </w:r>
+      <w:r>
+        <w:rPr>
+          <w:b/>
+          <w:bCs/>
+          <w:sz w:val="24"/>
+          <w:szCs w:val="24"/>
+          <w:rtl/>
+        </w:rPr>
+        <w:t>، محتاج</w:t>
+      </w:r>
+      <w:r>
+        <w:rPr>
+          <w:b/>
+          <w:bCs/>
+          <w:sz w:val="24"/>
+          <w:szCs w:val="24"/>
+          <w:lang w:bidi="ar-EG"/>
+        </w:rPr>
+        <w:t xml:space="preserve"> endpoints </w:t>
+      </w:r>
+      <w:r>
+        <w:rPr>
+          <w:b/>
+          <w:bCs/>
+          <w:sz w:val="24"/>
+          <w:szCs w:val="24"/>
+          <w:rtl/>
+        </w:rPr>
+        <w:t>للـ</w:t>
+      </w:r>
+      <w:r>
+        <w:rPr>
+          <w:b/>
+          <w:bCs/>
+          <w:sz w:val="24"/>
+          <w:szCs w:val="24"/>
+          <w:lang w:bidi="ar-EG"/>
+        </w:rPr>
+        <w:t xml:space="preserve"> dashboard.</w:t>
+      </w:r>
+    </w:p>
+    <w:p>
+      <w:pPr>
+        <w:tabs>
+          <w:tab w:val="left" w:pos="7313"/>
+        </w:tabs>
+        <w:bidi/>
+        <w:spacing w:line="240" w:lineRule="auto"/>
+        <w:jc w:val="right"/>
+        <w:rPr>
+          <w:b/>
+          <w:bCs/>
+          <w:sz w:val="24"/>
+          <w:szCs w:val="24"/>
+          <w:lang w:bidi="ar-EG"/>
+        </w:rPr>
+      </w:pPr>
+      <w:r>
+        <w:rPr>
+          <w:b/>
+          <w:bCs/>
+          <w:sz w:val="24"/>
+          <w:szCs w:val="24"/>
+          <w:rtl/>
+        </w:rPr>
+        <w:t>مثلاً</w:t>
+      </w:r>
+      <w:r>
+        <w:rPr>
+          <w:b/>
+          <w:bCs/>
+          <w:sz w:val="24"/>
+          <w:szCs w:val="24"/>
+          <w:lang w:bidi="ar-EG"/>
+        </w:rPr>
+        <w:t>:</w:t>
+      </w:r>
+    </w:p>
+    <w:p>
+      <w:pPr>
+        <w:tabs>
+          <w:tab w:val="left" w:pos="7328"/>
+        </w:tabs>
+        <w:bidi/>
+        <w:spacing w:line="240" w:lineRule="auto"/>
+        <w:jc w:val="right"/>
+        <w:rPr>
+          <w:b/>
+          <w:bCs/>
+          <w:sz w:val="24"/>
+          <w:szCs w:val="24"/>
+          <w:lang w:bidi="ar-EG"/>
+        </w:rPr>
+      </w:pPr>
+      <w:r>
+        <w:rPr>
+          <w:b/>
+          <w:bCs/>
+          <w:sz w:val="24"/>
+          <w:szCs w:val="24"/>
+          <w:lang w:bidi="ar-EG"/>
+        </w:rPr>
+        <w:t>GET /admin/dashboard</w:t>
+      </w:r>
+    </w:p>
+    <w:p>
+      <w:pPr>
+        <w:tabs>
+          <w:tab w:val="left" w:pos="7313"/>
+        </w:tabs>
+        <w:bidi/>
+        <w:spacing w:line="240" w:lineRule="auto"/>
+        <w:jc w:val="right"/>
+        <w:rPr>
+          <w:b/>
+          <w:bCs/>
+          <w:sz w:val="24"/>
+          <w:szCs w:val="24"/>
+          <w:lang w:bidi="ar-EG"/>
+        </w:rPr>
+      </w:pPr>
+      <w:r>
+        <w:rPr>
+          <w:b/>
+          <w:bCs/>
+          <w:sz w:val="24"/>
+          <w:szCs w:val="24"/>
+          <w:rtl/>
+        </w:rPr>
+        <w:t>يرجع</w:t>
+      </w:r>
+      <w:r>
+        <w:rPr>
+          <w:b/>
+          <w:bCs/>
+          <w:sz w:val="24"/>
+          <w:szCs w:val="24"/>
+          <w:lang w:bidi="ar-EG"/>
+        </w:rPr>
+        <w:t>:</w:t>
+      </w:r>
+    </w:p>
+    <w:p>
+      <w:pPr>
+        <w:tabs>
+          <w:tab w:val="left" w:pos="7328"/>
+        </w:tabs>
+        <w:bidi/>
+        <w:spacing w:line="240" w:lineRule="auto"/>
+        <w:jc w:val="right"/>
+        <w:rPr>
+          <w:b/>
+          <w:bCs/>
+          <w:sz w:val="24"/>
+          <w:szCs w:val="24"/>
+          <w:lang w:bidi="ar-EG"/>
+        </w:rPr>
+      </w:pPr>
+      <w:r>
+        <w:rPr>
+          <w:b/>
+          <w:bCs/>
+          <w:sz w:val="24"/>
+          <w:szCs w:val="24"/>
+          <w:lang w:bidi="ar-EG"/>
+        </w:rPr>
+        <w:t>{</w:t>
+      </w:r>
+    </w:p>
+    <w:p>
+      <w:pPr>
+        <w:tabs>
+          <w:tab w:val="left" w:pos="7328"/>
+        </w:tabs>
+        <w:bidi/>
+        <w:spacing w:line="240" w:lineRule="auto"/>
+        <w:jc w:val="right"/>
+        <w:rPr>
+          <w:b/>
+          <w:bCs/>
+          <w:sz w:val="24"/>
+          <w:szCs w:val="24"/>
+          <w:lang w:bidi="ar-EG"/>
+        </w:rPr>
+      </w:pPr>
+      <w:r>
+        <w:rPr>
+          <w:b/>
+          <w:bCs/>
+          <w:sz w:val="24"/>
+          <w:szCs w:val="24"/>
+          <w:lang w:bidi="ar-EG"/>
+        </w:rPr>
+        <w:t xml:space="preserve">  "</w:t>
+      </w:r>
+      <w:proofErr w:type="spellStart"/>
+      <w:r>
+        <w:rPr>
+          <w:b/>
+          <w:bCs/>
+          <w:sz w:val="24"/>
+          <w:szCs w:val="24"/>
+          <w:lang w:bidi="ar-EG"/>
+        </w:rPr>
+        <w:t>totalPatients</w:t>
+      </w:r>
+      <w:proofErr w:type="spellEnd"/>
+      <w:r>
+        <w:rPr>
+          <w:b/>
+          <w:bCs/>
+          <w:sz w:val="24"/>
+          <w:szCs w:val="24"/>
+          <w:lang w:bidi="ar-EG"/>
+        </w:rPr>
+        <w:t>": 1200,</w:t>
+      </w:r>
+    </w:p>
+    <w:p>
+      <w:pPr>
+        <w:tabs>
+          <w:tab w:val="left" w:pos="7328"/>
+        </w:tabs>
+        <w:bidi/>
+        <w:spacing w:line="240" w:lineRule="auto"/>
+        <w:jc w:val="right"/>
+        <w:rPr>
+          <w:b/>
+          <w:bCs/>
+          <w:sz w:val="24"/>
+          <w:szCs w:val="24"/>
+          <w:lang w:bidi="ar-EG"/>
+        </w:rPr>
+      </w:pPr>
+      <w:r>
+        <w:rPr>
+          <w:b/>
+          <w:bCs/>
+          <w:sz w:val="24"/>
+          <w:szCs w:val="24"/>
+          <w:lang w:bidi="ar-EG"/>
+        </w:rPr>
+        <w:t xml:space="preserve">  "</w:t>
+      </w:r>
+      <w:proofErr w:type="spellStart"/>
+      <w:r>
+        <w:rPr>
+          <w:b/>
+          <w:bCs/>
+          <w:sz w:val="24"/>
+          <w:szCs w:val="24"/>
+          <w:lang w:bidi="ar-EG"/>
+        </w:rPr>
+        <w:t>totalDoctors</w:t>
+      </w:r>
+      <w:proofErr w:type="spellEnd"/>
+      <w:r>
+        <w:rPr>
+          <w:b/>
+          <w:bCs/>
+          <w:sz w:val="24"/>
+          <w:szCs w:val="24"/>
+          <w:lang w:bidi="ar-EG"/>
+        </w:rPr>
+        <w:t>": 40,</w:t>
+      </w:r>
+    </w:p>
+    <w:p>
+      <w:pPr>
+        <w:tabs>
+          <w:tab w:val="left" w:pos="7328"/>
+        </w:tabs>
+        <w:bidi/>
+        <w:spacing w:line="240" w:lineRule="auto"/>
+        <w:jc w:val="right"/>
+        <w:rPr>
+          <w:b/>
+          <w:bCs/>
+          <w:sz w:val="24"/>
+          <w:szCs w:val="24"/>
+          <w:lang w:bidi="ar-EG"/>
+        </w:rPr>
+      </w:pPr>
+      <w:r>
+        <w:rPr>
+          <w:b/>
+          <w:bCs/>
+          <w:sz w:val="24"/>
+          <w:szCs w:val="24"/>
+          <w:lang w:bidi="ar-EG"/>
+        </w:rPr>
+        <w:t xml:space="preserve">  "</w:t>
+      </w:r>
+      <w:proofErr w:type="spellStart"/>
+      <w:r>
+        <w:rPr>
+          <w:b/>
+          <w:bCs/>
+          <w:sz w:val="24"/>
+          <w:szCs w:val="24"/>
+          <w:lang w:bidi="ar-EG"/>
+        </w:rPr>
+        <w:t>todayAppointments</w:t>
+      </w:r>
+      <w:proofErr w:type="spellEnd"/>
+      <w:r>
+        <w:rPr>
+          <w:b/>
+          <w:bCs/>
+          <w:sz w:val="24"/>
+          <w:szCs w:val="24"/>
+          <w:lang w:bidi="ar-EG"/>
+        </w:rPr>
+        <w:t>": 87,</w:t>
+      </w:r>
+    </w:p>
+    <w:p>
+      <w:pPr>
+        <w:tabs>
+          <w:tab w:val="left" w:pos="7328"/>
+        </w:tabs>
+        <w:bidi/>
+        <w:spacing w:line="240" w:lineRule="auto"/>
+        <w:jc w:val="right"/>
+        <w:rPr>
+          <w:b/>
+          <w:bCs/>
+          <w:sz w:val="24"/>
+          <w:szCs w:val="24"/>
+          <w:lang w:bidi="ar-EG"/>
+        </w:rPr>
+      </w:pPr>
+      <w:r>
+        <w:rPr>
+          <w:b/>
+          <w:bCs/>
+          <w:sz w:val="24"/>
+          <w:szCs w:val="24"/>
+          <w:lang w:bidi="ar-EG"/>
+        </w:rPr>
+        <w:t xml:space="preserve">  "</w:t>
+      </w:r>
+      <w:proofErr w:type="spellStart"/>
+      <w:r>
+        <w:rPr>
+          <w:b/>
+          <w:bCs/>
+          <w:sz w:val="24"/>
+          <w:szCs w:val="24"/>
+          <w:lang w:bidi="ar-EG"/>
+        </w:rPr>
+        <w:t>pendingAppointments</w:t>
+      </w:r>
+      <w:proofErr w:type="spellEnd"/>
+      <w:r>
+        <w:rPr>
+          <w:b/>
+          <w:bCs/>
+          <w:sz w:val="24"/>
+          <w:szCs w:val="24"/>
+          <w:lang w:bidi="ar-EG"/>
+        </w:rPr>
+        <w:t>": 20,</w:t>
+      </w:r>
+    </w:p>
+    <w:p>
+      <w:pPr>
+        <w:tabs>
+          <w:tab w:val="left" w:pos="7328"/>
+        </w:tabs>
+        <w:bidi/>
+        <w:spacing w:line="240" w:lineRule="auto"/>
+        <w:jc w:val="right"/>
+        <w:rPr>
+          <w:b/>
+          <w:bCs/>
+          <w:sz w:val="24"/>
+          <w:szCs w:val="24"/>
+          <w:lang w:bidi="ar-EG"/>
+        </w:rPr>
+      </w:pPr>
+      <w:r>
+        <w:rPr>
+          <w:b/>
+          <w:bCs/>
+          <w:sz w:val="24"/>
+          <w:szCs w:val="24"/>
+          <w:lang w:bidi="ar-EG"/>
+        </w:rPr>
+        <w:t xml:space="preserve">  "</w:t>
+      </w:r>
+      <w:proofErr w:type="spellStart"/>
+      <w:r>
+        <w:rPr>
+          <w:b/>
+          <w:bCs/>
+          <w:sz w:val="24"/>
+          <w:szCs w:val="24"/>
+          <w:lang w:bidi="ar-EG"/>
+        </w:rPr>
+        <w:t>completedAppointments</w:t>
+      </w:r>
+      <w:proofErr w:type="spellEnd"/>
+      <w:r>
+        <w:rPr>
+          <w:b/>
+          <w:bCs/>
+          <w:sz w:val="24"/>
+          <w:szCs w:val="24"/>
+          <w:lang w:bidi="ar-EG"/>
+        </w:rPr>
+        <w:t>": 50,</w:t>
+      </w:r>
+    </w:p>
+    <w:p>
+      <w:pPr>
+        <w:tabs>
+          <w:tab w:val="left" w:pos="7328"/>
+        </w:tabs>
+        <w:bidi/>
+        <w:spacing w:line="240" w:lineRule="auto"/>
+        <w:jc w:val="right"/>
+        <w:rPr>
+          <w:b/>
+          <w:bCs/>
+          <w:sz w:val="24"/>
+          <w:szCs w:val="24"/>
+          <w:lang w:bidi="ar-EG"/>
+        </w:rPr>
+      </w:pPr>
+      <w:r>
+        <w:rPr>
+          <w:b/>
+          <w:bCs/>
+          <w:sz w:val="24"/>
+          <w:szCs w:val="24"/>
+          <w:lang w:bidi="ar-EG"/>
+        </w:rPr>
+        <w:t xml:space="preserve">  "</w:t>
+      </w:r>
+      <w:proofErr w:type="spellStart"/>
+      <w:r>
+        <w:rPr>
+          <w:b/>
+          <w:bCs/>
+          <w:sz w:val="24"/>
+          <w:szCs w:val="24"/>
+          <w:lang w:bidi="ar-EG"/>
+        </w:rPr>
+        <w:t>activeServices</w:t>
+      </w:r>
+      <w:proofErr w:type="spellEnd"/>
+      <w:r>
+        <w:rPr>
+          <w:b/>
+          <w:bCs/>
+          <w:sz w:val="24"/>
+          <w:szCs w:val="24"/>
+          <w:lang w:bidi="ar-EG"/>
+        </w:rPr>
+        <w:t>": 12</w:t>
+      </w:r>
+    </w:p>
+    <w:p>
+      <w:pPr>
+        <w:tabs>
+          <w:tab w:val="left" w:pos="7328"/>
+        </w:tabs>
+        <w:bidi/>
+        <w:spacing w:line="240" w:lineRule="auto"/>
+        <w:jc w:val="right"/>
+        <w:rPr>
+          <w:b/>
+          <w:bCs/>
+          <w:sz w:val="24"/>
+          <w:szCs w:val="24"/>
+          <w:lang w:bidi="ar-EG"/>
+        </w:rPr>
+      </w:pPr>
+      <w:r>
+        <w:rPr>
+          <w:b/>
+          <w:bCs/>
+          <w:sz w:val="24"/>
+          <w:szCs w:val="24"/>
+          <w:lang w:bidi="ar-EG"/>
+        </w:rPr>
+        <w:t>}</w:t>
+      </w:r>
+    </w:p>
+    <w:p>
+      <w:pPr>
+        <w:tabs>
+          <w:tab w:val="left" w:pos="7313"/>
+        </w:tabs>
+        <w:bidi/>
+        <w:spacing w:line="240" w:lineRule="auto"/>
+        <w:jc w:val="right"/>
+        <w:rPr>
+          <w:b/>
+          <w:bCs/>
+          <w:sz w:val="24"/>
+          <w:szCs w:val="24"/>
+          <w:lang w:bidi="ar-EG"/>
+        </w:rPr>
+      </w:pPr>
+      <w:r>
+        <w:rPr>
+          <w:b/>
+          <w:bCs/>
+          <w:sz w:val="24"/>
+          <w:szCs w:val="24"/>
+          <w:lang w:bidi="ar-EG"/>
+        </w:rPr>
+        <w:t>13. Notifications</w:t>
+      </w:r>
+    </w:p>
+    <w:p>
+      <w:pPr>
+        <w:tabs>
+          <w:tab w:val="left" w:pos="7313"/>
+        </w:tabs>
+        <w:bidi/>
+        <w:spacing w:line="240" w:lineRule="auto"/>
+        <w:jc w:val="right"/>
+        <w:rPr>
+          <w:b/>
+          <w:bCs/>
+          <w:sz w:val="24"/>
+          <w:szCs w:val="24"/>
+          <w:lang w:bidi="ar-EG"/>
+        </w:rPr>
+      </w:pPr>
+      <w:r>
+        <w:rPr>
+          <w:b/>
+          <w:bCs/>
+          <w:sz w:val="24"/>
+          <w:szCs w:val="24"/>
+          <w:rtl/>
+        </w:rPr>
+        <w:t>دي</w:t>
+      </w:r>
+      <w:r>
+        <w:rPr>
+          <w:b/>
+          <w:bCs/>
+          <w:sz w:val="24"/>
+          <w:szCs w:val="24"/>
+          <w:lang w:bidi="ar-EG"/>
+        </w:rPr>
+        <w:t xml:space="preserve"> Feature </w:t>
+      </w:r>
+      <w:r>
+        <w:rPr>
+          <w:b/>
+          <w:bCs/>
+          <w:sz w:val="24"/>
+          <w:szCs w:val="24"/>
+          <w:rtl/>
+        </w:rPr>
+        <w:t>كويسة جدًا للمشروع</w:t>
+      </w:r>
+      <w:r>
+        <w:rPr>
+          <w:b/>
+          <w:bCs/>
+          <w:sz w:val="24"/>
+          <w:szCs w:val="24"/>
+          <w:lang w:bidi="ar-EG"/>
+        </w:rPr>
+        <w:t>.</w:t>
+      </w:r>
+    </w:p>
+    <w:p>
+      <w:pPr>
+        <w:tabs>
+          <w:tab w:val="left" w:pos="7313"/>
+        </w:tabs>
+        <w:bidi/>
+        <w:spacing w:line="240" w:lineRule="auto"/>
+        <w:jc w:val="right"/>
+        <w:rPr>
+          <w:b/>
+          <w:bCs/>
+          <w:sz w:val="24"/>
+          <w:szCs w:val="24"/>
+          <w:lang w:bidi="ar-EG"/>
+        </w:rPr>
+      </w:pPr>
+      <w:r>
+        <w:rPr>
+          <w:b/>
+          <w:bCs/>
+          <w:sz w:val="24"/>
+          <w:szCs w:val="24"/>
+          <w:rtl/>
+        </w:rPr>
+        <w:t>مثلاً لما</w:t>
+      </w:r>
+      <w:r>
+        <w:rPr>
+          <w:b/>
+          <w:bCs/>
+          <w:sz w:val="24"/>
+          <w:szCs w:val="24"/>
+          <w:lang w:bidi="ar-EG"/>
+        </w:rPr>
+        <w:t>:</w:t>
+      </w:r>
+    </w:p>
+    <w:p>
+      <w:pPr>
+        <w:tabs>
+          <w:tab w:val="left" w:pos="7328"/>
+        </w:tabs>
+        <w:bidi/>
+        <w:spacing w:line="240" w:lineRule="auto"/>
+        <w:jc w:val="right"/>
+        <w:rPr>
+          <w:b/>
+          <w:bCs/>
+          <w:sz w:val="24"/>
+          <w:szCs w:val="24"/>
+          <w:lang w:bidi="ar-EG"/>
+        </w:rPr>
+      </w:pPr>
+      <w:r>
+        <w:rPr>
+          <w:b/>
+          <w:bCs/>
+          <w:sz w:val="24"/>
+          <w:szCs w:val="24"/>
+          <w:lang w:bidi="ar-EG"/>
+        </w:rPr>
+        <w:t>Patient books appointment</w:t>
+      </w:r>
+    </w:p>
+    <w:p>
+      <w:pPr>
+        <w:tabs>
+          <w:tab w:val="left" w:pos="7313"/>
+        </w:tabs>
+        <w:bidi/>
+        <w:spacing w:line="240" w:lineRule="auto"/>
+        <w:jc w:val="right"/>
+        <w:rPr>
+          <w:b/>
+          <w:bCs/>
+          <w:sz w:val="24"/>
+          <w:szCs w:val="24"/>
+          <w:lang w:bidi="ar-EG"/>
+        </w:rPr>
+      </w:pPr>
+      <w:r>
+        <w:rPr>
+          <w:b/>
+          <w:bCs/>
+          <w:sz w:val="24"/>
+          <w:szCs w:val="24"/>
+          <w:lang w:bidi="ar-EG"/>
+        </w:rPr>
+        <w:t xml:space="preserve">Doctor </w:t>
+      </w:r>
+      <w:r>
+        <w:rPr>
+          <w:b/>
+          <w:bCs/>
+          <w:sz w:val="24"/>
+          <w:szCs w:val="24"/>
+          <w:rtl/>
+        </w:rPr>
+        <w:t>يستقبل</w:t>
+      </w:r>
+      <w:r>
+        <w:rPr>
+          <w:b/>
+          <w:bCs/>
+          <w:sz w:val="24"/>
+          <w:szCs w:val="24"/>
+          <w:lang w:bidi="ar-EG"/>
+        </w:rPr>
+        <w:t>:</w:t>
+      </w:r>
+    </w:p>
+    <w:p>
+      <w:pPr>
+        <w:tabs>
+          <w:tab w:val="left" w:pos="7328"/>
+        </w:tabs>
+        <w:bidi/>
+        <w:spacing w:line="240" w:lineRule="auto"/>
+        <w:jc w:val="right"/>
+        <w:rPr>
+          <w:b/>
+          <w:bCs/>
+          <w:sz w:val="24"/>
+          <w:szCs w:val="24"/>
+          <w:lang w:bidi="ar-EG"/>
+        </w:rPr>
+      </w:pPr>
+      <w:r>
+        <w:rPr>
+          <w:b/>
+          <w:bCs/>
+          <w:sz w:val="24"/>
+          <w:szCs w:val="24"/>
+          <w:lang w:bidi="ar-EG"/>
+        </w:rPr>
+        <w:t>New appointment booked</w:t>
+      </w:r>
+    </w:p>
+    <w:p>
+      <w:pPr>
+        <w:tabs>
+          <w:tab w:val="left" w:pos="7313"/>
+        </w:tabs>
+        <w:bidi/>
+        <w:spacing w:line="240" w:lineRule="auto"/>
+        <w:jc w:val="right"/>
+        <w:rPr>
+          <w:b/>
+          <w:bCs/>
+          <w:sz w:val="24"/>
+          <w:szCs w:val="24"/>
+          <w:lang w:bidi="ar-EG"/>
+        </w:rPr>
+      </w:pPr>
+      <w:r>
+        <w:rPr>
+          <w:b/>
+          <w:bCs/>
+          <w:sz w:val="24"/>
+          <w:szCs w:val="24"/>
+          <w:rtl/>
+        </w:rPr>
+        <w:t>ولما</w:t>
+      </w:r>
+      <w:r>
+        <w:rPr>
+          <w:b/>
+          <w:bCs/>
+          <w:sz w:val="24"/>
+          <w:szCs w:val="24"/>
+          <w:lang w:bidi="ar-EG"/>
+        </w:rPr>
+        <w:t xml:space="preserve"> Doctor </w:t>
+      </w:r>
+      <w:r>
+        <w:rPr>
+          <w:b/>
+          <w:bCs/>
+          <w:sz w:val="24"/>
+          <w:szCs w:val="24"/>
+          <w:rtl/>
+        </w:rPr>
+        <w:t>يعمل</w:t>
+      </w:r>
+      <w:r>
+        <w:rPr>
+          <w:b/>
+          <w:bCs/>
+          <w:sz w:val="24"/>
+          <w:szCs w:val="24"/>
+          <w:lang w:bidi="ar-EG"/>
+        </w:rPr>
+        <w:t>:</w:t>
+      </w:r>
+    </w:p>
+    <w:p>
+      <w:pPr>
+        <w:tabs>
+          <w:tab w:val="left" w:pos="7328"/>
+        </w:tabs>
+        <w:bidi/>
+        <w:spacing w:line="240" w:lineRule="auto"/>
+        <w:jc w:val="right"/>
+        <w:rPr>
+          <w:b/>
+          <w:bCs/>
+          <w:sz w:val="24"/>
+          <w:szCs w:val="24"/>
+          <w:lang w:bidi="ar-EG"/>
+        </w:rPr>
+      </w:pPr>
+      <w:r>
+        <w:rPr>
+          <w:b/>
+          <w:bCs/>
+          <w:sz w:val="24"/>
+          <w:szCs w:val="24"/>
+          <w:lang w:bidi="ar-EG"/>
+        </w:rPr>
+        <w:t>CONFIRMED</w:t>
+      </w:r>
+    </w:p>
+    <w:p>
+      <w:pPr>
+        <w:tabs>
+          <w:tab w:val="left" w:pos="7313"/>
+        </w:tabs>
+        <w:bidi/>
+        <w:spacing w:line="240" w:lineRule="auto"/>
+        <w:jc w:val="right"/>
+        <w:rPr>
+          <w:b/>
+          <w:bCs/>
+          <w:sz w:val="24"/>
+          <w:szCs w:val="24"/>
+          <w:lang w:bidi="ar-EG"/>
+        </w:rPr>
+      </w:pPr>
+      <w:r>
+        <w:rPr>
+          <w:b/>
+          <w:bCs/>
+          <w:sz w:val="24"/>
+          <w:szCs w:val="24"/>
+          <w:lang w:bidi="ar-EG"/>
+        </w:rPr>
+        <w:t xml:space="preserve">Patient </w:t>
+      </w:r>
+      <w:r>
+        <w:rPr>
+          <w:b/>
+          <w:bCs/>
+          <w:sz w:val="24"/>
+          <w:szCs w:val="24"/>
+          <w:rtl/>
+        </w:rPr>
+        <w:t>يستقبل</w:t>
+      </w:r>
+      <w:r>
+        <w:rPr>
+          <w:b/>
+          <w:bCs/>
+          <w:sz w:val="24"/>
+          <w:szCs w:val="24"/>
+          <w:lang w:bidi="ar-EG"/>
+        </w:rPr>
+        <w:t xml:space="preserve"> notification.</w:t>
+      </w:r>
+    </w:p>
+    <w:p>
+      <w:pPr>
+        <w:tabs>
+          <w:tab w:val="left" w:pos="7313"/>
+        </w:tabs>
+        <w:bidi/>
+        <w:spacing w:line="240" w:lineRule="auto"/>
+        <w:jc w:val="right"/>
+        <w:rPr>
+          <w:b/>
+          <w:bCs/>
+          <w:sz w:val="24"/>
+          <w:szCs w:val="24"/>
+          <w:lang w:bidi="ar-EG"/>
+        </w:rPr>
+      </w:pPr>
+      <w:r>
+        <w:rPr>
+          <w:b/>
+          <w:bCs/>
+          <w:sz w:val="24"/>
+          <w:szCs w:val="24"/>
+          <w:rtl/>
+        </w:rPr>
+        <w:t>ابدأ بـ</w:t>
+      </w:r>
+      <w:r>
+        <w:rPr>
+          <w:b/>
+          <w:bCs/>
+          <w:sz w:val="24"/>
+          <w:szCs w:val="24"/>
+          <w:lang w:bidi="ar-EG"/>
+        </w:rPr>
+        <w:t>:</w:t>
+      </w:r>
+    </w:p>
+    <w:p>
+      <w:pPr>
+        <w:tabs>
+          <w:tab w:val="left" w:pos="7328"/>
+        </w:tabs>
+        <w:bidi/>
+        <w:spacing w:line="240" w:lineRule="auto"/>
+        <w:jc w:val="right"/>
+        <w:rPr>
+          <w:b/>
+          <w:bCs/>
+          <w:sz w:val="24"/>
+          <w:szCs w:val="24"/>
+          <w:lang w:bidi="ar-EG"/>
+        </w:rPr>
+      </w:pPr>
+      <w:r>
+        <w:rPr>
+          <w:b/>
+          <w:bCs/>
+          <w:sz w:val="24"/>
+          <w:szCs w:val="24"/>
+          <w:lang w:bidi="ar-EG"/>
+        </w:rPr>
+        <w:t>Notification</w:t>
+      </w:r>
+    </w:p>
+    <w:p>
+      <w:pPr>
+        <w:tabs>
+          <w:tab w:val="left" w:pos="7328"/>
+        </w:tabs>
+        <w:bidi/>
+        <w:spacing w:line="240" w:lineRule="auto"/>
+        <w:jc w:val="right"/>
+        <w:rPr>
+          <w:b/>
+          <w:bCs/>
+          <w:sz w:val="24"/>
+          <w:szCs w:val="24"/>
+          <w:lang w:bidi="ar-EG"/>
+        </w:rPr>
+      </w:pPr>
+      <w:r>
+        <w:rPr>
+          <w:rFonts w:ascii="MS Gothic" w:eastAsia="MS Gothic" w:hAnsi="MS Gothic" w:cs="MS Gothic" w:hint="eastAsia"/>
+          <w:b/>
+          <w:bCs/>
+          <w:sz w:val="24"/>
+          <w:szCs w:val="24"/>
+          <w:lang w:bidi="ar-EG"/>
+        </w:rPr>
+        <w:t>├</w:t>
+      </w:r>
+      <w:r>
+        <w:rPr>
+          <w:rFonts w:ascii="Aptos" w:hAnsi="Aptos" w:cs="Aptos"/>
+          <w:b/>
+          <w:bCs/>
+          <w:sz w:val="24"/>
+          <w:szCs w:val="24"/>
+          <w:lang w:bidi="ar-EG"/>
+        </w:rPr>
+        <w:t>──</w:t>
+      </w:r>
+      <w:r>
+        <w:rPr>
+          <w:b/>
+          <w:bCs/>
+          <w:sz w:val="24"/>
+          <w:szCs w:val="24"/>
+          <w:lang w:bidi="ar-EG"/>
+        </w:rPr>
+        <w:t xml:space="preserve"> </w:t>
+      </w:r>
+      <w:proofErr w:type="spellStart"/>
+      <w:r>
+        <w:rPr>
+          <w:b/>
+          <w:bCs/>
+          <w:sz w:val="24"/>
+          <w:szCs w:val="24"/>
+          <w:lang w:bidi="ar-EG"/>
+        </w:rPr>
+        <w:t>userId</w:t>
+      </w:r>
+      <w:proofErr w:type="spellEnd"/>
+    </w:p>
+    <w:p>
+      <w:pPr>
+        <w:tabs>
+          <w:tab w:val="left" w:pos="7328"/>
+        </w:tabs>
+        <w:bidi/>
+        <w:spacing w:line="240" w:lineRule="auto"/>
+        <w:jc w:val="right"/>
+        <w:rPr>
+          <w:b/>
+          <w:bCs/>
+          <w:sz w:val="24"/>
+          <w:szCs w:val="24"/>
+          <w:lang w:bidi="ar-EG"/>
+        </w:rPr>
+      </w:pPr>
+      <w:r>
+        <w:rPr>
+          <w:rFonts w:ascii="MS Gothic" w:eastAsia="MS Gothic" w:hAnsi="MS Gothic" w:cs="MS Gothic" w:hint="eastAsia"/>
+          <w:b/>
+          <w:bCs/>
+          <w:sz w:val="24"/>
+          <w:szCs w:val="24"/>
+          <w:lang w:bidi="ar-EG"/>
+        </w:rPr>
+        <w:t>├</w:t>
+      </w:r>
+      <w:r>
+        <w:rPr>
+          <w:rFonts w:ascii="Aptos" w:hAnsi="Aptos" w:cs="Aptos"/>
+          <w:b/>
+          <w:bCs/>
+          <w:sz w:val="24"/>
+          <w:szCs w:val="24"/>
+          <w:lang w:bidi="ar-EG"/>
+        </w:rPr>
+        <w:t>──</w:t>
+      </w:r>
+      <w:r>
+        <w:rPr>
+          <w:b/>
+          <w:bCs/>
+          <w:sz w:val="24"/>
+          <w:szCs w:val="24"/>
+          <w:lang w:bidi="ar-EG"/>
+        </w:rPr>
+        <w:t xml:space="preserve"> title</w:t>
+      </w:r>
+    </w:p>
+    <w:p>
+      <w:pPr>
+        <w:tabs>
+          <w:tab w:val="left" w:pos="7328"/>
+        </w:tabs>
+        <w:bidi/>
+        <w:spacing w:line="240" w:lineRule="auto"/>
+        <w:jc w:val="right"/>
+        <w:rPr>
+          <w:b/>
+          <w:bCs/>
+          <w:sz w:val="24"/>
+          <w:szCs w:val="24"/>
+          <w:lang w:bidi="ar-EG"/>
+        </w:rPr>
+      </w:pPr>
+      <w:r>
+        <w:rPr>
+          <w:rFonts w:ascii="MS Gothic" w:eastAsia="MS Gothic" w:hAnsi="MS Gothic" w:cs="MS Gothic" w:hint="eastAsia"/>
+          <w:b/>
+          <w:bCs/>
+          <w:sz w:val="24"/>
+          <w:szCs w:val="24"/>
+          <w:lang w:bidi="ar-EG"/>
+        </w:rPr>
+        <w:t>├</w:t>
+      </w:r>
+      <w:r>
+        <w:rPr>
+          <w:rFonts w:ascii="Aptos" w:hAnsi="Aptos" w:cs="Aptos"/>
+          <w:b/>
+          <w:bCs/>
+          <w:sz w:val="24"/>
+          <w:szCs w:val="24"/>
+          <w:lang w:bidi="ar-EG"/>
+        </w:rPr>
+        <w:t>──</w:t>
+      </w:r>
+      <w:r>
+        <w:rPr>
+          <w:b/>
+          <w:bCs/>
+          <w:sz w:val="24"/>
+          <w:szCs w:val="24"/>
+          <w:lang w:bidi="ar-EG"/>
+        </w:rPr>
+        <w:t xml:space="preserve"> message</w:t>
+      </w:r>
+    </w:p>
+    <w:p>
+      <w:pPr>
+        <w:tabs>
+          <w:tab w:val="left" w:pos="7328"/>
+        </w:tabs>
+        <w:bidi/>
+        <w:spacing w:line="240" w:lineRule="auto"/>
+        <w:jc w:val="right"/>
+        <w:rPr>
+          <w:b/>
+          <w:bCs/>
+          <w:sz w:val="24"/>
+          <w:szCs w:val="24"/>
+          <w:lang w:bidi="ar-EG"/>
+        </w:rPr>
+      </w:pPr>
+      <w:r>
+        <w:rPr>
+          <w:rFonts w:ascii="MS Gothic" w:eastAsia="MS Gothic" w:hAnsi="MS Gothic" w:cs="MS Gothic" w:hint="eastAsia"/>
+          <w:b/>
+          <w:bCs/>
+          <w:sz w:val="24"/>
+          <w:szCs w:val="24"/>
+          <w:lang w:bidi="ar-EG"/>
+        </w:rPr>
+        <w:t>├</w:t>
+      </w:r>
+      <w:r>
+        <w:rPr>
+          <w:rFonts w:ascii="Aptos" w:hAnsi="Aptos" w:cs="Aptos"/>
+          <w:b/>
+          <w:bCs/>
+          <w:sz w:val="24"/>
+          <w:szCs w:val="24"/>
+          <w:lang w:bidi="ar-EG"/>
+        </w:rPr>
+        <w:t>──</w:t>
+      </w:r>
+      <w:r>
+        <w:rPr>
+          <w:b/>
+          <w:bCs/>
+          <w:sz w:val="24"/>
+          <w:szCs w:val="24"/>
+          <w:lang w:bidi="ar-EG"/>
+        </w:rPr>
+        <w:t xml:space="preserve"> type</w:t>
+      </w:r>
+    </w:p>
+    <w:p>
+      <w:pPr>
+        <w:tabs>
+          <w:tab w:val="left" w:pos="7328"/>
+        </w:tabs>
+        <w:bidi/>
+        <w:spacing w:line="240" w:lineRule="auto"/>
+        <w:jc w:val="right"/>
+        <w:rPr>
+          <w:b/>
+          <w:bCs/>
+          <w:sz w:val="24"/>
+          <w:szCs w:val="24"/>
+          <w:lang w:bidi="ar-EG"/>
+        </w:rPr>
+      </w:pPr>
+      <w:r>
+        <w:rPr>
+          <w:rFonts w:ascii="MS Gothic" w:eastAsia="MS Gothic" w:hAnsi="MS Gothic" w:cs="MS Gothic" w:hint="eastAsia"/>
+          <w:b/>
+          <w:bCs/>
+          <w:sz w:val="24"/>
+          <w:szCs w:val="24"/>
+          <w:lang w:bidi="ar-EG"/>
+        </w:rPr>
+        <w:lastRenderedPageBreak/>
+        <w:t>├</w:t>
+      </w:r>
+      <w:r>
+        <w:rPr>
+          <w:rFonts w:ascii="Aptos" w:hAnsi="Aptos" w:cs="Aptos"/>
+          <w:b/>
+          <w:bCs/>
+          <w:sz w:val="24"/>
+          <w:szCs w:val="24"/>
+          <w:lang w:bidi="ar-EG"/>
+        </w:rPr>
+        <w:t>──</w:t>
+      </w:r>
+      <w:r>
+        <w:rPr>
+          <w:b/>
+          <w:bCs/>
+          <w:sz w:val="24"/>
+          <w:szCs w:val="24"/>
+          <w:lang w:bidi="ar-EG"/>
+        </w:rPr>
+        <w:t xml:space="preserve"> </w:t>
+      </w:r>
+      <w:proofErr w:type="spellStart"/>
+      <w:r>
+        <w:rPr>
+          <w:b/>
+          <w:bCs/>
+          <w:sz w:val="24"/>
+          <w:szCs w:val="24"/>
+          <w:lang w:bidi="ar-EG"/>
+        </w:rPr>
+        <w:t>isRead</w:t>
+      </w:r>
+      <w:proofErr w:type="spellEnd"/>
+    </w:p>
+    <w:p>
+      <w:pPr>
+        <w:tabs>
+          <w:tab w:val="left" w:pos="7328"/>
+        </w:tabs>
+        <w:bidi/>
+        <w:spacing w:line="240" w:lineRule="auto"/>
+        <w:jc w:val="right"/>
+        <w:rPr>
+          <w:b/>
+          <w:bCs/>
+          <w:sz w:val="24"/>
+          <w:szCs w:val="24"/>
+          <w:lang w:bidi="ar-EG"/>
+        </w:rPr>
+      </w:pPr>
+      <w:r>
+        <w:rPr>
+          <w:b/>
+          <w:bCs/>
+          <w:sz w:val="24"/>
+          <w:szCs w:val="24"/>
+          <w:lang w:bidi="ar-EG"/>
+        </w:rPr>
+        <w:t xml:space="preserve">└── </w:t>
+      </w:r>
+      <w:proofErr w:type="spellStart"/>
+      <w:r>
+        <w:rPr>
+          <w:b/>
+          <w:bCs/>
+          <w:sz w:val="24"/>
+          <w:szCs w:val="24"/>
+          <w:lang w:bidi="ar-EG"/>
+        </w:rPr>
+        <w:t>createdAt</w:t>
+      </w:r>
+      <w:proofErr w:type="spellEnd"/>
+    </w:p>
+    <w:p>
+      <w:pPr>
+        <w:tabs>
+          <w:tab w:val="left" w:pos="7313"/>
+        </w:tabs>
+        <w:bidi/>
+        <w:spacing w:line="240" w:lineRule="auto"/>
+        <w:jc w:val="right"/>
+        <w:rPr>
+          <w:b/>
+          <w:bCs/>
+          <w:sz w:val="24"/>
+          <w:szCs w:val="24"/>
+          <w:lang w:bidi="ar-EG"/>
+        </w:rPr>
+      </w:pPr>
+      <w:r>
+        <w:rPr>
+          <w:b/>
+          <w:bCs/>
+          <w:sz w:val="24"/>
+          <w:szCs w:val="24"/>
+          <w:lang w:bidi="ar-EG"/>
+        </w:rPr>
+        <w:t>Functions:</w:t>
+      </w:r>
+    </w:p>
+    <w:p>
+      <w:pPr>
+        <w:tabs>
+          <w:tab w:val="left" w:pos="7328"/>
+        </w:tabs>
+        <w:bidi/>
+        <w:spacing w:line="240" w:lineRule="auto"/>
+        <w:jc w:val="right"/>
+        <w:rPr>
+          <w:b/>
+          <w:bCs/>
+          <w:sz w:val="24"/>
+          <w:szCs w:val="24"/>
+          <w:lang w:bidi="ar-EG"/>
+        </w:rPr>
+      </w:pPr>
+      <w:proofErr w:type="spellStart"/>
+      <w:r>
+        <w:rPr>
+          <w:b/>
+          <w:bCs/>
+          <w:sz w:val="24"/>
+          <w:szCs w:val="24"/>
+          <w:lang w:bidi="ar-EG"/>
+        </w:rPr>
+        <w:t>createNotification</w:t>
+      </w:r>
+      <w:proofErr w:type="spellEnd"/>
+    </w:p>
+    <w:p>
+      <w:pPr>
+        <w:tabs>
+          <w:tab w:val="left" w:pos="7328"/>
+        </w:tabs>
+        <w:bidi/>
+        <w:spacing w:line="240" w:lineRule="auto"/>
+        <w:jc w:val="right"/>
+        <w:rPr>
+          <w:b/>
+          <w:bCs/>
+          <w:sz w:val="24"/>
+          <w:szCs w:val="24"/>
+          <w:lang w:bidi="ar-EG"/>
+        </w:rPr>
+      </w:pPr>
+      <w:proofErr w:type="spellStart"/>
+      <w:r>
+        <w:rPr>
+          <w:b/>
+          <w:bCs/>
+          <w:sz w:val="24"/>
+          <w:szCs w:val="24"/>
+          <w:lang w:bidi="ar-EG"/>
+        </w:rPr>
+        <w:t>getMyNotifications</w:t>
+      </w:r>
+      <w:proofErr w:type="spellEnd"/>
+    </w:p>
+    <w:p>
+      <w:pPr>
+        <w:tabs>
+          <w:tab w:val="left" w:pos="7328"/>
+        </w:tabs>
+        <w:bidi/>
+        <w:spacing w:line="240" w:lineRule="auto"/>
+        <w:jc w:val="right"/>
+        <w:rPr>
+          <w:b/>
+          <w:bCs/>
+          <w:sz w:val="24"/>
+          <w:szCs w:val="24"/>
+          <w:lang w:bidi="ar-EG"/>
+        </w:rPr>
+      </w:pPr>
+      <w:proofErr w:type="spellStart"/>
+      <w:r>
+        <w:rPr>
+          <w:b/>
+          <w:bCs/>
+          <w:sz w:val="24"/>
+          <w:szCs w:val="24"/>
+          <w:lang w:bidi="ar-EG"/>
+        </w:rPr>
+        <w:t>markAsRead</w:t>
+      </w:r>
+      <w:proofErr w:type="spellEnd"/>
+    </w:p>
+    <w:p>
+      <w:pPr>
+        <w:tabs>
+          <w:tab w:val="left" w:pos="7328"/>
+        </w:tabs>
+        <w:bidi/>
+        <w:spacing w:line="240" w:lineRule="auto"/>
+        <w:jc w:val="right"/>
+        <w:rPr>
+          <w:b/>
+          <w:bCs/>
+          <w:sz w:val="24"/>
+          <w:szCs w:val="24"/>
+          <w:lang w:bidi="ar-EG"/>
+        </w:rPr>
+      </w:pPr>
+      <w:proofErr w:type="spellStart"/>
+      <w:r>
+        <w:rPr>
+          <w:b/>
+          <w:bCs/>
+          <w:sz w:val="24"/>
+          <w:szCs w:val="24"/>
+          <w:lang w:bidi="ar-EG"/>
+        </w:rPr>
+        <w:t>markAllAsRead</w:t>
+      </w:r>
+      <w:proofErr w:type="spellEnd"/>
+    </w:p>
+    <w:p>
+      <w:pPr>
+        <w:tabs>
+          <w:tab w:val="left" w:pos="7313"/>
+        </w:tabs>
+        <w:bidi/>
+        <w:spacing w:line="240" w:lineRule="auto"/>
+        <w:jc w:val="right"/>
+        <w:rPr>
+          <w:b/>
+          <w:bCs/>
+          <w:sz w:val="24"/>
+          <w:szCs w:val="24"/>
+          <w:lang w:bidi="ar-EG"/>
+        </w:rPr>
+      </w:pPr>
+      <w:r>
+        <w:rPr>
+          <w:b/>
+          <w:bCs/>
+          <w:sz w:val="24"/>
+          <w:szCs w:val="24"/>
+          <w:rtl/>
+        </w:rPr>
+        <w:t>وبعد كده ممكن</w:t>
+      </w:r>
+      <w:r>
+        <w:rPr>
+          <w:b/>
+          <w:bCs/>
+          <w:sz w:val="24"/>
+          <w:szCs w:val="24"/>
+          <w:lang w:bidi="ar-EG"/>
+        </w:rPr>
+        <w:t xml:space="preserve"> Socket.IO.</w:t>
+      </w:r>
+    </w:p>
+    <w:p>
+      <w:pPr>
+        <w:spacing w:before="100" w:beforeAutospacing="1" w:after="100" w:afterAutospacing="1" w:line="240" w:lineRule="auto"/>
+        <w:outlineLvl w:val="0"/>
+        <w:rPr>
+          <w:rFonts w:ascii="Times New Roman" w:eastAsia="Times New Roman" w:hAnsi="Times New Roman" w:cs="Times New Roman"/>
+          <w:b/>
+          <w:bCs/>
+          <w:kern w:val="36"/>
+          <w:sz w:val="48"/>
+          <w:szCs w:val="48"/>
+          <w14:ligatures w14:val="none"/>
+        </w:rPr>
+      </w:pPr>
+      <w:r>
+        <w:rPr>
+          <w:rFonts w:ascii="Times New Roman" w:eastAsia="Times New Roman" w:hAnsi="Times New Roman" w:cs="Times New Roman"/>
+          <w:b/>
+          <w:bCs/>
+          <w:kern w:val="36"/>
+          <w:sz w:val="48"/>
+          <w:szCs w:val="48"/>
+          <w14:ligatures w14:val="none"/>
+        </w:rPr>
+        <w:t>14. Email</w:t>
+      </w:r>
+    </w:p>
+    <w:p>
+      <w:pPr>
+        <w:spacing w:before="100" w:beforeAutospacing="1" w:after="100" w:afterAutospacing="1" w:line="240" w:lineRule="auto"/>
+        <w:rPr>
+          <w:rFonts w:ascii="Times New Roman" w:eastAsia="Times New Roman" w:hAnsi="Times New Roman" w:cs="Times New Roman"/>
+          <w:kern w:val="0"/>
+          <w:sz w:val="24"/>
+          <w:szCs w:val="24"/>
+          <w14:ligatures w14:val="none"/>
+        </w:rPr>
+      </w:pPr>
+      <w:r>
+        <w:rPr>
+          <w:rFonts w:ascii="Times New Roman" w:eastAsia="Times New Roman" w:hAnsi="Times New Roman" w:cs="Times New Roman"/>
+          <w:kern w:val="0"/>
+          <w:sz w:val="24"/>
+          <w:szCs w:val="24"/>
+          <w:rtl/>
+          <w14:ligatures w14:val="none"/>
+        </w:rPr>
+        <w:t>بعد</w:t>
+      </w:r>
+      <w:r>
+        <w:rPr>
+          <w:rFonts w:ascii="Times New Roman" w:eastAsia="Times New Roman" w:hAnsi="Times New Roman" w:cs="Times New Roman"/>
+          <w:kern w:val="0"/>
+          <w:sz w:val="24"/>
+          <w:szCs w:val="24"/>
+          <w14:ligatures w14:val="none"/>
+        </w:rPr>
+        <w:t xml:space="preserve"> notifications:</w:t>
+      </w:r>
+    </w:p>
+    <w:p>
+      <w:pPr>
+        <w:tabs>
+          <w:tab w:val="left" w:pos="916"/>
+          <w:tab w:val="left" w:pos="1832"/>
+          <w:tab w:val="left" w:pos="2748"/>
+          <w:tab w:val="left" w:pos="3664"/>
+          <w:tab w:val="left" w:pos="4580"/>
+          <w:tab w:val="left" w:pos="5496"/>
+          <w:tab w:val="left" w:pos="6412"/>
+          <w:tab w:val="left" w:pos="7328"/>
+          <w:tab w:val="left" w:pos="8244"/>
+          <w:tab w:val="left" w:pos="9160"/>
+          <w:tab w:val="left" w:pos="10076"/>
+          <w:tab w:val="left" w:pos="10992"/>
+          <w:tab w:val="left" w:pos="11908"/>
+          <w:tab w:val="left" w:pos="12824"/>
+          <w:tab w:val="left" w:pos="13740"/>
+          <w:tab w:val="left" w:pos="14656"/>
+        </w:tabs>
+        <w:spacing w:after="0" w:line="240" w:lineRule="auto"/>
+        <w:rPr>
+          <w:rFonts w:ascii="Courier New" w:eastAsia="Times New Roman" w:hAnsi="Courier New" w:cs="Courier New"/>
+          <w:kern w:val="0"/>
+          <w:sz w:val="20"/>
+          <w:szCs w:val="20"/>
+          <w14:ligatures w14:val="none"/>
+        </w:rPr>
+      </w:pPr>
+      <w:r>
+        <w:rPr>
+          <w:rFonts w:ascii="Courier New" w:eastAsia="Times New Roman" w:hAnsi="Courier New" w:cs="Courier New"/>
+          <w:kern w:val="0"/>
+          <w:sz w:val="20"/>
+          <w:szCs w:val="20"/>
+          <w14:ligatures w14:val="none"/>
+        </w:rPr>
+        <w:t>Appointment booked</w:t>
+      </w:r>
+    </w:p>
+    <w:p>
+      <w:pPr>
+        <w:tabs>
+          <w:tab w:val="left" w:pos="916"/>
+          <w:tab w:val="left" w:pos="1832"/>
+          <w:tab w:val="left" w:pos="2748"/>
+          <w:tab w:val="left" w:pos="3664"/>
+          <w:tab w:val="left" w:pos="4580"/>
+          <w:tab w:val="left" w:pos="5496"/>
+          <w:tab w:val="left" w:pos="6412"/>
+          <w:tab w:val="left" w:pos="7328"/>
+          <w:tab w:val="left" w:pos="8244"/>
+          <w:tab w:val="left" w:pos="9160"/>
+          <w:tab w:val="left" w:pos="10076"/>
+          <w:tab w:val="left" w:pos="10992"/>
+          <w:tab w:val="left" w:pos="11908"/>
+          <w:tab w:val="left" w:pos="12824"/>
+          <w:tab w:val="left" w:pos="13740"/>
+          <w:tab w:val="left" w:pos="14656"/>
+        </w:tabs>
+        <w:spacing w:after="0" w:line="240" w:lineRule="auto"/>
+        <w:rPr>
+          <w:rFonts w:ascii="Courier New" w:eastAsia="Times New Roman" w:hAnsi="Courier New" w:cs="Courier New"/>
+          <w:kern w:val="0"/>
+          <w:sz w:val="20"/>
+          <w:szCs w:val="20"/>
+          <w14:ligatures w14:val="none"/>
+        </w:rPr>
+      </w:pPr>
+      <w:r>
+        <w:rPr>
+          <w:rFonts w:ascii="Courier New" w:eastAsia="Times New Roman" w:hAnsi="Courier New" w:cs="Courier New"/>
+          <w:kern w:val="0"/>
+          <w:sz w:val="20"/>
+          <w:szCs w:val="20"/>
+          <w14:ligatures w14:val="none"/>
+        </w:rPr>
+        <w:t>Appointment confirmed</w:t>
+      </w:r>
+    </w:p>
+    <w:p>
+      <w:pPr>
+        <w:tabs>
+          <w:tab w:val="left" w:pos="916"/>
+          <w:tab w:val="left" w:pos="1832"/>
+          <w:tab w:val="left" w:pos="2748"/>
+          <w:tab w:val="left" w:pos="3664"/>
+          <w:tab w:val="left" w:pos="4580"/>
+          <w:tab w:val="left" w:pos="5496"/>
+          <w:tab w:val="left" w:pos="6412"/>
+          <w:tab w:val="left" w:pos="7328"/>
+          <w:tab w:val="left" w:pos="8244"/>
+          <w:tab w:val="left" w:pos="9160"/>
+          <w:tab w:val="left" w:pos="10076"/>
+          <w:tab w:val="left" w:pos="10992"/>
+          <w:tab w:val="left" w:pos="11908"/>
+          <w:tab w:val="left" w:pos="12824"/>
+          <w:tab w:val="left" w:pos="13740"/>
+          <w:tab w:val="left" w:pos="14656"/>
+        </w:tabs>
+        <w:spacing w:after="0" w:line="240" w:lineRule="auto"/>
+        <w:rPr>
+          <w:rFonts w:ascii="Courier New" w:eastAsia="Times New Roman" w:hAnsi="Courier New" w:cs="Courier New"/>
+          <w:kern w:val="0"/>
+          <w:sz w:val="20"/>
+          <w:szCs w:val="20"/>
+          <w14:ligatures w14:val="none"/>
+        </w:rPr>
+      </w:pPr>
+      <w:r>
+        <w:rPr>
+          <w:rFonts w:ascii="Courier New" w:eastAsia="Times New Roman" w:hAnsi="Courier New" w:cs="Courier New"/>
+          <w:kern w:val="0"/>
+          <w:sz w:val="20"/>
+          <w:szCs w:val="20"/>
+          <w14:ligatures w14:val="none"/>
+        </w:rPr>
+        <w:t>Appointment cancelled</w:t>
+      </w:r>
+    </w:p>
+    <w:p>
+      <w:pPr>
+        <w:tabs>
+          <w:tab w:val="left" w:pos="916"/>
+          <w:tab w:val="left" w:pos="1832"/>
+          <w:tab w:val="left" w:pos="2748"/>
+          <w:tab w:val="left" w:pos="3664"/>
+          <w:tab w:val="left" w:pos="4580"/>
+          <w:tab w:val="left" w:pos="5496"/>
+          <w:tab w:val="left" w:pos="6412"/>
+          <w:tab w:val="left" w:pos="7328"/>
+          <w:tab w:val="left" w:pos="8244"/>
+          <w:tab w:val="left" w:pos="9160"/>
+          <w:tab w:val="left" w:pos="10076"/>
+          <w:tab w:val="left" w:pos="10992"/>
+          <w:tab w:val="left" w:pos="11908"/>
+          <w:tab w:val="left" w:pos="12824"/>
+          <w:tab w:val="left" w:pos="13740"/>
+          <w:tab w:val="left" w:pos="14656"/>
+        </w:tabs>
+        <w:spacing w:after="0" w:line="240" w:lineRule="auto"/>
+        <w:rPr>
+          <w:rFonts w:ascii="Courier New" w:eastAsia="Times New Roman" w:hAnsi="Courier New" w:cs="Courier New"/>
+          <w:kern w:val="0"/>
+          <w:sz w:val="20"/>
+          <w:szCs w:val="20"/>
+          <w14:ligatures w14:val="none"/>
+        </w:rPr>
+      </w:pPr>
+      <w:r>
+        <w:rPr>
+          <w:rFonts w:ascii="Courier New" w:eastAsia="Times New Roman" w:hAnsi="Courier New" w:cs="Courier New"/>
+          <w:kern w:val="0"/>
+          <w:sz w:val="20"/>
+          <w:szCs w:val="20"/>
+          <w14:ligatures w14:val="none"/>
+        </w:rPr>
+        <w:t>Password reset</w:t>
+      </w:r>
+    </w:p>
+    <w:p>
+      <w:pPr>
+        <w:spacing w:before="100" w:beforeAutospacing="1" w:after="100" w:afterAutospacing="1" w:line="240" w:lineRule="auto"/>
+        <w:rPr>
+          <w:rFonts w:ascii="Times New Roman" w:eastAsia="Times New Roman" w:hAnsi="Times New Roman" w:cs="Times New Roman"/>
+          <w:kern w:val="0"/>
+          <w:sz w:val="24"/>
+          <w:szCs w:val="24"/>
+          <w14:ligatures w14:val="none"/>
+        </w:rPr>
+      </w:pPr>
+      <w:r>
+        <w:rPr>
+          <w:rFonts w:ascii="Times New Roman" w:eastAsia="Times New Roman" w:hAnsi="Times New Roman" w:cs="Times New Roman"/>
+          <w:kern w:val="0"/>
+          <w:sz w:val="24"/>
+          <w:szCs w:val="24"/>
+          <w:rtl/>
+          <w14:ligatures w14:val="none"/>
+        </w:rPr>
+        <w:t>ممكن تبعت</w:t>
+      </w:r>
+      <w:r>
+        <w:rPr>
+          <w:rFonts w:ascii="Times New Roman" w:eastAsia="Times New Roman" w:hAnsi="Times New Roman" w:cs="Times New Roman"/>
+          <w:kern w:val="0"/>
+          <w:sz w:val="24"/>
+          <w:szCs w:val="24"/>
+          <w14:ligatures w14:val="none"/>
+        </w:rPr>
+        <w:t xml:space="preserve"> Email.</w:t>
+      </w:r>
+    </w:p>
+    <w:p>
+      <w:pPr>
+        <w:spacing w:before="100" w:beforeAutospacing="1" w:after="100" w:afterAutospacing="1" w:line="240" w:lineRule="auto"/>
+        <w:rPr>
+          <w:rFonts w:ascii="Times New Roman" w:eastAsia="Times New Roman" w:hAnsi="Times New Roman" w:cs="Times New Roman"/>
+          <w:kern w:val="0"/>
+          <w:sz w:val="24"/>
+          <w:szCs w:val="24"/>
+          <w14:ligatures w14:val="none"/>
+        </w:rPr>
+      </w:pPr>
+      <w:r>
+        <w:rPr>
+          <w:rFonts w:ascii="Times New Roman" w:eastAsia="Times New Roman" w:hAnsi="Times New Roman" w:cs="Times New Roman"/>
+          <w:kern w:val="0"/>
+          <w:sz w:val="24"/>
+          <w:szCs w:val="24"/>
+          <w:rtl/>
+          <w14:ligatures w14:val="none"/>
+        </w:rPr>
+        <w:t xml:space="preserve">لكن </w:t>
+      </w:r>
+      <w:r>
+        <w:rPr>
+          <w:rFonts w:ascii="Times New Roman" w:eastAsia="Times New Roman" w:hAnsi="Times New Roman" w:cs="Times New Roman"/>
+          <w:b/>
+          <w:bCs/>
+          <w:kern w:val="0"/>
+          <w:sz w:val="24"/>
+          <w:szCs w:val="24"/>
+          <w:rtl/>
+          <w14:ligatures w14:val="none"/>
+        </w:rPr>
+        <w:t>مش دلوقتي</w:t>
+      </w:r>
+      <w:r>
+        <w:rPr>
+          <w:rFonts w:ascii="Times New Roman" w:eastAsia="Times New Roman" w:hAnsi="Times New Roman" w:cs="Times New Roman"/>
+          <w:kern w:val="0"/>
+          <w:sz w:val="24"/>
+          <w:szCs w:val="24"/>
+          <w14:ligatures w14:val="none"/>
+        </w:rPr>
+        <w:t>.</w:t>
+      </w:r>
+    </w:p>
+    <w:p>
+      <w:pPr>
+        <w:spacing w:before="100" w:beforeAutospacing="1" w:after="100" w:afterAutospacing="1" w:line="240" w:lineRule="auto"/>
+        <w:rPr>
+          <w:rFonts w:ascii="Times New Roman" w:eastAsia="Times New Roman" w:hAnsi="Times New Roman" w:cs="Times New Roman"/>
+          <w:kern w:val="0"/>
+          <w:sz w:val="24"/>
+          <w:szCs w:val="24"/>
+          <w14:ligatures w14:val="none"/>
+        </w:rPr>
+      </w:pPr>
+      <w:r>
+        <w:rPr>
+          <w:rFonts w:ascii="Times New Roman" w:eastAsia="Times New Roman" w:hAnsi="Times New Roman" w:cs="Times New Roman"/>
+          <w:kern w:val="0"/>
+          <w:sz w:val="24"/>
+          <w:szCs w:val="24"/>
+          <w:rtl/>
+          <w14:ligatures w14:val="none"/>
+        </w:rPr>
+        <w:t>دي</w:t>
+      </w:r>
+      <w:r>
+        <w:rPr>
+          <w:rFonts w:ascii="Times New Roman" w:eastAsia="Times New Roman" w:hAnsi="Times New Roman" w:cs="Times New Roman"/>
+          <w:kern w:val="0"/>
+          <w:sz w:val="24"/>
+          <w:szCs w:val="24"/>
+          <w14:ligatures w14:val="none"/>
+        </w:rPr>
+        <w:t xml:space="preserve"> Phase </w:t>
+      </w:r>
+      <w:r>
+        <w:rPr>
+          <w:rFonts w:ascii="Times New Roman" w:eastAsia="Times New Roman" w:hAnsi="Times New Roman" w:cs="Times New Roman"/>
+          <w:kern w:val="0"/>
+          <w:sz w:val="24"/>
+          <w:szCs w:val="24"/>
+          <w:rtl/>
+          <w14:ligatures w14:val="none"/>
+        </w:rPr>
+        <w:t>تحسين</w:t>
+      </w:r>
+      <w:r>
+        <w:rPr>
+          <w:rFonts w:ascii="Times New Roman" w:eastAsia="Times New Roman" w:hAnsi="Times New Roman" w:cs="Times New Roman"/>
+          <w:kern w:val="0"/>
+          <w:sz w:val="24"/>
+          <w:szCs w:val="24"/>
+          <w14:ligatures w14:val="none"/>
+        </w:rPr>
+        <w:t>.</w:t>
+      </w:r>
+    </w:p>
+    <w:p>
+      <w:pPr>
+        <w:tabs>
+          <w:tab w:val="left" w:pos="7313"/>
+        </w:tabs>
+        <w:bidi/>
+        <w:spacing w:line="240" w:lineRule="auto"/>
+        <w:jc w:val="right"/>
+        <w:rPr>
+          <w:rFonts w:hint="cs"/>
+          <w:b/>
+          <w:bCs/>
+          <w:sz w:val="24"/>
+          <w:szCs w:val="24"/>
+          <w:rtl/>
           <w:lang w:bidi="ar-EG"/>
         </w:rPr>
       </w:pPr>
@@ -2743,7 +6043,6 @@
     <w:next w:val="Normal"/>
     <w:link w:val="Heading3Char"/>
     <w:uiPriority w:val="9"/>
-    <w:semiHidden/>
     <w:unhideWhenUsed/>
     <w:qFormat/>
     <w:rsid w:val="00DF780D"/>
@@ -2895,7 +6194,6 @@
   <w:style w:type="character" w:default="1" w:styleId="DefaultParagraphFont">
     <w:name w:val="Default Paragraph Font"/>
     <w:uiPriority w:val="1"/>
-    <w:semiHidden/>
     <w:unhideWhenUsed/>
   </w:style>
   <w:style w:type="table" w:default="1" w:styleId="TableNormal">
@@ -2951,7 +6249,6 @@
     <w:basedOn w:val="DefaultParagraphFont"/>
     <w:link w:val="Heading3"/>
     <w:uiPriority w:val="9"/>
-    <w:semiHidden/>
     <w:rsid w:val="00DF780D"/>
     <w:rPr>
       <w:rFonts w:eastAsiaTheme="majorEastAsia" w:cstheme="majorBidi"/>
@@ -3283,6 +6580,63 @@
     <w:uiPriority w:val="99"/>
     <w:rsid w:val="00C3069F"/>
   </w:style>
+  <w:style w:type="character" w:styleId="HTMLCode">
+    <w:name w:val="HTML Code"/>
+    <w:basedOn w:val="DefaultParagraphFont"/>
+    <w:uiPriority w:val="99"/>
+    <w:semiHidden/>
+    <w:unhideWhenUsed/>
+    <w:rsid w:val="004A1DB8"/>
+    <w:rPr>
+      <w:rFonts w:ascii="Courier New" w:eastAsia="Times New Roman" w:hAnsi="Courier New" w:cs="Courier New"/>
+      <w:sz w:val="20"/>
+      <w:szCs w:val="20"/>
+    </w:rPr>
+  </w:style>
+  <w:style w:type="paragraph" w:customStyle="1" w:styleId="pdq2pgselectionanchorcontainer">
+    <w:name w:val="pdq2pg_selectionanchorcontainer"/>
+    <w:basedOn w:val="Normal"/>
+    <w:rsid w:val="004A1DB8"/>
+    <w:pPr>
+      <w:spacing w:before="100" w:beforeAutospacing="1" w:after="100" w:afterAutospacing="1" w:line="240" w:lineRule="auto"/>
+    </w:pPr>
+    <w:rPr>
+      <w:rFonts w:ascii="Times New Roman" w:eastAsia="Times New Roman" w:hAnsi="Times New Roman" w:cs="Times New Roman"/>
+      <w:kern w:val="0"/>
+      <w:sz w:val="24"/>
+      <w:szCs w:val="24"/>
+      <w14:ligatures w14:val="none"/>
+    </w:rPr>
+  </w:style>
+  <w:style w:type="paragraph" w:styleId="NormalWeb">
+    <w:name w:val="Normal (Web)"/>
+    <w:basedOn w:val="Normal"/>
+    <w:uiPriority w:val="99"/>
+    <w:semiHidden/>
+    <w:unhideWhenUsed/>
+    <w:rsid w:val="00015EF1"/>
+    <w:pPr>
+      <w:spacing w:before="100" w:beforeAutospacing="1" w:after="100" w:afterAutospacing="1" w:line="240" w:lineRule="auto"/>
+    </w:pPr>
+    <w:rPr>
+      <w:rFonts w:ascii="Times New Roman" w:eastAsia="Times New Roman" w:hAnsi="Times New Roman" w:cs="Times New Roman"/>
+      <w:kern w:val="0"/>
+      <w:sz w:val="24"/>
+      <w:szCs w:val="24"/>
+      <w14:ligatures w14:val="none"/>
+    </w:rPr>
+  </w:style>
+  <w:style w:type="character" w:styleId="Strong">
+    <w:name w:val="Strong"/>
+    <w:basedOn w:val="DefaultParagraphFont"/>
+    <w:uiPriority w:val="22"/>
+    <w:qFormat/>
+    <w:rsid w:val="00015EF1"/>
+    <w:rPr>
+      <w:b/>
+      <w:bCs/>
+    </w:rPr>
+  </w:style>
 </w:styles>
 </file>
 

</xml_diff>

<commit_message>
swagger & logging are added
</commit_message>
<xml_diff>
--- a/System analysis.docx
+++ b/System analysis.docx
@@ -236,27 +236,7 @@
           <w:color w:val="000000" w:themeColor="text1"/>
           <w:lang w:bidi="ar-EG"/>
         </w:rPr>
-        <w:t xml:space="preserve">5-Get All </w:t>
-      </w:r>
-      <w:proofErr w:type="gramStart"/>
-      <w:r>
-        <w:rPr>
-          <w:b/>
-          <w:bCs/>
-          <w:color w:val="000000" w:themeColor="text1"/>
-          <w:lang w:bidi="ar-EG"/>
-        </w:rPr>
-        <w:t>services  6</w:t>
-      </w:r>
-      <w:proofErr w:type="gramEnd"/>
-      <w:r>
-        <w:rPr>
-          <w:b/>
-          <w:bCs/>
-          <w:color w:val="000000" w:themeColor="text1"/>
-          <w:lang w:bidi="ar-EG"/>
-        </w:rPr>
-        <w:t>-reserve a service</w:t>
+        <w:t>5-Get All services  6-reserve a service</w:t>
       </w:r>
     </w:p>
     <w:p>
@@ -435,17 +415,7 @@
           <w:color w:val="00B050"/>
           <w:lang w:bidi="ar-EG"/>
         </w:rPr>
-        <w:t xml:space="preserve">update my </w:t>
-      </w:r>
-      <w:proofErr w:type="gramStart"/>
-      <w:r>
-        <w:rPr>
-          <w:b/>
-          <w:bCs/>
-          <w:color w:val="00B050"/>
-          <w:lang w:bidi="ar-EG"/>
-        </w:rPr>
-        <w:t xml:space="preserve">account </w:t>
+        <w:t xml:space="preserve">update my account </w:t>
       </w:r>
       <w:r>
         <w:rPr>
@@ -463,17 +433,7 @@
           <w:color w:val="000000" w:themeColor="text1"/>
           <w:lang w:bidi="ar-EG"/>
         </w:rPr>
-        <w:t>5</w:t>
-      </w:r>
-      <w:proofErr w:type="gramEnd"/>
-      <w:r>
-        <w:rPr>
-          <w:b/>
-          <w:bCs/>
-          <w:color w:val="000000" w:themeColor="text1"/>
-          <w:lang w:bidi="ar-EG"/>
-        </w:rPr>
-        <w:t>-Cancel Reservation</w:t>
+        <w:t>5-Cancel Reservation</w:t>
       </w:r>
     </w:p>
     <w:p>
@@ -679,7 +639,6 @@
         </w:rPr>
         <w:t xml:space="preserve">-get all </w:t>
       </w:r>
-      <w:proofErr w:type="gramStart"/>
       <w:r>
         <w:rPr>
           <w:b/>
@@ -696,18 +655,7 @@
           <w:color w:val="000000" w:themeColor="text1"/>
           <w:lang w:bidi="ar-EG"/>
         </w:rPr>
-        <w:t xml:space="preserve">  -</w:t>
-      </w:r>
-      <w:proofErr w:type="spellStart"/>
-      <w:proofErr w:type="gramEnd"/>
-      <w:r>
-        <w:rPr>
-          <w:b/>
-          <w:bCs/>
-          <w:color w:val="000000" w:themeColor="text1"/>
-          <w:lang w:bidi="ar-EG"/>
-        </w:rPr>
-        <w:t>getSlot</w:t>
+        <w:t xml:space="preserve">  -getSlot</w:t>
       </w:r>
       <w:r>
         <w:rPr>
@@ -718,7 +666,6 @@
         </w:rPr>
         <w:t>Prescription</w:t>
       </w:r>
-      <w:proofErr w:type="spellEnd"/>
     </w:p>
     <w:p>
       <w:pPr>
@@ -741,7 +688,6 @@
         </w:rPr>
         <w:t>-</w:t>
       </w:r>
-      <w:proofErr w:type="spellStart"/>
       <w:r>
         <w:rPr>
           <w:b/>
@@ -751,7 +697,6 @@
         </w:rPr>
         <w:t>getPatientPrescriptions</w:t>
       </w:r>
-      <w:proofErr w:type="spellEnd"/>
       <w:r>
         <w:rPr>
           <w:b/>
@@ -761,7 +706,6 @@
         </w:rPr>
         <w:t xml:space="preserve">     - </w:t>
       </w:r>
-      <w:proofErr w:type="spellStart"/>
       <w:r>
         <w:rPr>
           <w:b/>
@@ -771,7 +715,6 @@
         </w:rPr>
         <w:t>getDoctorPrescriptions</w:t>
       </w:r>
-      <w:proofErr w:type="spellEnd"/>
       <w:r>
         <w:rPr>
           <w:b/>
@@ -781,7 +724,6 @@
         </w:rPr>
         <w:t xml:space="preserve">    -</w:t>
       </w:r>
-      <w:proofErr w:type="spellStart"/>
       <w:r>
         <w:rPr>
           <w:b/>
@@ -800,7 +742,6 @@
         </w:rPr>
         <w:t>Prescription</w:t>
       </w:r>
-      <w:proofErr w:type="spellEnd"/>
       <w:r>
         <w:rPr>
           <w:b/>
@@ -849,28 +790,475 @@
           <w:color w:val="000000" w:themeColor="text1"/>
           <w:lang w:bidi="ar-EG"/>
         </w:rPr>
-        <w:t xml:space="preserve">    -forget password    -</w:t>
-      </w:r>
-      <w:proofErr w:type="spellStart"/>
-      <w:r>
-        <w:rPr>
-          <w:b/>
-          <w:bCs/>
-          <w:color w:val="000000" w:themeColor="text1"/>
-          <w:lang w:bidi="ar-EG"/>
-        </w:rPr>
-        <w:t>updatePassword</w:t>
-      </w:r>
-      <w:proofErr w:type="spellEnd"/>
-      <w:r>
-        <w:rPr>
-          <w:b/>
-          <w:bCs/>
-          <w:color w:val="000000" w:themeColor="text1"/>
+        <w:t xml:space="preserve">    -forget password    -updatePassword </w:t>
+      </w:r>
+    </w:p>
+    <w:p>
+      <w:pPr>
+        <w:bidi/>
+        <w:jc w:val="right"/>
+        <w:rPr>
+          <w:b/>
+          <w:bCs/>
+          <w:color w:val="A02B93" w:themeColor="accent5"/>
+          <w:lang w:bidi="ar-EG"/>
+        </w:rPr>
+      </w:pPr>
+      <w:r>
+        <w:rPr>
+          <w:b/>
+          <w:bCs/>
+          <w:color w:val="A02B93" w:themeColor="accent5"/>
+          <w:lang w:bidi="ar-EG"/>
+        </w:rPr>
+        <w:t>Admin Functions:</w:t>
+      </w:r>
+    </w:p>
+    <w:p>
+      <w:pPr>
+        <w:bidi/>
+        <w:jc w:val="right"/>
+        <w:rPr>
+          <w:b/>
+          <w:bCs/>
+          <w:color w:val="00B050"/>
+          <w:lang w:bidi="ar-EG"/>
+        </w:rPr>
+      </w:pPr>
+      <w:r>
+        <w:rPr>
+          <w:b/>
+          <w:bCs/>
+          <w:color w:val="00B050"/>
+          <w:lang w:bidi="ar-EG"/>
+        </w:rPr>
+        <w:t xml:space="preserve">1-Login   </w:t>
+      </w:r>
+      <w:r>
+        <w:rPr>
+          <w:b/>
+          <w:bCs/>
+          <w:color w:val="00B050"/>
+          <w:lang w:bidi="ar-EG"/>
+        </w:rPr>
+        <w:t xml:space="preserve">                  </w:t>
+      </w:r>
+      <w:r>
+        <w:rPr>
+          <w:b/>
+          <w:bCs/>
+          <w:color w:val="00B050"/>
+          <w:lang w:bidi="ar-EG"/>
+        </w:rPr>
+        <w:t xml:space="preserve">  2-Add Admin  </w:t>
+      </w:r>
+    </w:p>
+    <w:p>
+      <w:pPr>
+        <w:bidi/>
+        <w:jc w:val="right"/>
+        <w:rPr>
+          <w:b/>
+          <w:bCs/>
+          <w:color w:val="00B050"/>
+          <w:lang w:bidi="ar-EG"/>
+        </w:rPr>
+      </w:pPr>
+      <w:r>
+        <w:rPr>
+          <w:b/>
+          <w:bCs/>
+          <w:color w:val="00B050"/>
+          <w:lang w:bidi="ar-EG"/>
+        </w:rPr>
+        <w:t>6-get All Doctors</w:t>
+      </w:r>
+    </w:p>
+    <w:p>
+      <w:pPr>
+        <w:bidi/>
+        <w:jc w:val="right"/>
+        <w:rPr>
+          <w:b/>
+          <w:bCs/>
+          <w:color w:val="000000" w:themeColor="text1"/>
+          <w:lang w:bidi="ar-EG"/>
+        </w:rPr>
+      </w:pPr>
+      <w:r>
+        <w:rPr>
+          <w:b/>
+          <w:bCs/>
+          <w:color w:val="00B050"/>
+          <w:lang w:bidi="ar-EG"/>
+        </w:rPr>
+        <w:t>3-add Doctor</w:t>
+      </w:r>
+      <w:r>
+        <w:rPr>
+          <w:b/>
+          <w:bCs/>
+          <w:color w:val="000000" w:themeColor="text1"/>
+          <w:lang w:bidi="ar-EG"/>
+        </w:rPr>
+        <w:t xml:space="preserve">  </w:t>
+      </w:r>
+      <w:r>
+        <w:rPr>
+          <w:b/>
+          <w:bCs/>
+          <w:color w:val="000000" w:themeColor="text1"/>
+          <w:lang w:bidi="ar-EG"/>
+        </w:rPr>
+        <w:t xml:space="preserve">     </w:t>
+      </w:r>
+      <w:r>
+        <w:rPr>
+          <w:b/>
+          <w:bCs/>
+          <w:color w:val="000000" w:themeColor="text1"/>
+          <w:lang w:bidi="ar-EG"/>
+        </w:rPr>
+        <w:t xml:space="preserve">12-update Doctor   </w:t>
+      </w:r>
+    </w:p>
+    <w:p>
+      <w:pPr>
+        <w:bidi/>
+        <w:jc w:val="right"/>
+        <w:rPr>
+          <w:b/>
+          <w:bCs/>
+          <w:color w:val="000000" w:themeColor="text1"/>
+          <w:lang w:bidi="ar-EG"/>
+        </w:rPr>
+      </w:pPr>
+      <w:r>
+        <w:rPr>
+          <w:b/>
+          <w:bCs/>
+          <w:color w:val="000000" w:themeColor="text1"/>
+          <w:lang w:bidi="ar-EG"/>
+        </w:rPr>
+        <w:t xml:space="preserve">13-Delete Doctor    </w:t>
+      </w:r>
+      <w:r>
+        <w:rPr>
+          <w:b/>
+          <w:bCs/>
+          <w:lang w:bidi="ar-EG"/>
+        </w:rPr>
+        <w:t xml:space="preserve"> -getDoctor</w:t>
+      </w:r>
+      <w:r>
+        <w:rPr>
+          <w:b/>
+          <w:bCs/>
+          <w:lang w:bidi="ar-EG"/>
+        </w:rPr>
+        <w:t>Details</w:t>
+      </w:r>
+      <w:r>
+        <w:rPr>
+          <w:b/>
+          <w:bCs/>
           <w:lang w:bidi="ar-EG"/>
         </w:rPr>
         <w:t xml:space="preserve"> </w:t>
       </w:r>
+      <w:r>
+        <w:rPr>
+          <w:b/>
+          <w:bCs/>
+          <w:lang w:bidi="ar-EG"/>
+        </w:rPr>
+        <w:t xml:space="preserve"> -delete Doctor</w:t>
+      </w:r>
+      <w:r>
+        <w:rPr>
+          <w:b/>
+          <w:bCs/>
+          <w:lang w:bidi="ar-EG"/>
+        </w:rPr>
+        <w:t xml:space="preserve">   </w:t>
+      </w:r>
+      <w:r>
+        <w:rPr>
+          <w:b/>
+          <w:bCs/>
+          <w:lang w:bidi="ar-EG"/>
+        </w:rPr>
+        <w:t>-getAllDoctors</w:t>
+      </w:r>
+    </w:p>
+    <w:p>
+      <w:pPr>
+        <w:bidi/>
+        <w:jc w:val="right"/>
+        <w:rPr>
+          <w:b/>
+          <w:bCs/>
+          <w:color w:val="000000" w:themeColor="text1"/>
+          <w:lang w:bidi="ar-EG"/>
+        </w:rPr>
+      </w:pPr>
+      <w:r>
+        <w:rPr>
+          <w:b/>
+          <w:bCs/>
+          <w:color w:val="000000" w:themeColor="text1"/>
+          <w:lang w:bidi="ar-EG"/>
+        </w:rPr>
+        <w:t>-</w:t>
+      </w:r>
+      <w:r>
+        <w:rPr>
+          <w:b/>
+          <w:bCs/>
+          <w:color w:val="000000" w:themeColor="text1"/>
+          <w:lang w:bidi="ar-EG"/>
+        </w:rPr>
+        <w:t xml:space="preserve">update User </w:t>
+      </w:r>
+      <w:r>
+        <w:rPr>
+          <w:b/>
+          <w:bCs/>
+          <w:color w:val="000000" w:themeColor="text1"/>
+          <w:lang w:bidi="ar-EG"/>
+        </w:rPr>
+        <w:t xml:space="preserve">         </w:t>
+      </w:r>
+    </w:p>
+    <w:p>
+      <w:pPr>
+        <w:bidi/>
+        <w:jc w:val="right"/>
+        <w:rPr>
+          <w:b/>
+          <w:bCs/>
+          <w:color w:val="000000" w:themeColor="text1"/>
+          <w:lang w:bidi="ar-EG"/>
+        </w:rPr>
+      </w:pPr>
+      <w:r>
+        <w:rPr>
+          <w:b/>
+          <w:bCs/>
+          <w:color w:val="000000" w:themeColor="text1"/>
+          <w:lang w:bidi="ar-EG"/>
+        </w:rPr>
+        <w:t>7</w:t>
+      </w:r>
+      <w:r>
+        <w:rPr>
+          <w:b/>
+          <w:bCs/>
+          <w:color w:val="00B050"/>
+          <w:lang w:bidi="ar-EG"/>
+        </w:rPr>
+        <w:t>-get All Appointments</w:t>
+      </w:r>
+      <w:r>
+        <w:rPr>
+          <w:b/>
+          <w:bCs/>
+          <w:color w:val="000000" w:themeColor="text1"/>
+          <w:lang w:bidi="ar-EG"/>
+        </w:rPr>
+        <w:t xml:space="preserve">    8-</w:t>
+      </w:r>
+      <w:r>
+        <w:rPr>
+          <w:b/>
+          <w:bCs/>
+          <w:color w:val="00B050"/>
+          <w:lang w:bidi="ar-EG"/>
+        </w:rPr>
+        <w:t xml:space="preserve">update the Appointment  </w:t>
+      </w:r>
+    </w:p>
+    <w:p>
+      <w:pPr>
+        <w:bidi/>
+        <w:jc w:val="right"/>
+        <w:rPr>
+          <w:b/>
+          <w:bCs/>
+          <w:color w:val="000000" w:themeColor="text1"/>
+          <w:lang w:bidi="ar-EG"/>
+        </w:rPr>
+      </w:pPr>
+      <w:r>
+        <w:rPr>
+          <w:b/>
+          <w:bCs/>
+          <w:color w:val="000000" w:themeColor="text1"/>
+          <w:lang w:bidi="ar-EG"/>
+        </w:rPr>
+        <w:t>9-</w:t>
+      </w:r>
+      <w:r>
+        <w:rPr>
+          <w:b/>
+          <w:bCs/>
+          <w:color w:val="00B050"/>
+          <w:lang w:bidi="ar-EG"/>
+        </w:rPr>
+        <w:t>Delete Appointment</w:t>
+      </w:r>
+      <w:r>
+        <w:rPr>
+          <w:b/>
+          <w:bCs/>
+          <w:color w:val="00B050"/>
+          <w:lang w:bidi="ar-EG"/>
+        </w:rPr>
+        <w:t xml:space="preserve">     </w:t>
+      </w:r>
+      <w:r>
+        <w:rPr>
+          <w:b/>
+          <w:bCs/>
+          <w:color w:val="000000" w:themeColor="text1"/>
+          <w:lang w:bidi="ar-EG"/>
+        </w:rPr>
+        <w:t xml:space="preserve">10-update User    </w:t>
+      </w:r>
+    </w:p>
+    <w:p>
+      <w:pPr>
+        <w:bidi/>
+        <w:jc w:val="right"/>
+        <w:rPr>
+          <w:b/>
+          <w:bCs/>
+          <w:color w:val="00B050"/>
+          <w:lang w:bidi="ar-EG"/>
+        </w:rPr>
+      </w:pPr>
+      <w:r>
+        <w:rPr>
+          <w:b/>
+          <w:bCs/>
+          <w:color w:val="00B050"/>
+          <w:lang w:bidi="ar-EG"/>
+        </w:rPr>
+        <w:t xml:space="preserve">11-Delete User  </w:t>
+      </w:r>
+      <w:r>
+        <w:rPr>
+          <w:b/>
+          <w:bCs/>
+          <w:color w:val="00B050"/>
+          <w:lang w:bidi="ar-EG"/>
+        </w:rPr>
+        <w:t xml:space="preserve">         </w:t>
+      </w:r>
+    </w:p>
+    <w:p>
+      <w:pPr>
+        <w:bidi/>
+        <w:jc w:val="right"/>
+        <w:rPr>
+          <w:b/>
+          <w:bCs/>
+          <w:color w:val="000000" w:themeColor="text1"/>
+          <w:rtl/>
+          <w:lang w:bidi="ar-EG"/>
+        </w:rPr>
+      </w:pPr>
+      <w:r>
+        <w:rPr>
+          <w:b/>
+          <w:bCs/>
+          <w:color w:val="000000" w:themeColor="text1"/>
+          <w:lang w:bidi="ar-EG"/>
+        </w:rPr>
+        <w:lastRenderedPageBreak/>
+        <w:t xml:space="preserve">14-get All  services   </w:t>
+      </w:r>
+      <w:r>
+        <w:rPr>
+          <w:b/>
+          <w:bCs/>
+          <w:color w:val="000000" w:themeColor="text1"/>
+          <w:lang w:bidi="ar-EG"/>
+        </w:rPr>
+        <w:t>-create service</w:t>
+      </w:r>
+    </w:p>
+    <w:p>
+      <w:pPr>
+        <w:bidi/>
+        <w:jc w:val="right"/>
+        <w:rPr>
+          <w:b/>
+          <w:bCs/>
+          <w:color w:val="000000" w:themeColor="text1"/>
+          <w:lang w:bidi="ar-EG"/>
+        </w:rPr>
+      </w:pPr>
+      <w:r>
+        <w:rPr>
+          <w:b/>
+          <w:bCs/>
+          <w:color w:val="000000" w:themeColor="text1"/>
+          <w:lang w:bidi="ar-EG"/>
+        </w:rPr>
+        <w:t>15-update service    16-delete service</w:t>
+      </w:r>
+    </w:p>
+    <w:p>
+      <w:pPr>
+        <w:bidi/>
+        <w:jc w:val="right"/>
+        <w:rPr>
+          <w:b/>
+          <w:bCs/>
+          <w:color w:val="000000" w:themeColor="text1"/>
+          <w:lang w:bidi="ar-EG"/>
+        </w:rPr>
+      </w:pPr>
+      <w:r>
+        <w:rPr>
+          <w:b/>
+          <w:bCs/>
+          <w:color w:val="000000" w:themeColor="text1"/>
+          <w:lang w:bidi="ar-EG"/>
+        </w:rPr>
+        <w:t xml:space="preserve">15-get All slots   </w:t>
+      </w:r>
+      <w:r>
+        <w:rPr>
+          <w:b/>
+          <w:bCs/>
+          <w:color w:val="000000" w:themeColor="text1"/>
+          <w:lang w:bidi="ar-EG"/>
+        </w:rPr>
+        <w:t>-getsolt</w:t>
+      </w:r>
+    </w:p>
+    <w:p>
+      <w:pPr>
+        <w:bidi/>
+        <w:jc w:val="right"/>
+        <w:rPr>
+          <w:b/>
+          <w:bCs/>
+          <w:color w:val="000000" w:themeColor="text1"/>
+          <w:lang w:bidi="ar-EG"/>
+        </w:rPr>
+      </w:pPr>
+      <w:r>
+        <w:rPr>
+          <w:b/>
+          <w:bCs/>
+          <w:color w:val="000000" w:themeColor="text1"/>
+          <w:lang w:bidi="ar-EG"/>
+        </w:rPr>
+        <w:t xml:space="preserve"> 16-update Slot   17-delete Solt </w:t>
+      </w:r>
     </w:p>
     <w:p>
       <w:pPr>
@@ -890,534 +1278,6 @@
           <w:color w:val="A02B93" w:themeColor="accent5"/>
           <w:lang w:bidi="ar-EG"/>
         </w:rPr>
-        <w:t>Admin Functions:</w:t>
-      </w:r>
-    </w:p>
-    <w:p>
-      <w:pPr>
-        <w:bidi/>
-        <w:jc w:val="right"/>
-        <w:rPr>
-          <w:b/>
-          <w:bCs/>
-          <w:color w:val="00B050"/>
-          <w:lang w:bidi="ar-EG"/>
-        </w:rPr>
-      </w:pPr>
-      <w:r>
-        <w:rPr>
-          <w:b/>
-          <w:bCs/>
-          <w:color w:val="00B050"/>
-          <w:lang w:bidi="ar-EG"/>
-        </w:rPr>
-        <w:t xml:space="preserve">1-Login   </w:t>
-      </w:r>
-      <w:r>
-        <w:rPr>
-          <w:b/>
-          <w:bCs/>
-          <w:color w:val="00B050"/>
-          <w:lang w:bidi="ar-EG"/>
-        </w:rPr>
-        <w:t xml:space="preserve">                  </w:t>
-      </w:r>
-      <w:r>
-        <w:rPr>
-          <w:b/>
-          <w:bCs/>
-          <w:color w:val="00B050"/>
-          <w:lang w:bidi="ar-EG"/>
-        </w:rPr>
-        <w:t xml:space="preserve">  2-Add Admin  </w:t>
-      </w:r>
-    </w:p>
-    <w:p>
-      <w:pPr>
-        <w:bidi/>
-        <w:jc w:val="right"/>
-        <w:rPr>
-          <w:b/>
-          <w:bCs/>
-          <w:color w:val="00B050"/>
-          <w:lang w:bidi="ar-EG"/>
-        </w:rPr>
-      </w:pPr>
-      <w:r>
-        <w:rPr>
-          <w:b/>
-          <w:bCs/>
-          <w:color w:val="00B050"/>
-          <w:lang w:bidi="ar-EG"/>
-        </w:rPr>
-        <w:t>6-get All Doctors</w:t>
-      </w:r>
-    </w:p>
-    <w:p>
-      <w:pPr>
-        <w:bidi/>
-        <w:jc w:val="right"/>
-        <w:rPr>
-          <w:b/>
-          <w:bCs/>
-          <w:color w:val="000000" w:themeColor="text1"/>
-          <w:lang w:bidi="ar-EG"/>
-        </w:rPr>
-      </w:pPr>
-      <w:r>
-        <w:rPr>
-          <w:b/>
-          <w:bCs/>
-          <w:color w:val="00B050"/>
-          <w:lang w:bidi="ar-EG"/>
-        </w:rPr>
-        <w:t>3-add Doctor</w:t>
-      </w:r>
-      <w:r>
-        <w:rPr>
-          <w:b/>
-          <w:bCs/>
-          <w:color w:val="000000" w:themeColor="text1"/>
-          <w:lang w:bidi="ar-EG"/>
-        </w:rPr>
-        <w:t xml:space="preserve">  </w:t>
-      </w:r>
-      <w:r>
-        <w:rPr>
-          <w:b/>
-          <w:bCs/>
-          <w:color w:val="000000" w:themeColor="text1"/>
-          <w:lang w:bidi="ar-EG"/>
-        </w:rPr>
-        <w:t xml:space="preserve">     </w:t>
-      </w:r>
-      <w:r>
-        <w:rPr>
-          <w:b/>
-          <w:bCs/>
-          <w:color w:val="000000" w:themeColor="text1"/>
-          <w:lang w:bidi="ar-EG"/>
-        </w:rPr>
-        <w:t xml:space="preserve">12-update Doctor   </w:t>
-      </w:r>
-    </w:p>
-    <w:p>
-      <w:pPr>
-        <w:bidi/>
-        <w:jc w:val="right"/>
-        <w:rPr>
-          <w:b/>
-          <w:bCs/>
-          <w:color w:val="000000" w:themeColor="text1"/>
-          <w:lang w:bidi="ar-EG"/>
-        </w:rPr>
-      </w:pPr>
-      <w:r>
-        <w:rPr>
-          <w:b/>
-          <w:bCs/>
-          <w:color w:val="000000" w:themeColor="text1"/>
-          <w:lang w:bidi="ar-EG"/>
-        </w:rPr>
-        <w:t xml:space="preserve">13-Delete Doctor    </w:t>
-      </w:r>
-      <w:r>
-        <w:rPr>
-          <w:b/>
-          <w:bCs/>
-          <w:lang w:bidi="ar-EG"/>
-        </w:rPr>
-        <w:t xml:space="preserve"> -</w:t>
-      </w:r>
-      <w:proofErr w:type="spellStart"/>
-      <w:proofErr w:type="gramStart"/>
-      <w:r>
-        <w:rPr>
-          <w:b/>
-          <w:bCs/>
-          <w:lang w:bidi="ar-EG"/>
-        </w:rPr>
-        <w:t>getDoctor</w:t>
-      </w:r>
-      <w:r>
-        <w:rPr>
-          <w:b/>
-          <w:bCs/>
-          <w:lang w:bidi="ar-EG"/>
-        </w:rPr>
-        <w:t>Details</w:t>
-      </w:r>
-      <w:proofErr w:type="spellEnd"/>
-      <w:r>
-        <w:rPr>
-          <w:b/>
-          <w:bCs/>
-          <w:lang w:bidi="ar-EG"/>
-        </w:rPr>
-        <w:t xml:space="preserve"> </w:t>
-      </w:r>
-      <w:r>
-        <w:rPr>
-          <w:b/>
-          <w:bCs/>
-          <w:lang w:bidi="ar-EG"/>
-        </w:rPr>
-        <w:t xml:space="preserve"> -</w:t>
-      </w:r>
-      <w:proofErr w:type="gramEnd"/>
-      <w:r>
-        <w:rPr>
-          <w:b/>
-          <w:bCs/>
-          <w:lang w:bidi="ar-EG"/>
-        </w:rPr>
-        <w:t>delete Doctor</w:t>
-      </w:r>
-      <w:r>
-        <w:rPr>
-          <w:b/>
-          <w:bCs/>
-          <w:lang w:bidi="ar-EG"/>
-        </w:rPr>
-        <w:t xml:space="preserve">   </w:t>
-      </w:r>
-      <w:r>
-        <w:rPr>
-          <w:b/>
-          <w:bCs/>
-          <w:lang w:bidi="ar-EG"/>
-        </w:rPr>
-        <w:t>-</w:t>
-      </w:r>
-      <w:proofErr w:type="spellStart"/>
-      <w:r>
-        <w:rPr>
-          <w:b/>
-          <w:bCs/>
-          <w:lang w:bidi="ar-EG"/>
-        </w:rPr>
-        <w:t>getAllDoctors</w:t>
-      </w:r>
-      <w:proofErr w:type="spellEnd"/>
-    </w:p>
-    <w:p>
-      <w:pPr>
-        <w:bidi/>
-        <w:jc w:val="right"/>
-        <w:rPr>
-          <w:b/>
-          <w:bCs/>
-          <w:color w:val="000000" w:themeColor="text1"/>
-          <w:lang w:bidi="ar-EG"/>
-        </w:rPr>
-      </w:pPr>
-      <w:r>
-        <w:rPr>
-          <w:b/>
-          <w:bCs/>
-          <w:color w:val="000000" w:themeColor="text1"/>
-          <w:lang w:bidi="ar-EG"/>
-        </w:rPr>
-        <w:t>-</w:t>
-      </w:r>
-      <w:r>
-        <w:rPr>
-          <w:b/>
-          <w:bCs/>
-          <w:color w:val="000000" w:themeColor="text1"/>
-          <w:lang w:bidi="ar-EG"/>
-        </w:rPr>
-        <w:t xml:space="preserve">update User </w:t>
-      </w:r>
-      <w:r>
-        <w:rPr>
-          <w:b/>
-          <w:bCs/>
-          <w:color w:val="000000" w:themeColor="text1"/>
-          <w:lang w:bidi="ar-EG"/>
-        </w:rPr>
-        <w:t xml:space="preserve">         </w:t>
-      </w:r>
-    </w:p>
-    <w:p>
-      <w:pPr>
-        <w:bidi/>
-        <w:jc w:val="right"/>
-        <w:rPr>
-          <w:b/>
-          <w:bCs/>
-          <w:color w:val="000000" w:themeColor="text1"/>
-          <w:lang w:bidi="ar-EG"/>
-        </w:rPr>
-      </w:pPr>
-      <w:r>
-        <w:rPr>
-          <w:b/>
-          <w:bCs/>
-          <w:color w:val="000000" w:themeColor="text1"/>
-          <w:lang w:bidi="ar-EG"/>
-        </w:rPr>
-        <w:t>7</w:t>
-      </w:r>
-      <w:r>
-        <w:rPr>
-          <w:b/>
-          <w:bCs/>
-          <w:color w:val="00B050"/>
-          <w:lang w:bidi="ar-EG"/>
-        </w:rPr>
-        <w:t>-get All Appointments</w:t>
-      </w:r>
-      <w:r>
-        <w:rPr>
-          <w:b/>
-          <w:bCs/>
-          <w:color w:val="000000" w:themeColor="text1"/>
-          <w:lang w:bidi="ar-EG"/>
-        </w:rPr>
-        <w:t xml:space="preserve">    8-</w:t>
-      </w:r>
-      <w:r>
-        <w:rPr>
-          <w:b/>
-          <w:bCs/>
-          <w:color w:val="00B050"/>
-          <w:lang w:bidi="ar-EG"/>
-        </w:rPr>
-        <w:t xml:space="preserve">update the Appointment  </w:t>
-      </w:r>
-    </w:p>
-    <w:p>
-      <w:pPr>
-        <w:bidi/>
-        <w:jc w:val="right"/>
-        <w:rPr>
-          <w:b/>
-          <w:bCs/>
-          <w:color w:val="000000" w:themeColor="text1"/>
-          <w:lang w:bidi="ar-EG"/>
-        </w:rPr>
-      </w:pPr>
-      <w:r>
-        <w:rPr>
-          <w:b/>
-          <w:bCs/>
-          <w:color w:val="000000" w:themeColor="text1"/>
-          <w:lang w:bidi="ar-EG"/>
-        </w:rPr>
-        <w:t>9-</w:t>
-      </w:r>
-      <w:r>
-        <w:rPr>
-          <w:b/>
-          <w:bCs/>
-          <w:color w:val="00B050"/>
-          <w:lang w:bidi="ar-EG"/>
-        </w:rPr>
-        <w:t>Delete Appointment</w:t>
-      </w:r>
-      <w:r>
-        <w:rPr>
-          <w:b/>
-          <w:bCs/>
-          <w:color w:val="00B050"/>
-          <w:lang w:bidi="ar-EG"/>
-        </w:rPr>
-        <w:t xml:space="preserve">     </w:t>
-      </w:r>
-      <w:r>
-        <w:rPr>
-          <w:b/>
-          <w:bCs/>
-          <w:color w:val="000000" w:themeColor="text1"/>
-          <w:lang w:bidi="ar-EG"/>
-        </w:rPr>
-        <w:t xml:space="preserve">10-update User    </w:t>
-      </w:r>
-    </w:p>
-    <w:p>
-      <w:pPr>
-        <w:bidi/>
-        <w:jc w:val="right"/>
-        <w:rPr>
-          <w:b/>
-          <w:bCs/>
-          <w:color w:val="00B050"/>
-          <w:lang w:bidi="ar-EG"/>
-        </w:rPr>
-      </w:pPr>
-      <w:r>
-        <w:rPr>
-          <w:b/>
-          <w:bCs/>
-          <w:color w:val="00B050"/>
-          <w:lang w:bidi="ar-EG"/>
-        </w:rPr>
-        <w:t xml:space="preserve">11-Delete User  </w:t>
-      </w:r>
-      <w:r>
-        <w:rPr>
-          <w:b/>
-          <w:bCs/>
-          <w:color w:val="00B050"/>
-          <w:lang w:bidi="ar-EG"/>
-        </w:rPr>
-        <w:t xml:space="preserve">         </w:t>
-      </w:r>
-    </w:p>
-    <w:p>
-      <w:pPr>
-        <w:bidi/>
-        <w:jc w:val="right"/>
-        <w:rPr>
-          <w:b/>
-          <w:bCs/>
-          <w:color w:val="000000" w:themeColor="text1"/>
-          <w:rtl/>
-          <w:lang w:bidi="ar-EG"/>
-        </w:rPr>
-      </w:pPr>
-      <w:r>
-        <w:rPr>
-          <w:b/>
-          <w:bCs/>
-          <w:color w:val="000000" w:themeColor="text1"/>
-          <w:lang w:bidi="ar-EG"/>
-        </w:rPr>
-        <w:lastRenderedPageBreak/>
-        <w:t xml:space="preserve">14-get </w:t>
-      </w:r>
-      <w:proofErr w:type="gramStart"/>
-      <w:r>
-        <w:rPr>
-          <w:b/>
-          <w:bCs/>
-          <w:color w:val="000000" w:themeColor="text1"/>
-          <w:lang w:bidi="ar-EG"/>
-        </w:rPr>
-        <w:t>All  services</w:t>
-      </w:r>
-      <w:proofErr w:type="gramEnd"/>
-      <w:r>
-        <w:rPr>
-          <w:b/>
-          <w:bCs/>
-          <w:color w:val="000000" w:themeColor="text1"/>
-          <w:lang w:bidi="ar-EG"/>
-        </w:rPr>
-        <w:t xml:space="preserve">   </w:t>
-      </w:r>
-      <w:r>
-        <w:rPr>
-          <w:b/>
-          <w:bCs/>
-          <w:color w:val="000000" w:themeColor="text1"/>
-          <w:lang w:bidi="ar-EG"/>
-        </w:rPr>
-        <w:t>-create service</w:t>
-      </w:r>
-    </w:p>
-    <w:p>
-      <w:pPr>
-        <w:bidi/>
-        <w:jc w:val="right"/>
-        <w:rPr>
-          <w:b/>
-          <w:bCs/>
-          <w:color w:val="000000" w:themeColor="text1"/>
-          <w:lang w:bidi="ar-EG"/>
-        </w:rPr>
-      </w:pPr>
-      <w:r>
-        <w:rPr>
-          <w:b/>
-          <w:bCs/>
-          <w:color w:val="000000" w:themeColor="text1"/>
-          <w:lang w:bidi="ar-EG"/>
-        </w:rPr>
-        <w:t>15-update service    16-delete service</w:t>
-      </w:r>
-    </w:p>
-    <w:p>
-      <w:pPr>
-        <w:bidi/>
-        <w:jc w:val="right"/>
-        <w:rPr>
-          <w:b/>
-          <w:bCs/>
-          <w:color w:val="000000" w:themeColor="text1"/>
-          <w:lang w:bidi="ar-EG"/>
-        </w:rPr>
-      </w:pPr>
-      <w:r>
-        <w:rPr>
-          <w:b/>
-          <w:bCs/>
-          <w:color w:val="000000" w:themeColor="text1"/>
-          <w:lang w:bidi="ar-EG"/>
-        </w:rPr>
-        <w:t xml:space="preserve">15-get All slots   </w:t>
-      </w:r>
-      <w:r>
-        <w:rPr>
-          <w:b/>
-          <w:bCs/>
-          <w:color w:val="000000" w:themeColor="text1"/>
-          <w:lang w:bidi="ar-EG"/>
-        </w:rPr>
-        <w:t>-</w:t>
-      </w:r>
-      <w:proofErr w:type="spellStart"/>
-      <w:r>
-        <w:rPr>
-          <w:b/>
-          <w:bCs/>
-          <w:color w:val="000000" w:themeColor="text1"/>
-          <w:lang w:bidi="ar-EG"/>
-        </w:rPr>
-        <w:t>getsolt</w:t>
-      </w:r>
-      <w:proofErr w:type="spellEnd"/>
-    </w:p>
-    <w:p>
-      <w:pPr>
-        <w:bidi/>
-        <w:jc w:val="right"/>
-        <w:rPr>
-          <w:b/>
-          <w:bCs/>
-          <w:color w:val="000000" w:themeColor="text1"/>
-          <w:lang w:bidi="ar-EG"/>
-        </w:rPr>
-      </w:pPr>
-      <w:r>
-        <w:rPr>
-          <w:b/>
-          <w:bCs/>
-          <w:color w:val="000000" w:themeColor="text1"/>
-          <w:lang w:bidi="ar-EG"/>
-        </w:rPr>
-        <w:t xml:space="preserve"> 16-update Slot   17-delete Solt </w:t>
-      </w:r>
-    </w:p>
-    <w:p>
-      <w:pPr>
-        <w:bidi/>
-        <w:jc w:val="right"/>
-        <w:rPr>
-          <w:b/>
-          <w:bCs/>
-          <w:color w:val="A02B93" w:themeColor="accent5"/>
-          <w:lang w:bidi="ar-EG"/>
-        </w:rPr>
-      </w:pPr>
-      <w:r>
-        <w:rPr>
-          <w:b/>
-          <w:bCs/>
-          <w:color w:val="A02B93" w:themeColor="accent5"/>
-          <w:lang w:bidi="ar-EG"/>
-        </w:rPr>
         <w:t>Another Entities:</w:t>
       </w:r>
     </w:p>
@@ -1442,17 +1302,7 @@
           <w:color w:val="000000" w:themeColor="text1"/>
           <w:lang w:bidi="ar-EG"/>
         </w:rPr>
-        <w:t>(status</w:t>
-      </w:r>
-      <w:proofErr w:type="gramStart"/>
-      <w:r>
-        <w:rPr>
-          <w:b/>
-          <w:bCs/>
-          <w:color w:val="000000" w:themeColor="text1"/>
-          <w:lang w:bidi="ar-EG"/>
-        </w:rPr>
-        <w:t>)</w:t>
+        <w:t>(status)</w:t>
       </w:r>
       <w:r>
         <w:rPr>
@@ -1463,7 +1313,6 @@
         </w:rPr>
         <w:t>(</w:t>
       </w:r>
-      <w:proofErr w:type="gramEnd"/>
       <w:r>
         <w:rPr>
           <w:b/>
@@ -1619,7 +1468,6 @@
         </w:rPr>
         <w:pgNum/>
       </w:r>
-      <w:proofErr w:type="spellStart"/>
       <w:r>
         <w:rPr>
           <w:b/>
@@ -1629,7 +1477,6 @@
         </w:rPr>
         <w:t>atient</w:t>
       </w:r>
-      <w:proofErr w:type="spellEnd"/>
       <w:r>
         <w:rPr>
           <w:b/>
@@ -1688,155 +1535,206 @@
           <w:color w:val="000000" w:themeColor="text1"/>
           <w:lang w:bidi="ar-EG"/>
         </w:rPr>
+        <w:t>-dateOfBirth     -role</w:t>
+      </w:r>
+      <w:r>
+        <w:rPr>
+          <w:b/>
+          <w:bCs/>
+          <w:color w:val="000000" w:themeColor="text1"/>
+          <w:lang w:bidi="ar-EG"/>
+        </w:rPr>
+        <w:t>[enum]</w:t>
+      </w:r>
+      <w:r>
+        <w:rPr>
+          <w:b/>
+          <w:bCs/>
+          <w:color w:val="000000" w:themeColor="text1"/>
+          <w:lang w:bidi="ar-EG"/>
+        </w:rPr>
+        <w:t xml:space="preserve">     -gender</w:t>
+      </w:r>
+      <w:r>
+        <w:rPr>
+          <w:b/>
+          <w:bCs/>
+          <w:color w:val="000000" w:themeColor="text1"/>
+          <w:lang w:bidi="ar-EG"/>
+        </w:rPr>
+        <w:t>[enum]</w:t>
+      </w:r>
+      <w:r>
+        <w:rPr>
+          <w:b/>
+          <w:bCs/>
+          <w:color w:val="000000" w:themeColor="text1"/>
+          <w:lang w:bidi="ar-EG"/>
+        </w:rPr>
+        <w:t xml:space="preserve">     -address</w:t>
+      </w:r>
+    </w:p>
+    <w:p>
+      <w:pPr>
+        <w:bidi/>
+        <w:jc w:val="right"/>
+        <w:rPr>
+          <w:b/>
+          <w:bCs/>
+          <w:color w:val="000000" w:themeColor="text1"/>
+          <w:lang w:bidi="ar-EG"/>
+        </w:rPr>
+      </w:pPr>
+      <w:r>
+        <w:rPr>
+          <w:b/>
+          <w:bCs/>
+          <w:color w:val="000000" w:themeColor="text1"/>
+          <w:lang w:bidi="ar-EG"/>
+        </w:rPr>
+        <w:t>-phone     -isActive    -</w:t>
+      </w:r>
+    </w:p>
+    <w:p>
+      <w:pPr>
+        <w:bidi/>
+        <w:jc w:val="right"/>
+        <w:rPr>
+          <w:b/>
+          <w:bCs/>
+          <w:color w:val="7030A0"/>
+          <w:lang w:bidi="ar-EG"/>
+        </w:rPr>
+      </w:pPr>
+      <w:r>
+        <w:rPr>
+          <w:b/>
+          <w:bCs/>
+          <w:color w:val="7030A0"/>
+          <w:lang w:bidi="ar-EG"/>
+        </w:rPr>
+        <w:t>1-Docor</w:t>
+      </w:r>
+      <w:r>
+        <w:rPr>
+          <w:b/>
+          <w:bCs/>
+          <w:color w:val="7030A0"/>
+          <w:lang w:bidi="ar-EG"/>
+        </w:rPr>
+        <w:t>:</w:t>
+      </w:r>
+    </w:p>
+    <w:p>
+      <w:pPr>
+        <w:bidi/>
+        <w:jc w:val="right"/>
+        <w:rPr>
+          <w:b/>
+          <w:bCs/>
+          <w:lang w:bidi="ar-EG"/>
+        </w:rPr>
+      </w:pPr>
+      <w:r>
+        <w:rPr>
+          <w:b/>
+          <w:bCs/>
+          <w:lang w:bidi="ar-EG"/>
+        </w:rPr>
+        <w:t>-userId</w:t>
+      </w:r>
+    </w:p>
+    <w:p>
+      <w:pPr>
+        <w:bidi/>
+        <w:jc w:val="right"/>
+        <w:rPr>
+          <w:b/>
+          <w:bCs/>
+          <w:color w:val="000000" w:themeColor="text1"/>
+          <w:lang w:bidi="ar-EG"/>
+        </w:rPr>
+      </w:pPr>
+      <w:r>
+        <w:rPr>
+          <w:b/>
+          <w:bCs/>
+          <w:color w:val="000000" w:themeColor="text1"/>
+          <w:lang w:bidi="ar-EG"/>
+        </w:rPr>
         <w:t>-</w:t>
       </w:r>
-      <w:proofErr w:type="spellStart"/>
-      <w:r>
-        <w:rPr>
-          <w:b/>
-          <w:bCs/>
-          <w:color w:val="000000" w:themeColor="text1"/>
-          <w:lang w:bidi="ar-EG"/>
-        </w:rPr>
-        <w:t>dateOfBirth</w:t>
-      </w:r>
-      <w:proofErr w:type="spellEnd"/>
-      <w:r>
-        <w:rPr>
-          <w:b/>
-          <w:bCs/>
-          <w:color w:val="000000" w:themeColor="text1"/>
-          <w:lang w:bidi="ar-EG"/>
-        </w:rPr>
-        <w:t xml:space="preserve">     -role</w:t>
-      </w:r>
-      <w:r>
-        <w:rPr>
-          <w:b/>
-          <w:bCs/>
-          <w:color w:val="000000" w:themeColor="text1"/>
-          <w:lang w:bidi="ar-EG"/>
-        </w:rPr>
-        <w:t>[</w:t>
-      </w:r>
-      <w:proofErr w:type="spellStart"/>
-      <w:proofErr w:type="gramStart"/>
-      <w:r>
-        <w:rPr>
-          <w:b/>
-          <w:bCs/>
-          <w:color w:val="000000" w:themeColor="text1"/>
-          <w:lang w:bidi="ar-EG"/>
-        </w:rPr>
-        <w:t>enum</w:t>
-      </w:r>
-      <w:proofErr w:type="spellEnd"/>
-      <w:r>
-        <w:rPr>
-          <w:b/>
-          <w:bCs/>
-          <w:color w:val="000000" w:themeColor="text1"/>
-          <w:lang w:bidi="ar-EG"/>
-        </w:rPr>
-        <w:t>]</w:t>
-      </w:r>
-      <w:r>
-        <w:rPr>
-          <w:b/>
-          <w:bCs/>
-          <w:color w:val="000000" w:themeColor="text1"/>
-          <w:lang w:bidi="ar-EG"/>
-        </w:rPr>
-        <w:t xml:space="preserve">   </w:t>
-      </w:r>
-      <w:proofErr w:type="gramEnd"/>
-      <w:r>
-        <w:rPr>
-          <w:b/>
-          <w:bCs/>
-          <w:color w:val="000000" w:themeColor="text1"/>
-          <w:lang w:bidi="ar-EG"/>
-        </w:rPr>
-        <w:t xml:space="preserve">  -gender</w:t>
-      </w:r>
-      <w:r>
-        <w:rPr>
-          <w:b/>
-          <w:bCs/>
-          <w:color w:val="000000" w:themeColor="text1"/>
-          <w:lang w:bidi="ar-EG"/>
-        </w:rPr>
-        <w:t>[</w:t>
-      </w:r>
-      <w:proofErr w:type="spellStart"/>
-      <w:r>
-        <w:rPr>
-          <w:b/>
-          <w:bCs/>
-          <w:color w:val="000000" w:themeColor="text1"/>
-          <w:lang w:bidi="ar-EG"/>
-        </w:rPr>
-        <w:t>enum</w:t>
-      </w:r>
-      <w:proofErr w:type="spellEnd"/>
-      <w:r>
-        <w:rPr>
-          <w:b/>
-          <w:bCs/>
-          <w:color w:val="000000" w:themeColor="text1"/>
-          <w:lang w:bidi="ar-EG"/>
-        </w:rPr>
-        <w:t>]</w:t>
-      </w:r>
-      <w:r>
-        <w:rPr>
-          <w:b/>
-          <w:bCs/>
-          <w:color w:val="000000" w:themeColor="text1"/>
-          <w:lang w:bidi="ar-EG"/>
-        </w:rPr>
-        <w:t xml:space="preserve">     -address</w:t>
-      </w:r>
-    </w:p>
-    <w:p>
-      <w:pPr>
-        <w:bidi/>
-        <w:jc w:val="right"/>
-        <w:rPr>
-          <w:b/>
-          <w:bCs/>
-          <w:color w:val="000000" w:themeColor="text1"/>
-          <w:lang w:bidi="ar-EG"/>
-        </w:rPr>
-      </w:pPr>
-      <w:r>
-        <w:rPr>
-          <w:b/>
-          <w:bCs/>
-          <w:color w:val="000000" w:themeColor="text1"/>
-          <w:lang w:bidi="ar-EG"/>
-        </w:rPr>
-        <w:t>-phone     -</w:t>
-      </w:r>
-      <w:proofErr w:type="spellStart"/>
-      <w:r>
-        <w:rPr>
-          <w:b/>
-          <w:bCs/>
-          <w:color w:val="000000" w:themeColor="text1"/>
-          <w:lang w:bidi="ar-EG"/>
-        </w:rPr>
-        <w:t>isActive</w:t>
-      </w:r>
-      <w:proofErr w:type="spellEnd"/>
-      <w:r>
-        <w:rPr>
-          <w:b/>
-          <w:bCs/>
-          <w:color w:val="000000" w:themeColor="text1"/>
-          <w:lang w:bidi="ar-EG"/>
-        </w:rPr>
-        <w:t xml:space="preserve">    -</w:t>
+      <w:r>
+        <w:rPr>
+          <w:b/>
+          <w:bCs/>
+          <w:color w:val="000000" w:themeColor="text1"/>
+          <w:lang w:bidi="ar-EG"/>
+        </w:rPr>
+        <w:t>experience</w:t>
+      </w:r>
+    </w:p>
+    <w:p>
+      <w:pPr>
+        <w:bidi/>
+        <w:jc w:val="right"/>
+        <w:rPr>
+          <w:b/>
+          <w:bCs/>
+          <w:color w:val="000000" w:themeColor="text1"/>
+          <w:rtl/>
+          <w:lang w:bidi="ar-EG"/>
+        </w:rPr>
+      </w:pPr>
+      <w:r>
+        <w:rPr>
+          <w:b/>
+          <w:bCs/>
+          <w:color w:val="000000" w:themeColor="text1"/>
+          <w:lang w:bidi="ar-EG"/>
+        </w:rPr>
+        <w:t>-bio      -image    -</w:t>
+      </w:r>
+      <w:r>
+        <w:rPr>
+          <w:b/>
+          <w:bCs/>
+          <w:color w:val="000000" w:themeColor="text1"/>
+          <w:lang w:bidi="ar-EG"/>
+        </w:rPr>
+        <w:t>specialization</w:t>
+      </w:r>
+    </w:p>
+    <w:p>
+      <w:pPr>
+        <w:bidi/>
+        <w:jc w:val="right"/>
+        <w:rPr>
+          <w:b/>
+          <w:bCs/>
+          <w:color w:val="000000" w:themeColor="text1"/>
+          <w:lang w:bidi="ar-EG"/>
+        </w:rPr>
+      </w:pPr>
+      <w:r>
+        <w:rPr>
+          <w:b/>
+          <w:bCs/>
+          <w:color w:val="000000" w:themeColor="text1"/>
+          <w:lang w:bidi="ar-EG"/>
+        </w:rPr>
+        <w:t>consultation_fee</w:t>
+      </w:r>
+      <w:r>
+        <w:rPr>
+          <w:rFonts w:hint="cs"/>
+          <w:b/>
+          <w:bCs/>
+          <w:color w:val="000000" w:themeColor="text1"/>
+          <w:rtl/>
+          <w:lang w:bidi="ar-EG"/>
+        </w:rPr>
+        <w:t>-</w:t>
       </w:r>
     </w:p>
     <w:p>
@@ -1857,75 +1755,130 @@
           <w:color w:val="7030A0"/>
           <w:lang w:bidi="ar-EG"/>
         </w:rPr>
-        <w:t>1-Docor</w:t>
-      </w:r>
-      <w:r>
+        <w:t>3-Service:</w:t>
+      </w:r>
+    </w:p>
+    <w:p>
+      <w:pPr>
+        <w:bidi/>
+        <w:jc w:val="right"/>
+        <w:rPr>
+          <w:b/>
+          <w:bCs/>
+          <w:color w:val="000000" w:themeColor="text1"/>
+          <w:lang w:bidi="ar-EG"/>
+        </w:rPr>
+      </w:pPr>
+      <w:r>
+        <w:rPr>
+          <w:b/>
+          <w:bCs/>
+          <w:color w:val="000000" w:themeColor="text1"/>
+          <w:lang w:bidi="ar-EG"/>
+        </w:rPr>
+        <w:t xml:space="preserve">-name    -price    -description </w:t>
+      </w:r>
+    </w:p>
+    <w:p>
+      <w:pPr>
+        <w:bidi/>
+        <w:jc w:val="right"/>
         <w:rPr>
           <w:b/>
           <w:bCs/>
           <w:color w:val="7030A0"/>
           <w:lang w:bidi="ar-EG"/>
         </w:rPr>
+      </w:pPr>
+      <w:r>
+        <w:rPr>
+          <w:b/>
+          <w:bCs/>
+          <w:color w:val="7030A0"/>
+          <w:lang w:bidi="ar-EG"/>
+        </w:rPr>
+        <w:t>-service_booking:</w:t>
+      </w:r>
+    </w:p>
+    <w:p>
+      <w:pPr>
+        <w:bidi/>
+        <w:jc w:val="right"/>
+        <w:rPr>
+          <w:b/>
+          <w:bCs/>
+          <w:color w:val="000000" w:themeColor="text1"/>
+          <w:lang w:bidi="ar-EG"/>
+        </w:rPr>
+      </w:pPr>
+      <w:r>
+        <w:rPr>
+          <w:b/>
+          <w:bCs/>
+          <w:color w:val="000000" w:themeColor="text1"/>
+          <w:lang w:bidi="ar-EG"/>
+        </w:rPr>
+        <w:t xml:space="preserve">-p_id     -ser_id    -date      </w:t>
+      </w:r>
+    </w:p>
+    <w:p>
+      <w:pPr>
+        <w:bidi/>
+        <w:jc w:val="right"/>
+        <w:rPr>
+          <w:b/>
+          <w:bCs/>
+          <w:color w:val="000000" w:themeColor="text1"/>
+          <w:lang w:bidi="ar-EG"/>
+        </w:rPr>
+      </w:pPr>
+      <w:r>
+        <w:rPr>
+          <w:b/>
+          <w:bCs/>
+          <w:color w:val="7030A0"/>
+          <w:lang w:bidi="ar-EG"/>
+        </w:rPr>
+        <w:t>4-slot</w:t>
+      </w:r>
+      <w:r>
+        <w:rPr>
+          <w:b/>
+          <w:bCs/>
+          <w:color w:val="7030A0"/>
+          <w:lang w:bidi="ar-EG"/>
+        </w:rPr>
         <w:t>:</w:t>
       </w:r>
-    </w:p>
-    <w:p>
-      <w:pPr>
-        <w:bidi/>
-        <w:jc w:val="right"/>
-        <w:rPr>
-          <w:b/>
-          <w:bCs/>
-          <w:lang w:bidi="ar-EG"/>
-        </w:rPr>
-      </w:pPr>
-      <w:r>
-        <w:rPr>
-          <w:b/>
-          <w:bCs/>
-          <w:lang w:bidi="ar-EG"/>
-        </w:rPr>
-        <w:t>-</w:t>
-      </w:r>
-      <w:proofErr w:type="spellStart"/>
-      <w:r>
-        <w:rPr>
-          <w:b/>
-          <w:bCs/>
-          <w:lang w:bidi="ar-EG"/>
-        </w:rPr>
-        <w:t>userId</w:t>
-      </w:r>
-      <w:proofErr w:type="spellEnd"/>
-    </w:p>
-    <w:p>
-      <w:pPr>
-        <w:bidi/>
-        <w:jc w:val="right"/>
-        <w:rPr>
-          <w:b/>
-          <w:bCs/>
-          <w:color w:val="000000" w:themeColor="text1"/>
-          <w:lang w:bidi="ar-EG"/>
-        </w:rPr>
-      </w:pPr>
-      <w:r>
-        <w:rPr>
-          <w:b/>
-          <w:bCs/>
-          <w:color w:val="000000" w:themeColor="text1"/>
-          <w:lang w:bidi="ar-EG"/>
-        </w:rPr>
-        <w:t>-</w:t>
-      </w:r>
-      <w:r>
-        <w:rPr>
-          <w:b/>
-          <w:bCs/>
-          <w:color w:val="000000" w:themeColor="text1"/>
-          <w:lang w:bidi="ar-EG"/>
-        </w:rPr>
-        <w:t>experience</w:t>
+      <w:r>
+        <w:rPr>
+          <w:b/>
+          <w:bCs/>
+          <w:color w:val="000000" w:themeColor="text1"/>
+          <w:lang w:bidi="ar-EG"/>
+        </w:rPr>
+        <w:t xml:space="preserve"> </w:t>
+      </w:r>
+    </w:p>
+    <w:p>
+      <w:pPr>
+        <w:bidi/>
+        <w:jc w:val="right"/>
+        <w:rPr>
+          <w:b/>
+          <w:bCs/>
+          <w:color w:val="000000" w:themeColor="text1"/>
+          <w:lang w:bidi="ar-EG"/>
+        </w:rPr>
+      </w:pPr>
+      <w:r>
+        <w:rPr>
+          <w:b/>
+          <w:bCs/>
+          <w:color w:val="000000" w:themeColor="text1"/>
+          <w:lang w:bidi="ar-EG"/>
+        </w:rPr>
+        <w:t xml:space="preserve">-Dr_id   -date </w:t>
       </w:r>
     </w:p>
     <w:p>
@@ -1947,370 +1900,29 @@
           <w:color w:val="000000" w:themeColor="text1"/>
           <w:lang w:bidi="ar-EG"/>
         </w:rPr>
-        <w:t>-bio      -image    -</w:t>
-      </w:r>
-      <w:r>
-        <w:rPr>
-          <w:b/>
-          <w:bCs/>
-          <w:color w:val="000000" w:themeColor="text1"/>
-          <w:lang w:bidi="ar-EG"/>
-        </w:rPr>
-        <w:t>specialization</w:t>
-      </w:r>
-    </w:p>
-    <w:p>
-      <w:pPr>
-        <w:bidi/>
-        <w:jc w:val="right"/>
-        <w:rPr>
-          <w:b/>
-          <w:bCs/>
-          <w:color w:val="000000" w:themeColor="text1"/>
-          <w:lang w:bidi="ar-EG"/>
-        </w:rPr>
-      </w:pPr>
-      <w:proofErr w:type="spellStart"/>
-      <w:r>
-        <w:rPr>
-          <w:b/>
-          <w:bCs/>
-          <w:color w:val="000000" w:themeColor="text1"/>
-          <w:lang w:bidi="ar-EG"/>
-        </w:rPr>
-        <w:t>consultation_fee</w:t>
-      </w:r>
-      <w:proofErr w:type="spellEnd"/>
-      <w:r>
-        <w:rPr>
-          <w:rFonts w:hint="cs"/>
-          <w:b/>
-          <w:bCs/>
-          <w:color w:val="000000" w:themeColor="text1"/>
-          <w:rtl/>
-          <w:lang w:bidi="ar-EG"/>
-        </w:rPr>
-        <w:t>-</w:t>
-      </w:r>
-    </w:p>
-    <w:p>
-      <w:pPr>
-        <w:bidi/>
-        <w:jc w:val="right"/>
-        <w:rPr>
-          <w:b/>
-          <w:bCs/>
-          <w:color w:val="7030A0"/>
-          <w:lang w:bidi="ar-EG"/>
-        </w:rPr>
-      </w:pPr>
-      <w:r>
-        <w:rPr>
-          <w:b/>
-          <w:bCs/>
-          <w:color w:val="7030A0"/>
-          <w:lang w:bidi="ar-EG"/>
-        </w:rPr>
-        <w:t>3-Service:</w:t>
-      </w:r>
-    </w:p>
-    <w:p>
-      <w:pPr>
-        <w:bidi/>
-        <w:jc w:val="right"/>
-        <w:rPr>
-          <w:b/>
-          <w:bCs/>
-          <w:color w:val="000000" w:themeColor="text1"/>
-          <w:lang w:bidi="ar-EG"/>
-        </w:rPr>
-      </w:pPr>
-      <w:r>
-        <w:rPr>
-          <w:b/>
-          <w:bCs/>
-          <w:color w:val="000000" w:themeColor="text1"/>
-          <w:lang w:bidi="ar-EG"/>
-        </w:rPr>
-        <w:t xml:space="preserve">-name    -price    -description </w:t>
-      </w:r>
-    </w:p>
-    <w:p>
-      <w:pPr>
-        <w:bidi/>
-        <w:jc w:val="right"/>
-        <w:rPr>
-          <w:b/>
-          <w:bCs/>
-          <w:color w:val="7030A0"/>
-          <w:lang w:bidi="ar-EG"/>
-        </w:rPr>
-      </w:pPr>
-      <w:r>
-        <w:rPr>
-          <w:b/>
-          <w:bCs/>
-          <w:color w:val="7030A0"/>
-          <w:lang w:bidi="ar-EG"/>
-        </w:rPr>
-        <w:t>-</w:t>
-      </w:r>
-      <w:proofErr w:type="spellStart"/>
-      <w:r>
-        <w:rPr>
-          <w:b/>
-          <w:bCs/>
-          <w:color w:val="7030A0"/>
-          <w:lang w:bidi="ar-EG"/>
-        </w:rPr>
-        <w:t>service_booking</w:t>
-      </w:r>
-      <w:proofErr w:type="spellEnd"/>
-      <w:r>
-        <w:rPr>
-          <w:b/>
-          <w:bCs/>
-          <w:color w:val="7030A0"/>
-          <w:lang w:bidi="ar-EG"/>
-        </w:rPr>
-        <w:t>:</w:t>
-      </w:r>
-    </w:p>
-    <w:p>
-      <w:pPr>
-        <w:bidi/>
-        <w:jc w:val="right"/>
-        <w:rPr>
-          <w:b/>
-          <w:bCs/>
-          <w:color w:val="000000" w:themeColor="text1"/>
-          <w:lang w:bidi="ar-EG"/>
-        </w:rPr>
-      </w:pPr>
-      <w:r>
-        <w:rPr>
-          <w:b/>
-          <w:bCs/>
-          <w:color w:val="000000" w:themeColor="text1"/>
-          <w:lang w:bidi="ar-EG"/>
-        </w:rPr>
-        <w:t>-</w:t>
-      </w:r>
-      <w:proofErr w:type="spellStart"/>
-      <w:r>
-        <w:rPr>
-          <w:b/>
-          <w:bCs/>
-          <w:color w:val="000000" w:themeColor="text1"/>
-          <w:lang w:bidi="ar-EG"/>
-        </w:rPr>
-        <w:t>p_id</w:t>
-      </w:r>
-      <w:proofErr w:type="spellEnd"/>
-      <w:r>
-        <w:rPr>
-          <w:b/>
-          <w:bCs/>
-          <w:color w:val="000000" w:themeColor="text1"/>
-          <w:lang w:bidi="ar-EG"/>
-        </w:rPr>
-        <w:t xml:space="preserve">     -</w:t>
-      </w:r>
-      <w:proofErr w:type="spellStart"/>
-      <w:r>
-        <w:rPr>
-          <w:b/>
-          <w:bCs/>
-          <w:color w:val="000000" w:themeColor="text1"/>
-          <w:lang w:bidi="ar-EG"/>
-        </w:rPr>
-        <w:t>ser_id</w:t>
-      </w:r>
-      <w:proofErr w:type="spellEnd"/>
-      <w:r>
-        <w:rPr>
-          <w:b/>
-          <w:bCs/>
-          <w:color w:val="000000" w:themeColor="text1"/>
-          <w:lang w:bidi="ar-EG"/>
-        </w:rPr>
-        <w:t xml:space="preserve">    -date      </w:t>
-      </w:r>
-    </w:p>
-    <w:p>
-      <w:pPr>
-        <w:bidi/>
-        <w:jc w:val="right"/>
-        <w:rPr>
-          <w:b/>
-          <w:bCs/>
-          <w:color w:val="000000" w:themeColor="text1"/>
-          <w:lang w:bidi="ar-EG"/>
-        </w:rPr>
-      </w:pPr>
-      <w:r>
-        <w:rPr>
-          <w:b/>
-          <w:bCs/>
-          <w:color w:val="7030A0"/>
-          <w:lang w:bidi="ar-EG"/>
-        </w:rPr>
-        <w:t>4-slot</w:t>
-      </w:r>
-      <w:r>
-        <w:rPr>
-          <w:b/>
-          <w:bCs/>
-          <w:color w:val="7030A0"/>
-          <w:lang w:bidi="ar-EG"/>
-        </w:rPr>
-        <w:t>:</w:t>
-      </w:r>
-      <w:r>
-        <w:rPr>
-          <w:b/>
-          <w:bCs/>
-          <w:color w:val="000000" w:themeColor="text1"/>
-          <w:lang w:bidi="ar-EG"/>
-        </w:rPr>
-        <w:t xml:space="preserve"> </w:t>
-      </w:r>
-    </w:p>
-    <w:p>
-      <w:pPr>
-        <w:bidi/>
-        <w:jc w:val="right"/>
-        <w:rPr>
-          <w:b/>
-          <w:bCs/>
-          <w:color w:val="000000" w:themeColor="text1"/>
-          <w:lang w:bidi="ar-EG"/>
-        </w:rPr>
-      </w:pPr>
-      <w:r>
-        <w:rPr>
-          <w:b/>
-          <w:bCs/>
-          <w:color w:val="000000" w:themeColor="text1"/>
-          <w:lang w:bidi="ar-EG"/>
-        </w:rPr>
-        <w:t>-</w:t>
-      </w:r>
-      <w:proofErr w:type="spellStart"/>
-      <w:r>
-        <w:rPr>
-          <w:b/>
-          <w:bCs/>
-          <w:color w:val="000000" w:themeColor="text1"/>
-          <w:lang w:bidi="ar-EG"/>
-        </w:rPr>
-        <w:t>Dr_id</w:t>
-      </w:r>
-      <w:proofErr w:type="spellEnd"/>
-      <w:r>
-        <w:rPr>
-          <w:b/>
-          <w:bCs/>
-          <w:color w:val="000000" w:themeColor="text1"/>
-          <w:lang w:bidi="ar-EG"/>
-        </w:rPr>
-        <w:t xml:space="preserve">   -date </w:t>
-      </w:r>
-    </w:p>
-    <w:p>
-      <w:pPr>
-        <w:bidi/>
-        <w:jc w:val="right"/>
-        <w:rPr>
-          <w:b/>
-          <w:bCs/>
-          <w:color w:val="000000" w:themeColor="text1"/>
-          <w:rtl/>
-          <w:lang w:bidi="ar-EG"/>
-        </w:rPr>
-      </w:pPr>
-      <w:r>
-        <w:rPr>
-          <w:b/>
-          <w:bCs/>
-          <w:color w:val="000000" w:themeColor="text1"/>
-          <w:lang w:bidi="ar-EG"/>
-        </w:rPr>
-        <w:t xml:space="preserve"> -</w:t>
-      </w:r>
-      <w:proofErr w:type="spellStart"/>
-      <w:r>
-        <w:rPr>
-          <w:b/>
-          <w:bCs/>
-          <w:color w:val="000000" w:themeColor="text1"/>
-          <w:lang w:bidi="ar-EG"/>
-        </w:rPr>
-        <w:t>start_time</w:t>
-      </w:r>
-      <w:proofErr w:type="spellEnd"/>
-      <w:r>
-        <w:rPr>
-          <w:b/>
-          <w:bCs/>
-          <w:color w:val="000000" w:themeColor="text1"/>
-          <w:lang w:bidi="ar-EG"/>
-        </w:rPr>
-        <w:t xml:space="preserve">   -</w:t>
-      </w:r>
-      <w:proofErr w:type="spellStart"/>
-      <w:r>
-        <w:rPr>
-          <w:b/>
-          <w:bCs/>
-          <w:color w:val="000000" w:themeColor="text1"/>
-          <w:lang w:bidi="ar-EG"/>
-        </w:rPr>
-        <w:t>end_time</w:t>
-      </w:r>
-      <w:proofErr w:type="spellEnd"/>
-      <w:r>
-        <w:rPr>
-          <w:b/>
-          <w:bCs/>
-          <w:color w:val="000000" w:themeColor="text1"/>
-          <w:lang w:bidi="ar-EG"/>
-        </w:rPr>
-        <w:t xml:space="preserve"> </w:t>
-      </w:r>
-    </w:p>
-    <w:p>
-      <w:pPr>
-        <w:bidi/>
-        <w:jc w:val="right"/>
-        <w:rPr>
-          <w:b/>
-          <w:bCs/>
-          <w:color w:val="000000" w:themeColor="text1"/>
-          <w:lang w:bidi="ar-EG"/>
-        </w:rPr>
-      </w:pPr>
-      <w:r>
-        <w:rPr>
-          <w:b/>
-          <w:bCs/>
-          <w:color w:val="000000" w:themeColor="text1"/>
-          <w:lang w:bidi="ar-EG"/>
-        </w:rPr>
-        <w:t xml:space="preserve"> -</w:t>
-      </w:r>
-      <w:proofErr w:type="gramStart"/>
-      <w:r>
-        <w:rPr>
-          <w:b/>
-          <w:bCs/>
-          <w:color w:val="000000" w:themeColor="text1"/>
-          <w:lang w:bidi="ar-EG"/>
-        </w:rPr>
-        <w:t>status  (</w:t>
-      </w:r>
-      <w:proofErr w:type="spellStart"/>
-      <w:proofErr w:type="gramEnd"/>
+        <w:t xml:space="preserve"> -start_time   -end_time </w:t>
+      </w:r>
+    </w:p>
+    <w:p>
+      <w:pPr>
+        <w:bidi/>
+        <w:jc w:val="right"/>
+        <w:rPr>
+          <w:b/>
+          <w:bCs/>
+          <w:color w:val="000000" w:themeColor="text1"/>
+          <w:lang w:bidi="ar-EG"/>
+        </w:rPr>
+      </w:pPr>
+      <w:r>
+        <w:rPr>
+          <w:b/>
+          <w:bCs/>
+          <w:color w:val="000000" w:themeColor="text1"/>
+          <w:lang w:bidi="ar-EG"/>
+        </w:rPr>
+        <w:t xml:space="preserve"> -status  (</w:t>
+      </w:r>
       <w:r>
         <w:rPr>
           <w:b/>
@@ -2338,7 +1950,6 @@
         </w:rPr>
         <w:t>CANCELLED</w:t>
       </w:r>
-      <w:proofErr w:type="spellEnd"/>
       <w:r>
         <w:rPr>
           <w:b/>
@@ -2369,17 +1980,7 @@
         </w:rPr>
         <w:lastRenderedPageBreak/>
         <w:tab/>
-        <w:t xml:space="preserve"> -</w:t>
-      </w:r>
-      <w:proofErr w:type="spellStart"/>
-      <w:r>
-        <w:rPr>
-          <w:b/>
-          <w:bCs/>
-          <w:color w:val="000000" w:themeColor="text1"/>
-          <w:lang w:bidi="ar-EG"/>
-        </w:rPr>
-        <w:t>numOf</w:t>
+        <w:t xml:space="preserve"> -numOf</w:t>
       </w:r>
       <w:r>
         <w:rPr>
@@ -2390,7 +1991,6 @@
         </w:rPr>
         <w:t>Patient</w:t>
       </w:r>
-      <w:proofErr w:type="spellEnd"/>
     </w:p>
     <w:p>
       <w:pPr>
@@ -2431,48 +2031,17 @@
           <w:color w:val="000000" w:themeColor="text1"/>
           <w:lang w:bidi="ar-EG"/>
         </w:rPr>
-        <w:t xml:space="preserve">    -</w:t>
-      </w:r>
-      <w:proofErr w:type="spellStart"/>
-      <w:r>
-        <w:rPr>
-          <w:b/>
-          <w:bCs/>
-          <w:color w:val="000000" w:themeColor="text1"/>
-          <w:lang w:bidi="ar-EG"/>
-        </w:rPr>
-        <w:t>P_id</w:t>
-      </w:r>
-      <w:proofErr w:type="spellEnd"/>
-      <w:r>
-        <w:rPr>
-          <w:b/>
-          <w:bCs/>
-          <w:color w:val="000000" w:themeColor="text1"/>
-          <w:lang w:bidi="ar-EG"/>
-        </w:rPr>
-        <w:t xml:space="preserve">   </w:t>
-      </w:r>
-      <w:r>
-        <w:rPr>
-          <w:b/>
-          <w:bCs/>
-          <w:color w:val="000000" w:themeColor="text1"/>
-          <w:lang w:bidi="ar-EG"/>
-        </w:rPr>
-        <w:t>-</w:t>
-      </w:r>
-      <w:proofErr w:type="spellStart"/>
-      <w:r>
-        <w:rPr>
-          <w:b/>
-          <w:bCs/>
-          <w:color w:val="000000" w:themeColor="text1"/>
-          <w:lang w:bidi="ar-EG"/>
-        </w:rPr>
-        <w:t>SlotId</w:t>
-      </w:r>
-      <w:proofErr w:type="spellEnd"/>
+        <w:t xml:space="preserve">    -P_id   </w:t>
+      </w:r>
+      <w:r>
+        <w:rPr>
+          <w:b/>
+          <w:bCs/>
+          <w:color w:val="000000" w:themeColor="text1"/>
+          <w:lang w:bidi="ar-EG"/>
+        </w:rPr>
+        <w:t>-SlotId</w:t>
+      </w:r>
     </w:p>
     <w:p>
       <w:pPr>
@@ -2588,79 +2157,28 @@
           <w:color w:val="000000" w:themeColor="text1"/>
           <w:lang w:bidi="ar-EG"/>
         </w:rPr>
-        <w:t>-</w:t>
-      </w:r>
-      <w:proofErr w:type="spellStart"/>
-      <w:r>
-        <w:rPr>
-          <w:b/>
-          <w:bCs/>
-          <w:color w:val="000000" w:themeColor="text1"/>
-          <w:lang w:bidi="ar-EG"/>
-        </w:rPr>
-        <w:t>P_id</w:t>
-      </w:r>
-      <w:proofErr w:type="spellEnd"/>
-      <w:r>
-        <w:rPr>
-          <w:b/>
-          <w:bCs/>
-          <w:color w:val="000000" w:themeColor="text1"/>
-          <w:lang w:bidi="ar-EG"/>
-        </w:rPr>
-        <w:t xml:space="preserve">     -</w:t>
-      </w:r>
-      <w:proofErr w:type="spellStart"/>
-      <w:r>
-        <w:rPr>
-          <w:b/>
-          <w:bCs/>
-          <w:color w:val="000000" w:themeColor="text1"/>
-          <w:lang w:bidi="ar-EG"/>
-        </w:rPr>
-        <w:t>app_id</w:t>
-      </w:r>
-      <w:proofErr w:type="spellEnd"/>
-    </w:p>
-    <w:p>
-      <w:pPr>
-        <w:bidi/>
-        <w:jc w:val="right"/>
-        <w:rPr>
-          <w:b/>
-          <w:bCs/>
-          <w:color w:val="000000" w:themeColor="text1"/>
-          <w:lang w:bidi="ar-EG"/>
-        </w:rPr>
-      </w:pPr>
-      <w:r>
-        <w:rPr>
-          <w:b/>
-          <w:bCs/>
-          <w:color w:val="000000" w:themeColor="text1"/>
-          <w:lang w:bidi="ar-EG"/>
-        </w:rPr>
-        <w:t>-</w:t>
-      </w:r>
-      <w:proofErr w:type="gramStart"/>
-      <w:r>
-        <w:rPr>
-          <w:b/>
-          <w:bCs/>
-          <w:color w:val="000000" w:themeColor="text1"/>
-          <w:lang w:bidi="ar-EG"/>
-        </w:rPr>
-        <w:t>services[</w:t>
-      </w:r>
-      <w:proofErr w:type="gramEnd"/>
-      <w:r>
-        <w:rPr>
-          <w:b/>
-          <w:bCs/>
-          <w:color w:val="000000" w:themeColor="text1"/>
-          <w:lang w:bidi="ar-EG"/>
-        </w:rPr>
-        <w:t>]</w:t>
+        <w:t>-P_id     -app_id</w:t>
+      </w:r>
+    </w:p>
+    <w:p>
+      <w:pPr>
+        <w:bidi/>
+        <w:jc w:val="right"/>
+        <w:rPr>
+          <w:b/>
+          <w:bCs/>
+          <w:color w:val="000000" w:themeColor="text1"/>
+          <w:lang w:bidi="ar-EG"/>
+        </w:rPr>
+      </w:pPr>
+      <w:r>
+        <w:rPr>
+          <w:b/>
+          <w:bCs/>
+          <w:color w:val="000000" w:themeColor="text1"/>
+          <w:lang w:bidi="ar-EG"/>
+        </w:rPr>
+        <w:t>-services[]</w:t>
       </w:r>
       <w:r>
         <w:rPr>
@@ -3390,6 +2908,7 @@
           <w:rFonts w:ascii="Times New Roman" w:eastAsia="Times New Roman" w:hAnsi="Times New Roman" w:cs="Times New Roman"/>
           <w:b/>
           <w:bCs/>
+          <w:color w:val="00B050"/>
           <w:kern w:val="36"/>
           <w:sz w:val="48"/>
           <w:szCs w:val="48"/>
@@ -3401,6 +2920,7 @@
           <w:rFonts w:ascii="Times New Roman" w:eastAsia="Times New Roman" w:hAnsi="Times New Roman" w:cs="Times New Roman"/>
           <w:b/>
           <w:bCs/>
+          <w:color w:val="00B050"/>
           <w:kern w:val="36"/>
           <w:sz w:val="48"/>
           <w:szCs w:val="48"/>
@@ -3432,6 +2952,7 @@
         <w:spacing w:after="0" w:line="240" w:lineRule="auto"/>
         <w:rPr>
           <w:rFonts w:asciiTheme="minorBidi" w:eastAsia="Times New Roman" w:hAnsiTheme="minorBidi"/>
+          <w:color w:val="00B050"/>
           <w:kern w:val="0"/>
           <w:sz w:val="20"/>
           <w:szCs w:val="20"/>
@@ -3441,39 +2962,41 @@
       <w:r>
         <w:rPr>
           <w:rFonts w:asciiTheme="minorBidi" w:eastAsia="Times New Roman" w:hAnsiTheme="minorBidi"/>
+          <w:color w:val="00B050"/>
           <w:kern w:val="0"/>
           <w:sz w:val="20"/>
           <w:szCs w:val="20"/>
           <w14:ligatures w14:val="none"/>
         </w:rPr>
-        <w:t>GET /patients/me/</w:t>
-      </w:r>
-      <w:proofErr w:type="gramStart"/>
-      <w:r>
-        <w:rPr>
-          <w:rFonts w:asciiTheme="minorBidi" w:eastAsia="Times New Roman" w:hAnsiTheme="minorBidi"/>
-          <w:kern w:val="0"/>
-          <w:sz w:val="20"/>
-          <w:szCs w:val="20"/>
-          <w14:ligatures w14:val="none"/>
-        </w:rPr>
-        <w:t>medical-history</w:t>
-      </w:r>
-      <w:proofErr w:type="gramEnd"/>
+        <w:t>GET /patients/me/medical-history</w:t>
+      </w:r>
     </w:p>
     <w:p>
       <w:pPr>
         <w:pStyle w:val="pdq2pgselectionanchorcontainer"/>
-      </w:pPr>
-      <w:r>
-        <w:rPr>
+        <w:rPr>
+          <w:color w:val="00B050"/>
+        </w:rPr>
+      </w:pPr>
+      <w:r>
+        <w:rPr>
+          <w:color w:val="00B050"/>
           <w:rtl/>
         </w:rPr>
         <w:t>وتجمع الـ</w:t>
       </w:r>
       <w:r>
+        <w:rPr>
+          <w:color w:val="00B050"/>
+        </w:rPr>
         <w:t xml:space="preserve"> completed appointments + prescriptions.</w:t>
       </w:r>
+      <w:r>
+        <w:rPr>
+          <w:color w:val="00B050"/>
+        </w:rPr>
+        <w:t xml:space="preserve"> +service Booking</w:t>
+      </w:r>
     </w:p>
     <w:p>
       <w:pPr>
@@ -3486,6 +3009,7 @@
         <w:rPr>
           <w:b/>
           <w:bCs/>
+          <w:color w:val="00B050"/>
           <w:sz w:val="28"/>
           <w:szCs w:val="28"/>
         </w:rPr>
@@ -3494,6 +3018,7 @@
         <w:rPr>
           <w:b/>
           <w:bCs/>
+          <w:color w:val="00B050"/>
           <w:sz w:val="28"/>
           <w:szCs w:val="28"/>
         </w:rPr>
@@ -3511,12 +3036,16 @@
         <w:rPr>
           <w:b/>
           <w:bCs/>
+          <w:color w:val="00B050"/>
           <w:sz w:val="28"/>
           <w:szCs w:val="28"/>
           <w:rtl/>
         </w:rPr>
       </w:pPr>
       <w:r>
+        <w:rPr>
+          <w:color w:val="00B050"/>
+        </w:rPr>
         <w:t>Patient</w:t>
       </w:r>
     </w:p>
@@ -3531,23 +3060,23 @@
         <w:rPr>
           <w:b/>
           <w:bCs/>
-          <w:sz w:val="24"/>
-          <w:szCs w:val="24"/>
-          <w:lang w:bidi="ar-EG"/>
-        </w:rPr>
-      </w:pPr>
-      <w:proofErr w:type="spellStart"/>
-      <w:r>
-        <w:rPr>
-          <w:b/>
-          <w:bCs/>
+          <w:color w:val="00B050"/>
+          <w:sz w:val="24"/>
+          <w:szCs w:val="24"/>
+          <w:lang w:bidi="ar-EG"/>
+        </w:rPr>
+      </w:pPr>
+      <w:r>
+        <w:rPr>
+          <w:b/>
+          <w:bCs/>
+          <w:color w:val="00B050"/>
           <w:sz w:val="24"/>
           <w:szCs w:val="24"/>
           <w:lang w:bidi="ar-EG"/>
         </w:rPr>
         <w:t>bookService</w:t>
       </w:r>
-      <w:proofErr w:type="spellEnd"/>
     </w:p>
     <w:p>
       <w:pPr>
@@ -3560,23 +3089,23 @@
         <w:rPr>
           <w:b/>
           <w:bCs/>
-          <w:sz w:val="24"/>
-          <w:szCs w:val="24"/>
-          <w:lang w:bidi="ar-EG"/>
-        </w:rPr>
-      </w:pPr>
-      <w:proofErr w:type="spellStart"/>
-      <w:r>
-        <w:rPr>
-          <w:b/>
-          <w:bCs/>
+          <w:color w:val="00B050"/>
+          <w:sz w:val="24"/>
+          <w:szCs w:val="24"/>
+          <w:lang w:bidi="ar-EG"/>
+        </w:rPr>
+      </w:pPr>
+      <w:r>
+        <w:rPr>
+          <w:b/>
+          <w:bCs/>
+          <w:color w:val="00B050"/>
           <w:sz w:val="24"/>
           <w:szCs w:val="24"/>
           <w:lang w:bidi="ar-EG"/>
         </w:rPr>
         <w:t>getMyServiceBookings</w:t>
       </w:r>
-      <w:proofErr w:type="spellEnd"/>
     </w:p>
     <w:p>
       <w:pPr>
@@ -3589,23 +3118,23 @@
         <w:rPr>
           <w:b/>
           <w:bCs/>
-          <w:sz w:val="24"/>
-          <w:szCs w:val="24"/>
-          <w:lang w:bidi="ar-EG"/>
-        </w:rPr>
-      </w:pPr>
-      <w:proofErr w:type="spellStart"/>
-      <w:r>
-        <w:rPr>
-          <w:b/>
-          <w:bCs/>
+          <w:color w:val="00B050"/>
+          <w:sz w:val="24"/>
+          <w:szCs w:val="24"/>
+          <w:lang w:bidi="ar-EG"/>
+        </w:rPr>
+      </w:pPr>
+      <w:r>
+        <w:rPr>
+          <w:b/>
+          <w:bCs/>
+          <w:color w:val="00B050"/>
           <w:sz w:val="24"/>
           <w:szCs w:val="24"/>
           <w:lang w:bidi="ar-EG"/>
         </w:rPr>
         <w:t>cancelServiceBooking</w:t>
       </w:r>
-      <w:proofErr w:type="spellEnd"/>
     </w:p>
     <w:p>
       <w:pPr>
@@ -3615,8 +3144,14 @@
         <w:bidi/>
         <w:spacing w:line="240" w:lineRule="auto"/>
         <w:jc w:val="right"/>
-      </w:pPr>
-      <w:r>
+        <w:rPr>
+          <w:color w:val="00B050"/>
+        </w:rPr>
+      </w:pPr>
+      <w:r>
+        <w:rPr>
+          <w:color w:val="00B050"/>
+        </w:rPr>
         <w:t>Admin</w:t>
       </w:r>
     </w:p>
@@ -3631,23 +3166,23 @@
         <w:rPr>
           <w:b/>
           <w:bCs/>
-          <w:sz w:val="24"/>
-          <w:szCs w:val="24"/>
-          <w:lang w:bidi="ar-EG"/>
-        </w:rPr>
-      </w:pPr>
-      <w:proofErr w:type="spellStart"/>
-      <w:r>
-        <w:rPr>
-          <w:b/>
-          <w:bCs/>
+          <w:color w:val="00B050"/>
+          <w:sz w:val="24"/>
+          <w:szCs w:val="24"/>
+          <w:lang w:bidi="ar-EG"/>
+        </w:rPr>
+      </w:pPr>
+      <w:r>
+        <w:rPr>
+          <w:b/>
+          <w:bCs/>
+          <w:color w:val="00B050"/>
           <w:sz w:val="24"/>
           <w:szCs w:val="24"/>
           <w:lang w:bidi="ar-EG"/>
         </w:rPr>
         <w:t>getAllServiceBookings</w:t>
       </w:r>
-      <w:proofErr w:type="spellEnd"/>
     </w:p>
     <w:p>
       <w:pPr>
@@ -3660,33 +3195,23 @@
         <w:rPr>
           <w:b/>
           <w:bCs/>
-          <w:sz w:val="24"/>
-          <w:szCs w:val="24"/>
-          <w:lang w:bidi="ar-EG"/>
-        </w:rPr>
-      </w:pPr>
-      <w:r>
-        <w:rPr>
-          <w:b/>
-          <w:bCs/>
-          <w:sz w:val="24"/>
-          <w:szCs w:val="24"/>
-          <w:lang w:bidi="ar-EG"/>
-        </w:rPr>
-        <w:t xml:space="preserve"> </w:t>
-      </w:r>
-      <w:proofErr w:type="spellStart"/>
-      <w:r>
-        <w:rPr>
-          <w:b/>
-          <w:bCs/>
-          <w:sz w:val="24"/>
-          <w:szCs w:val="24"/>
-          <w:lang w:bidi="ar-EG"/>
-        </w:rPr>
-        <w:t>updateServiceBooking</w:t>
-      </w:r>
-      <w:proofErr w:type="spellEnd"/>
+          <w:color w:val="00B050"/>
+          <w:sz w:val="24"/>
+          <w:szCs w:val="24"/>
+          <w:lang w:bidi="ar-EG"/>
+        </w:rPr>
+      </w:pPr>
+      <w:r>
+        <w:rPr>
+          <w:b/>
+          <w:bCs/>
+          <w:color w:val="00B050"/>
+          <w:sz w:val="24"/>
+          <w:szCs w:val="24"/>
+          <w:lang w:bidi="ar-EG"/>
+        </w:rPr>
+        <w:t xml:space="preserve"> updateServiceBooking</w:t>
+      </w:r>
     </w:p>
     <w:p>
       <w:pPr>
@@ -3699,33 +3224,23 @@
         <w:rPr>
           <w:b/>
           <w:bCs/>
-          <w:sz w:val="24"/>
-          <w:szCs w:val="24"/>
-          <w:lang w:bidi="ar-EG"/>
-        </w:rPr>
-      </w:pPr>
-      <w:r>
-        <w:rPr>
-          <w:b/>
-          <w:bCs/>
-          <w:sz w:val="24"/>
-          <w:szCs w:val="24"/>
-          <w:lang w:bidi="ar-EG"/>
-        </w:rPr>
-        <w:t xml:space="preserve"> </w:t>
-      </w:r>
-      <w:proofErr w:type="spellStart"/>
-      <w:r>
-        <w:rPr>
-          <w:b/>
-          <w:bCs/>
-          <w:sz w:val="24"/>
-          <w:szCs w:val="24"/>
-          <w:lang w:bidi="ar-EG"/>
-        </w:rPr>
-        <w:t>deleteServiceBooking</w:t>
-      </w:r>
-      <w:proofErr w:type="spellEnd"/>
+          <w:color w:val="00B050"/>
+          <w:sz w:val="24"/>
+          <w:szCs w:val="24"/>
+          <w:lang w:bidi="ar-EG"/>
+        </w:rPr>
+      </w:pPr>
+      <w:r>
+        <w:rPr>
+          <w:b/>
+          <w:bCs/>
+          <w:color w:val="00B050"/>
+          <w:sz w:val="24"/>
+          <w:szCs w:val="24"/>
+          <w:lang w:bidi="ar-EG"/>
+        </w:rPr>
+        <w:t xml:space="preserve"> deleteServiceBooking</w:t>
+      </w:r>
     </w:p>
     <w:p>
       <w:pPr>
@@ -3756,15 +3271,17 @@
         <w:rPr>
           <w:b/>
           <w:bCs/>
-          <w:sz w:val="24"/>
-          <w:szCs w:val="24"/>
-          <w:lang w:bidi="ar-EG"/>
-        </w:rPr>
-      </w:pPr>
-      <w:r>
-        <w:rPr>
-          <w:b/>
-          <w:bCs/>
+          <w:color w:val="00B050"/>
+          <w:sz w:val="24"/>
+          <w:szCs w:val="24"/>
+          <w:lang w:bidi="ar-EG"/>
+        </w:rPr>
+      </w:pPr>
+      <w:r>
+        <w:rPr>
+          <w:b/>
+          <w:bCs/>
+          <w:color w:val="00B050"/>
           <w:sz w:val="24"/>
           <w:szCs w:val="24"/>
           <w:lang w:bidi="ar-EG"/>
@@ -3784,15 +3301,17 @@
         <w:rPr>
           <w:b/>
           <w:bCs/>
-          <w:sz w:val="24"/>
-          <w:szCs w:val="24"/>
-          <w:lang w:bidi="ar-EG"/>
-        </w:rPr>
-      </w:pPr>
-      <w:r>
-        <w:rPr>
-          <w:b/>
-          <w:bCs/>
+          <w:color w:val="00B050"/>
+          <w:sz w:val="24"/>
+          <w:szCs w:val="24"/>
+          <w:lang w:bidi="ar-EG"/>
+        </w:rPr>
+      </w:pPr>
+      <w:r>
+        <w:rPr>
+          <w:b/>
+          <w:bCs/>
+          <w:color w:val="00B050"/>
           <w:sz w:val="24"/>
           <w:szCs w:val="24"/>
           <w:rtl/>
@@ -3803,6 +3322,7 @@
         <w:rPr>
           <w:b/>
           <w:bCs/>
+          <w:color w:val="00B050"/>
           <w:sz w:val="24"/>
           <w:szCs w:val="24"/>
           <w:lang w:bidi="ar-EG"/>
@@ -3813,6 +3333,7 @@
         <w:rPr>
           <w:b/>
           <w:bCs/>
+          <w:color w:val="00B050"/>
           <w:sz w:val="24"/>
           <w:szCs w:val="24"/>
           <w:rtl/>
@@ -3823,6 +3344,7 @@
         <w:rPr>
           <w:b/>
           <w:bCs/>
+          <w:color w:val="00B050"/>
           <w:sz w:val="24"/>
           <w:szCs w:val="24"/>
           <w:lang w:bidi="ar-EG"/>
@@ -3833,6 +3355,7 @@
         <w:rPr>
           <w:b/>
           <w:bCs/>
+          <w:color w:val="00B050"/>
           <w:sz w:val="24"/>
           <w:szCs w:val="24"/>
           <w:rtl/>
@@ -3843,6 +3366,7 @@
         <w:rPr>
           <w:b/>
           <w:bCs/>
+          <w:color w:val="00B050"/>
           <w:sz w:val="24"/>
           <w:szCs w:val="24"/>
           <w:lang w:bidi="ar-EG"/>
@@ -3861,15 +3385,17 @@
         <w:rPr>
           <w:b/>
           <w:bCs/>
-          <w:sz w:val="24"/>
-          <w:szCs w:val="24"/>
-          <w:lang w:bidi="ar-EG"/>
-        </w:rPr>
-      </w:pPr>
-      <w:r>
-        <w:rPr>
-          <w:b/>
-          <w:bCs/>
+          <w:color w:val="00B050"/>
+          <w:sz w:val="24"/>
+          <w:szCs w:val="24"/>
+          <w:lang w:bidi="ar-EG"/>
+        </w:rPr>
+      </w:pPr>
+      <w:r>
+        <w:rPr>
+          <w:b/>
+          <w:bCs/>
+          <w:color w:val="00B050"/>
           <w:sz w:val="24"/>
           <w:szCs w:val="24"/>
           <w:rtl/>
@@ -3880,6 +3406,7 @@
         <w:rPr>
           <w:b/>
           <w:bCs/>
+          <w:color w:val="00B050"/>
           <w:sz w:val="24"/>
           <w:szCs w:val="24"/>
           <w:lang w:bidi="ar-EG"/>
@@ -3898,15 +3425,17 @@
         <w:rPr>
           <w:b/>
           <w:bCs/>
-          <w:sz w:val="24"/>
-          <w:szCs w:val="24"/>
-          <w:lang w:bidi="ar-EG"/>
-        </w:rPr>
-      </w:pPr>
-      <w:r>
-        <w:rPr>
-          <w:b/>
-          <w:bCs/>
+          <w:color w:val="00B050"/>
+          <w:sz w:val="24"/>
+          <w:szCs w:val="24"/>
+          <w:lang w:bidi="ar-EG"/>
+        </w:rPr>
+      </w:pPr>
+      <w:r>
+        <w:rPr>
+          <w:b/>
+          <w:bCs/>
+          <w:color w:val="00B050"/>
           <w:sz w:val="24"/>
           <w:szCs w:val="24"/>
           <w:lang w:bidi="ar-EG"/>
@@ -3925,15 +3454,17 @@
         <w:rPr>
           <w:b/>
           <w:bCs/>
-          <w:sz w:val="24"/>
-          <w:szCs w:val="24"/>
-          <w:lang w:bidi="ar-EG"/>
-        </w:rPr>
-      </w:pPr>
-      <w:r>
-        <w:rPr>
-          <w:b/>
-          <w:bCs/>
+          <w:color w:val="00B050"/>
+          <w:sz w:val="24"/>
+          <w:szCs w:val="24"/>
+          <w:lang w:bidi="ar-EG"/>
+        </w:rPr>
+      </w:pPr>
+      <w:r>
+        <w:rPr>
+          <w:b/>
+          <w:bCs/>
+          <w:color w:val="00B050"/>
           <w:sz w:val="24"/>
           <w:szCs w:val="24"/>
           <w:rtl/>
@@ -3944,6 +3475,7 @@
         <w:rPr>
           <w:b/>
           <w:bCs/>
+          <w:color w:val="00B050"/>
           <w:sz w:val="24"/>
           <w:szCs w:val="24"/>
           <w:lang w:bidi="ar-EG"/>
@@ -3962,15 +3494,17 @@
         <w:rPr>
           <w:b/>
           <w:bCs/>
-          <w:sz w:val="24"/>
-          <w:szCs w:val="24"/>
-          <w:lang w:bidi="ar-EG"/>
-        </w:rPr>
-      </w:pPr>
-      <w:r>
-        <w:rPr>
-          <w:b/>
-          <w:bCs/>
+          <w:color w:val="00B050"/>
+          <w:sz w:val="24"/>
+          <w:szCs w:val="24"/>
+          <w:lang w:bidi="ar-EG"/>
+        </w:rPr>
+      </w:pPr>
+      <w:r>
+        <w:rPr>
+          <w:b/>
+          <w:bCs/>
+          <w:color w:val="00B050"/>
           <w:sz w:val="24"/>
           <w:szCs w:val="24"/>
           <w:lang w:bidi="ar-EG"/>
@@ -3989,42 +3523,22 @@
         <w:rPr>
           <w:b/>
           <w:bCs/>
-          <w:sz w:val="24"/>
-          <w:szCs w:val="24"/>
-          <w:lang w:bidi="ar-EG"/>
-        </w:rPr>
-      </w:pPr>
-      <w:r>
-        <w:rPr>
-          <w:b/>
-          <w:bCs/>
-          <w:sz w:val="24"/>
-          <w:szCs w:val="24"/>
-          <w:lang w:bidi="ar-EG"/>
-        </w:rPr>
-        <w:t xml:space="preserve">  "</w:t>
-      </w:r>
-      <w:proofErr w:type="spellStart"/>
-      <w:r>
-        <w:rPr>
-          <w:b/>
-          <w:bCs/>
-          <w:sz w:val="24"/>
-          <w:szCs w:val="24"/>
-          <w:lang w:bidi="ar-EG"/>
-        </w:rPr>
-        <w:t>totalPatients</w:t>
-      </w:r>
-      <w:proofErr w:type="spellEnd"/>
-      <w:r>
-        <w:rPr>
-          <w:b/>
-          <w:bCs/>
-          <w:sz w:val="24"/>
-          <w:szCs w:val="24"/>
-          <w:lang w:bidi="ar-EG"/>
-        </w:rPr>
-        <w:t>": 1200,</w:t>
+          <w:color w:val="00B050"/>
+          <w:sz w:val="24"/>
+          <w:szCs w:val="24"/>
+          <w:lang w:bidi="ar-EG"/>
+        </w:rPr>
+      </w:pPr>
+      <w:r>
+        <w:rPr>
+          <w:b/>
+          <w:bCs/>
+          <w:color w:val="00B050"/>
+          <w:sz w:val="24"/>
+          <w:szCs w:val="24"/>
+          <w:lang w:bidi="ar-EG"/>
+        </w:rPr>
+        <w:t xml:space="preserve">  "totalPatients": 1200,</w:t>
       </w:r>
     </w:p>
     <w:p>
@@ -4038,42 +3552,22 @@
         <w:rPr>
           <w:b/>
           <w:bCs/>
-          <w:sz w:val="24"/>
-          <w:szCs w:val="24"/>
-          <w:lang w:bidi="ar-EG"/>
-        </w:rPr>
-      </w:pPr>
-      <w:r>
-        <w:rPr>
-          <w:b/>
-          <w:bCs/>
-          <w:sz w:val="24"/>
-          <w:szCs w:val="24"/>
-          <w:lang w:bidi="ar-EG"/>
-        </w:rPr>
-        <w:t xml:space="preserve">  "</w:t>
-      </w:r>
-      <w:proofErr w:type="spellStart"/>
-      <w:r>
-        <w:rPr>
-          <w:b/>
-          <w:bCs/>
-          <w:sz w:val="24"/>
-          <w:szCs w:val="24"/>
-          <w:lang w:bidi="ar-EG"/>
-        </w:rPr>
-        <w:t>totalDoctors</w:t>
-      </w:r>
-      <w:proofErr w:type="spellEnd"/>
-      <w:r>
-        <w:rPr>
-          <w:b/>
-          <w:bCs/>
-          <w:sz w:val="24"/>
-          <w:szCs w:val="24"/>
-          <w:lang w:bidi="ar-EG"/>
-        </w:rPr>
-        <w:t>": 40,</w:t>
+          <w:color w:val="00B050"/>
+          <w:sz w:val="24"/>
+          <w:szCs w:val="24"/>
+          <w:lang w:bidi="ar-EG"/>
+        </w:rPr>
+      </w:pPr>
+      <w:r>
+        <w:rPr>
+          <w:b/>
+          <w:bCs/>
+          <w:color w:val="00B050"/>
+          <w:sz w:val="24"/>
+          <w:szCs w:val="24"/>
+          <w:lang w:bidi="ar-EG"/>
+        </w:rPr>
+        <w:t xml:space="preserve">  "totalDoctors": 40,</w:t>
       </w:r>
     </w:p>
     <w:p>
@@ -4087,42 +3581,22 @@
         <w:rPr>
           <w:b/>
           <w:bCs/>
-          <w:sz w:val="24"/>
-          <w:szCs w:val="24"/>
-          <w:lang w:bidi="ar-EG"/>
-        </w:rPr>
-      </w:pPr>
-      <w:r>
-        <w:rPr>
-          <w:b/>
-          <w:bCs/>
-          <w:sz w:val="24"/>
-          <w:szCs w:val="24"/>
-          <w:lang w:bidi="ar-EG"/>
-        </w:rPr>
-        <w:t xml:space="preserve">  "</w:t>
-      </w:r>
-      <w:proofErr w:type="spellStart"/>
-      <w:r>
-        <w:rPr>
-          <w:b/>
-          <w:bCs/>
-          <w:sz w:val="24"/>
-          <w:szCs w:val="24"/>
-          <w:lang w:bidi="ar-EG"/>
-        </w:rPr>
-        <w:t>todayAppointments</w:t>
-      </w:r>
-      <w:proofErr w:type="spellEnd"/>
-      <w:r>
-        <w:rPr>
-          <w:b/>
-          <w:bCs/>
-          <w:sz w:val="24"/>
-          <w:szCs w:val="24"/>
-          <w:lang w:bidi="ar-EG"/>
-        </w:rPr>
-        <w:t>": 87,</w:t>
+          <w:color w:val="00B050"/>
+          <w:sz w:val="24"/>
+          <w:szCs w:val="24"/>
+          <w:lang w:bidi="ar-EG"/>
+        </w:rPr>
+      </w:pPr>
+      <w:r>
+        <w:rPr>
+          <w:b/>
+          <w:bCs/>
+          <w:color w:val="00B050"/>
+          <w:sz w:val="24"/>
+          <w:szCs w:val="24"/>
+          <w:lang w:bidi="ar-EG"/>
+        </w:rPr>
+        <w:t xml:space="preserve">  "todayAppointments": 87,</w:t>
       </w:r>
     </w:p>
     <w:p>
@@ -4136,42 +3610,22 @@
         <w:rPr>
           <w:b/>
           <w:bCs/>
-          <w:sz w:val="24"/>
-          <w:szCs w:val="24"/>
-          <w:lang w:bidi="ar-EG"/>
-        </w:rPr>
-      </w:pPr>
-      <w:r>
-        <w:rPr>
-          <w:b/>
-          <w:bCs/>
-          <w:sz w:val="24"/>
-          <w:szCs w:val="24"/>
-          <w:lang w:bidi="ar-EG"/>
-        </w:rPr>
-        <w:t xml:space="preserve">  "</w:t>
-      </w:r>
-      <w:proofErr w:type="spellStart"/>
-      <w:r>
-        <w:rPr>
-          <w:b/>
-          <w:bCs/>
-          <w:sz w:val="24"/>
-          <w:szCs w:val="24"/>
-          <w:lang w:bidi="ar-EG"/>
-        </w:rPr>
-        <w:t>pendingAppointments</w:t>
-      </w:r>
-      <w:proofErr w:type="spellEnd"/>
-      <w:r>
-        <w:rPr>
-          <w:b/>
-          <w:bCs/>
-          <w:sz w:val="24"/>
-          <w:szCs w:val="24"/>
-          <w:lang w:bidi="ar-EG"/>
-        </w:rPr>
-        <w:t>": 20,</w:t>
+          <w:color w:val="00B050"/>
+          <w:sz w:val="24"/>
+          <w:szCs w:val="24"/>
+          <w:lang w:bidi="ar-EG"/>
+        </w:rPr>
+      </w:pPr>
+      <w:r>
+        <w:rPr>
+          <w:b/>
+          <w:bCs/>
+          <w:color w:val="00B050"/>
+          <w:sz w:val="24"/>
+          <w:szCs w:val="24"/>
+          <w:lang w:bidi="ar-EG"/>
+        </w:rPr>
+        <w:t xml:space="preserve">  "pendingAppointments": 20,</w:t>
       </w:r>
     </w:p>
     <w:p>
@@ -4185,42 +3639,22 @@
         <w:rPr>
           <w:b/>
           <w:bCs/>
-          <w:sz w:val="24"/>
-          <w:szCs w:val="24"/>
-          <w:lang w:bidi="ar-EG"/>
-        </w:rPr>
-      </w:pPr>
-      <w:r>
-        <w:rPr>
-          <w:b/>
-          <w:bCs/>
-          <w:sz w:val="24"/>
-          <w:szCs w:val="24"/>
-          <w:lang w:bidi="ar-EG"/>
-        </w:rPr>
-        <w:t xml:space="preserve">  "</w:t>
-      </w:r>
-      <w:proofErr w:type="spellStart"/>
-      <w:r>
-        <w:rPr>
-          <w:b/>
-          <w:bCs/>
-          <w:sz w:val="24"/>
-          <w:szCs w:val="24"/>
-          <w:lang w:bidi="ar-EG"/>
-        </w:rPr>
-        <w:t>completedAppointments</w:t>
-      </w:r>
-      <w:proofErr w:type="spellEnd"/>
-      <w:r>
-        <w:rPr>
-          <w:b/>
-          <w:bCs/>
-          <w:sz w:val="24"/>
-          <w:szCs w:val="24"/>
-          <w:lang w:bidi="ar-EG"/>
-        </w:rPr>
-        <w:t>": 50,</w:t>
+          <w:color w:val="00B050"/>
+          <w:sz w:val="24"/>
+          <w:szCs w:val="24"/>
+          <w:lang w:bidi="ar-EG"/>
+        </w:rPr>
+      </w:pPr>
+      <w:r>
+        <w:rPr>
+          <w:b/>
+          <w:bCs/>
+          <w:color w:val="00B050"/>
+          <w:sz w:val="24"/>
+          <w:szCs w:val="24"/>
+          <w:lang w:bidi="ar-EG"/>
+        </w:rPr>
+        <w:t xml:space="preserve">  "completedAppointments": 50,</w:t>
       </w:r>
     </w:p>
     <w:p>
@@ -4234,42 +3668,22 @@
         <w:rPr>
           <w:b/>
           <w:bCs/>
-          <w:sz w:val="24"/>
-          <w:szCs w:val="24"/>
-          <w:lang w:bidi="ar-EG"/>
-        </w:rPr>
-      </w:pPr>
-      <w:r>
-        <w:rPr>
-          <w:b/>
-          <w:bCs/>
-          <w:sz w:val="24"/>
-          <w:szCs w:val="24"/>
-          <w:lang w:bidi="ar-EG"/>
-        </w:rPr>
-        <w:t xml:space="preserve">  "</w:t>
-      </w:r>
-      <w:proofErr w:type="spellStart"/>
-      <w:r>
-        <w:rPr>
-          <w:b/>
-          <w:bCs/>
-          <w:sz w:val="24"/>
-          <w:szCs w:val="24"/>
-          <w:lang w:bidi="ar-EG"/>
-        </w:rPr>
-        <w:t>activeServices</w:t>
-      </w:r>
-      <w:proofErr w:type="spellEnd"/>
-      <w:r>
-        <w:rPr>
-          <w:b/>
-          <w:bCs/>
-          <w:sz w:val="24"/>
-          <w:szCs w:val="24"/>
-          <w:lang w:bidi="ar-EG"/>
-        </w:rPr>
-        <w:t>": 12</w:t>
+          <w:color w:val="00B050"/>
+          <w:sz w:val="24"/>
+          <w:szCs w:val="24"/>
+          <w:lang w:bidi="ar-EG"/>
+        </w:rPr>
+      </w:pPr>
+      <w:r>
+        <w:rPr>
+          <w:b/>
+          <w:bCs/>
+          <w:color w:val="00B050"/>
+          <w:sz w:val="24"/>
+          <w:szCs w:val="24"/>
+          <w:lang w:bidi="ar-EG"/>
+        </w:rPr>
+        <w:t xml:space="preserve">  "activeServices": 12</w:t>
       </w:r>
     </w:p>
     <w:p>
@@ -4292,6 +3706,7 @@
         <w:rPr>
           <w:b/>
           <w:bCs/>
+          <w:color w:val="00B050"/>
           <w:sz w:val="24"/>
           <w:szCs w:val="24"/>
           <w:lang w:bidi="ar-EG"/>
@@ -4762,20 +4177,8 @@
           <w:szCs w:val="24"/>
           <w:lang w:bidi="ar-EG"/>
         </w:rPr>
-        <w:t xml:space="preserve"> </w:t>
-      </w:r>
-      <w:proofErr w:type="spellStart"/>
-      <w:r>
-        <w:rPr>
-          <w:b/>
-          <w:bCs/>
-          <w:sz w:val="24"/>
-          <w:szCs w:val="24"/>
-          <w:lang w:bidi="ar-EG"/>
-        </w:rPr>
-        <w:t>userId</w:t>
-      </w:r>
-      <w:proofErr w:type="spellEnd"/>
+        <w:t xml:space="preserve"> userId</w:t>
+      </w:r>
     </w:p>
     <w:p>
       <w:pPr>
@@ -4971,20 +4374,8 @@
           <w:szCs w:val="24"/>
           <w:lang w:bidi="ar-EG"/>
         </w:rPr>
-        <w:t xml:space="preserve"> </w:t>
-      </w:r>
-      <w:proofErr w:type="spellStart"/>
-      <w:r>
-        <w:rPr>
-          <w:b/>
-          <w:bCs/>
-          <w:sz w:val="24"/>
-          <w:szCs w:val="24"/>
-          <w:lang w:bidi="ar-EG"/>
-        </w:rPr>
-        <w:t>isRead</w:t>
-      </w:r>
-      <w:proofErr w:type="spellEnd"/>
+        <w:t xml:space="preserve"> isRead</w:t>
+      </w:r>
     </w:p>
     <w:p>
       <w:pPr>
@@ -5010,20 +4401,8 @@
           <w:szCs w:val="24"/>
           <w:lang w:bidi="ar-EG"/>
         </w:rPr>
-        <w:t xml:space="preserve">└── </w:t>
-      </w:r>
-      <w:proofErr w:type="spellStart"/>
-      <w:r>
-        <w:rPr>
-          <w:b/>
-          <w:bCs/>
-          <w:sz w:val="24"/>
-          <w:szCs w:val="24"/>
-          <w:lang w:bidi="ar-EG"/>
-        </w:rPr>
-        <w:t>createdAt</w:t>
-      </w:r>
-      <w:proofErr w:type="spellEnd"/>
+        <w:t>└── createdAt</w:t>
+      </w:r>
     </w:p>
     <w:p>
       <w:pPr>
@@ -5068,7 +4447,6 @@
           <w:lang w:bidi="ar-EG"/>
         </w:rPr>
       </w:pPr>
-      <w:proofErr w:type="spellStart"/>
       <w:r>
         <w:rPr>
           <w:b/>
@@ -5079,7 +4457,6 @@
         </w:rPr>
         <w:t>createNotification</w:t>
       </w:r>
-      <w:proofErr w:type="spellEnd"/>
     </w:p>
     <w:p>
       <w:pPr>
@@ -5097,7 +4474,6 @@
           <w:lang w:bidi="ar-EG"/>
         </w:rPr>
       </w:pPr>
-      <w:proofErr w:type="spellStart"/>
       <w:r>
         <w:rPr>
           <w:b/>
@@ -5108,7 +4484,6 @@
         </w:rPr>
         <w:t>getMyNotifications</w:t>
       </w:r>
-      <w:proofErr w:type="spellEnd"/>
     </w:p>
     <w:p>
       <w:pPr>
@@ -5126,7 +4501,6 @@
           <w:lang w:bidi="ar-EG"/>
         </w:rPr>
       </w:pPr>
-      <w:proofErr w:type="spellStart"/>
       <w:r>
         <w:rPr>
           <w:b/>
@@ -5137,7 +4511,6 @@
         </w:rPr>
         <w:t>markAsRead</w:t>
       </w:r>
-      <w:proofErr w:type="spellEnd"/>
     </w:p>
     <w:p>
       <w:pPr>
@@ -5155,7 +4528,6 @@
           <w:lang w:bidi="ar-EG"/>
         </w:rPr>
       </w:pPr>
-      <w:proofErr w:type="spellStart"/>
       <w:r>
         <w:rPr>
           <w:b/>
@@ -5166,7 +4538,6 @@
         </w:rPr>
         <w:t>markAllAsRead</w:t>
       </w:r>
-      <w:proofErr w:type="spellEnd"/>
     </w:p>
     <w:p>
       <w:pPr>

</xml_diff>